<commit_message>
fix bug link cdn font
</commit_message>
<xml_diff>
--- a/GUIDLINES.docx
+++ b/GUIDLINES.docx
@@ -1,6 +1,6 @@
 
 <file path=word/document.xml><?xml version="1.0" encoding="utf-8"?>
-<w:document xmlns:wpc="http://schemas.microsoft.com/office/word/2010/wordprocessingCanvas" xmlns:cx="http://schemas.microsoft.com/office/drawing/2014/chartex" xmlns:cx1="http://schemas.microsoft.com/office/drawing/2015/9/8/chartex" xmlns:cx2="http://schemas.microsoft.com/office/drawing/2015/10/21/chartex" xmlns:cx3="http://schemas.microsoft.com/office/drawing/2016/5/9/chartex" xmlns:cx4="http://schemas.microsoft.com/office/drawing/2016/5/10/chartex" xmlns:cx5="http://schemas.microsoft.com/office/drawing/2016/5/11/chartex" xmlns:cx6="http://schemas.microsoft.com/office/drawing/2016/5/12/chartex" xmlns:cx7="http://schemas.microsoft.com/office/drawing/2016/5/13/chartex" xmlns:cx8="http://schemas.microsoft.com/office/drawing/2016/5/14/chartex" xmlns:mc="http://schemas.openxmlformats.org/markup-compatibility/2006" xmlns:aink="http://schemas.microsoft.com/office/drawing/2016/ink" xmlns:am3d="http://schemas.microsoft.com/office/drawing/2017/model3d" xmlns:o="urn:schemas-microsoft-com:office:office" xmlns:r="http://schemas.openxmlformats.org/officeDocument/2006/relationships" xmlns:m="http://schemas.openxmlformats.org/officeDocument/2006/math" xmlns:v="urn:schemas-microsoft-com:vml" xmlns:wp14="http://schemas.microsoft.com/office/word/2010/wordprocessingDrawing" xmlns:wp="http://schemas.openxmlformats.org/drawingml/2006/wordprocessingDrawing" xmlns:w10="urn:schemas-microsoft-com:office:word" xmlns:w="http://schemas.openxmlformats.org/wordprocessingml/2006/main" xmlns:w14="http://schemas.microsoft.com/office/word/2010/wordml" xmlns:w15="http://schemas.microsoft.com/office/word/2012/wordml" xmlns:w16cex="http://schemas.microsoft.com/office/word/2018/wordml/cex" xmlns:w16cid="http://schemas.microsoft.com/office/word/2016/wordml/cid" xmlns:w16="http://schemas.microsoft.com/office/word/2018/wordml" xmlns:w16se="http://schemas.microsoft.com/office/word/2015/wordml/symex" xmlns:wpg="http://schemas.microsoft.com/office/word/2010/wordprocessingGroup" xmlns:wpi="http://schemas.microsoft.com/office/word/2010/wordprocessingInk" xmlns:wne="http://schemas.microsoft.com/office/word/2006/wordml" xmlns:wps="http://schemas.microsoft.com/office/word/2010/wordprocessingShape" mc:Ignorable="w14 w15 w16se w16cid w16 w16cex wp14">
+<w:document xmlns:wpc="http://schemas.microsoft.com/office/word/2010/wordprocessingCanvas" xmlns:cx="http://schemas.microsoft.com/office/drawing/2014/chartex" xmlns:cx1="http://schemas.microsoft.com/office/drawing/2015/9/8/chartex" xmlns:cx2="http://schemas.microsoft.com/office/drawing/2015/10/21/chartex" xmlns:cx3="http://schemas.microsoft.com/office/drawing/2016/5/9/chartex" xmlns:cx4="http://schemas.microsoft.com/office/drawing/2016/5/10/chartex" xmlns:cx5="http://schemas.microsoft.com/office/drawing/2016/5/11/chartex" xmlns:cx6="http://schemas.microsoft.com/office/drawing/2016/5/12/chartex" xmlns:cx7="http://schemas.microsoft.com/office/drawing/2016/5/13/chartex" xmlns:cx8="http://schemas.microsoft.com/office/drawing/2016/5/14/chartex" xmlns:mc="http://schemas.openxmlformats.org/markup-compatibility/2006" xmlns:aink="http://schemas.microsoft.com/office/drawing/2016/ink" xmlns:am3d="http://schemas.microsoft.com/office/drawing/2017/model3d" xmlns:o="urn:schemas-microsoft-com:office:office" xmlns:oel="http://schemas.microsoft.com/office/2019/extlst" xmlns:r="http://schemas.openxmlformats.org/officeDocument/2006/relationships" xmlns:m="http://schemas.openxmlformats.org/officeDocument/2006/math" xmlns:v="urn:schemas-microsoft-com:vml" xmlns:wp14="http://schemas.microsoft.com/office/word/2010/wordprocessingDrawing" xmlns:wp="http://schemas.openxmlformats.org/drawingml/2006/wordprocessingDrawing" xmlns:w10="urn:schemas-microsoft-com:office:word" xmlns:w="http://schemas.openxmlformats.org/wordprocessingml/2006/main" xmlns:w14="http://schemas.microsoft.com/office/word/2010/wordml" xmlns:w15="http://schemas.microsoft.com/office/word/2012/wordml" xmlns:w16cex="http://schemas.microsoft.com/office/word/2018/wordml/cex" xmlns:w16cid="http://schemas.microsoft.com/office/word/2016/wordml/cid" xmlns:w16="http://schemas.microsoft.com/office/word/2018/wordml" xmlns:w16du="http://schemas.microsoft.com/office/word/2023/wordml/word16du" xmlns:w16sdtdh="http://schemas.microsoft.com/office/word/2020/wordml/sdtdatahash" xmlns:w16sdtfl="http://schemas.microsoft.com/office/word/2024/wordml/sdtformatlock" xmlns:w16se="http://schemas.microsoft.com/office/word/2015/wordml/symex" xmlns:wpg="http://schemas.microsoft.com/office/word/2010/wordprocessingGroup" xmlns:wpi="http://schemas.microsoft.com/office/word/2010/wordprocessingInk" xmlns:wne="http://schemas.microsoft.com/office/word/2006/wordml" xmlns:wps="http://schemas.microsoft.com/office/word/2010/wordprocessingShape" mc:Ignorable="w14 w15 w16se w16cid w16 w16cex w16sdtdh w16sdtfl w16du wp14">
   <w:body>
     <w:p>
       <w:pPr>
@@ -57,23 +57,13 @@
         </w:rPr>
         <w:br/>
       </w:r>
-      <w:proofErr w:type="spellStart"/>
       <w:r>
         <w:rPr>
           <w:rFonts w:ascii="Arial" w:hAnsi="Arial" w:cs="Arial"/>
           <w:b/>
           <w:bCs/>
         </w:rPr>
-        <w:t>Oleh</w:t>
-      </w:r>
-      <w:proofErr w:type="spellEnd"/>
-      <w:r>
-        <w:rPr>
-          <w:rFonts w:ascii="Arial" w:hAnsi="Arial" w:cs="Arial"/>
-          <w:b/>
-          <w:bCs/>
-        </w:rPr>
-        <w:t>:</w:t>
+        <w:t>Oleh:</w:t>
       </w:r>
       <w:r>
         <w:rPr>
@@ -208,19 +198,11 @@
           <w:rFonts w:ascii="Arial" w:hAnsi="Arial" w:cs="Arial"/>
         </w:rPr>
       </w:pPr>
-      <w:proofErr w:type="spellStart"/>
-      <w:r>
-        <w:rPr>
-          <w:rFonts w:ascii="Arial" w:hAnsi="Arial" w:cs="Arial"/>
-        </w:rPr>
-        <w:t>Selamat</w:t>
-      </w:r>
-      <w:proofErr w:type="spellEnd"/>
-      <w:r>
-        <w:rPr>
-          <w:rFonts w:ascii="Arial" w:hAnsi="Arial" w:cs="Arial"/>
-        </w:rPr>
-        <w:t xml:space="preserve"> </w:t>
+      <w:r>
+        <w:rPr>
+          <w:rFonts w:ascii="Arial" w:hAnsi="Arial" w:cs="Arial"/>
+        </w:rPr>
+        <w:t xml:space="preserve">Selamat </w:t>
       </w:r>
       <w:proofErr w:type="spellStart"/>
       <w:r>
@@ -454,21 +436,7 @@
         <w:rPr>
           <w:rFonts w:ascii="Arial" w:hAnsi="Arial" w:cs="Arial"/>
         </w:rPr>
-        <w:t xml:space="preserve">, </w:t>
-      </w:r>
-      <w:proofErr w:type="spellStart"/>
-      <w:r>
-        <w:rPr>
-          <w:rFonts w:ascii="Arial" w:hAnsi="Arial" w:cs="Arial"/>
-        </w:rPr>
-        <w:t>dan</w:t>
-      </w:r>
-      <w:proofErr w:type="spellEnd"/>
-      <w:r>
-        <w:rPr>
-          <w:rFonts w:ascii="Arial" w:hAnsi="Arial" w:cs="Arial"/>
-        </w:rPr>
-        <w:t xml:space="preserve"> </w:t>
+        <w:t xml:space="preserve">, dan </w:t>
       </w:r>
       <w:proofErr w:type="spellStart"/>
       <w:r>
@@ -510,21 +478,7 @@
         <w:rPr>
           <w:rFonts w:ascii="Arial" w:hAnsi="Arial" w:cs="Arial"/>
         </w:rPr>
-        <w:t xml:space="preserve"> </w:t>
-      </w:r>
-      <w:proofErr w:type="spellStart"/>
-      <w:r>
-        <w:rPr>
-          <w:rFonts w:ascii="Arial" w:hAnsi="Arial" w:cs="Arial"/>
-        </w:rPr>
-        <w:t>baris</w:t>
-      </w:r>
-      <w:proofErr w:type="spellEnd"/>
-      <w:r>
-        <w:rPr>
-          <w:rFonts w:ascii="Arial" w:hAnsi="Arial" w:cs="Arial"/>
-        </w:rPr>
-        <w:t xml:space="preserve"> JavaScript pun </w:t>
+        <w:t xml:space="preserve"> baris JavaScript pun </w:t>
       </w:r>
       <w:proofErr w:type="spellStart"/>
       <w:r>
@@ -700,7 +654,7 @@
           <w:b/>
           <w:bCs/>
         </w:rPr>
-        <w:t xml:space="preserve">, </w:t>
+        <w:t xml:space="preserve">, dan </w:t>
       </w:r>
       <w:proofErr w:type="spellStart"/>
       <w:r>
@@ -709,255 +663,241 @@
           <w:b/>
           <w:bCs/>
         </w:rPr>
-        <w:t>dan</w:t>
-      </w:r>
-      <w:proofErr w:type="spellEnd"/>
+        <w:t>intuitif</w:t>
+      </w:r>
+      <w:proofErr w:type="spellEnd"/>
+      <w:r>
+        <w:rPr>
+          <w:rFonts w:ascii="Arial" w:hAnsi="Arial" w:cs="Arial"/>
+        </w:rPr>
+        <w:t xml:space="preserve">, </w:t>
+      </w:r>
+      <w:proofErr w:type="spellStart"/>
+      <w:r>
+        <w:rPr>
+          <w:rFonts w:ascii="Arial" w:hAnsi="Arial" w:cs="Arial"/>
+        </w:rPr>
+        <w:t>mematahkan</w:t>
+      </w:r>
+      <w:proofErr w:type="spellEnd"/>
+      <w:r>
+        <w:rPr>
+          <w:rFonts w:ascii="Arial" w:hAnsi="Arial" w:cs="Arial"/>
+        </w:rPr>
+        <w:t xml:space="preserve"> </w:t>
+      </w:r>
+      <w:proofErr w:type="spellStart"/>
+      <w:r>
+        <w:rPr>
+          <w:rFonts w:ascii="Arial" w:hAnsi="Arial" w:cs="Arial"/>
+        </w:rPr>
+        <w:t>kekakuan</w:t>
+      </w:r>
+      <w:proofErr w:type="spellEnd"/>
+      <w:r>
+        <w:rPr>
+          <w:rFonts w:ascii="Arial" w:hAnsi="Arial" w:cs="Arial"/>
+        </w:rPr>
+        <w:t xml:space="preserve"> </w:t>
+      </w:r>
+      <w:proofErr w:type="spellStart"/>
+      <w:r>
+        <w:rPr>
+          <w:rFonts w:ascii="Arial" w:hAnsi="Arial" w:cs="Arial"/>
+        </w:rPr>
+        <w:t>desain</w:t>
+      </w:r>
+      <w:proofErr w:type="spellEnd"/>
+      <w:r>
+        <w:rPr>
+          <w:rFonts w:ascii="Arial" w:hAnsi="Arial" w:cs="Arial"/>
+        </w:rPr>
+        <w:t xml:space="preserve"> </w:t>
+      </w:r>
+      <w:proofErr w:type="spellStart"/>
+      <w:r>
+        <w:rPr>
+          <w:rFonts w:ascii="Arial" w:hAnsi="Arial" w:cs="Arial"/>
+        </w:rPr>
+        <w:t>datar</w:t>
+      </w:r>
+      <w:proofErr w:type="spellEnd"/>
+      <w:r>
+        <w:rPr>
+          <w:rFonts w:ascii="Arial" w:hAnsi="Arial" w:cs="Arial"/>
+        </w:rPr>
+        <w:t xml:space="preserve"> </w:t>
+      </w:r>
+      <w:proofErr w:type="spellStart"/>
+      <w:r>
+        <w:rPr>
+          <w:rFonts w:ascii="Arial" w:hAnsi="Arial" w:cs="Arial"/>
+        </w:rPr>
+        <w:t>tradisional</w:t>
+      </w:r>
+      <w:proofErr w:type="spellEnd"/>
+      <w:r>
+        <w:rPr>
+          <w:rFonts w:ascii="Arial" w:hAnsi="Arial" w:cs="Arial"/>
+        </w:rPr>
+        <w:t xml:space="preserve">. SRUI </w:t>
+      </w:r>
+      <w:proofErr w:type="spellStart"/>
+      <w:r>
+        <w:rPr>
+          <w:rFonts w:ascii="Arial" w:hAnsi="Arial" w:cs="Arial"/>
+        </w:rPr>
+        <w:t>dirancang</w:t>
+      </w:r>
+      <w:proofErr w:type="spellEnd"/>
+      <w:r>
+        <w:rPr>
+          <w:rFonts w:ascii="Arial" w:hAnsi="Arial" w:cs="Arial"/>
+        </w:rPr>
+        <w:t xml:space="preserve"> </w:t>
+      </w:r>
+      <w:proofErr w:type="spellStart"/>
+      <w:r>
+        <w:rPr>
+          <w:rFonts w:ascii="Arial" w:hAnsi="Arial" w:cs="Arial"/>
+        </w:rPr>
+        <w:t>secara</w:t>
+      </w:r>
+      <w:proofErr w:type="spellEnd"/>
+      <w:r>
+        <w:rPr>
+          <w:rFonts w:ascii="Arial" w:hAnsi="Arial" w:cs="Arial"/>
+        </w:rPr>
+        <w:t xml:space="preserve"> </w:t>
+      </w:r>
+      <w:proofErr w:type="spellStart"/>
+      <w:r>
+        <w:rPr>
+          <w:rFonts w:ascii="Arial" w:hAnsi="Arial" w:cs="Arial"/>
+        </w:rPr>
+        <w:t>eksklusif</w:t>
+      </w:r>
+      <w:proofErr w:type="spellEnd"/>
+      <w:r>
+        <w:rPr>
+          <w:rFonts w:ascii="Arial" w:hAnsi="Arial" w:cs="Arial"/>
+        </w:rPr>
+        <w:t xml:space="preserve"> </w:t>
+      </w:r>
+      <w:proofErr w:type="spellStart"/>
+      <w:r>
+        <w:rPr>
+          <w:rFonts w:ascii="Arial" w:hAnsi="Arial" w:cs="Arial"/>
+        </w:rPr>
+        <w:t>untuk</w:t>
+      </w:r>
+      <w:proofErr w:type="spellEnd"/>
+      <w:r>
+        <w:rPr>
+          <w:rFonts w:ascii="Arial" w:hAnsi="Arial" w:cs="Arial"/>
+        </w:rPr>
+        <w:t xml:space="preserve"> </w:t>
+      </w:r>
+      <w:proofErr w:type="spellStart"/>
+      <w:r>
+        <w:rPr>
+          <w:rFonts w:ascii="Arial" w:hAnsi="Arial" w:cs="Arial"/>
+        </w:rPr>
+        <w:t>memberikan</w:t>
+      </w:r>
+      <w:proofErr w:type="spellEnd"/>
+      <w:r>
+        <w:rPr>
+          <w:rFonts w:ascii="Arial" w:hAnsi="Arial" w:cs="Arial"/>
+        </w:rPr>
+        <w:t xml:space="preserve"> </w:t>
+      </w:r>
+      <w:proofErr w:type="spellStart"/>
+      <w:r>
+        <w:rPr>
+          <w:rFonts w:ascii="Arial" w:hAnsi="Arial" w:cs="Arial"/>
+        </w:rPr>
+        <w:t>pengalaman</w:t>
+      </w:r>
+      <w:proofErr w:type="spellEnd"/>
+      <w:r>
+        <w:rPr>
+          <w:rFonts w:ascii="Arial" w:hAnsi="Arial" w:cs="Arial"/>
+        </w:rPr>
+        <w:t xml:space="preserve"> visual yang </w:t>
+      </w:r>
+      <w:proofErr w:type="spellStart"/>
+      <w:r>
+        <w:rPr>
+          <w:rFonts w:ascii="Arial" w:hAnsi="Arial" w:cs="Arial"/>
+        </w:rPr>
+        <w:t>mendalam</w:t>
+      </w:r>
+      <w:proofErr w:type="spellEnd"/>
+      <w:r>
+        <w:rPr>
+          <w:rFonts w:ascii="Arial" w:hAnsi="Arial" w:cs="Arial"/>
+        </w:rPr>
+        <w:t xml:space="preserve"> dan </w:t>
+      </w:r>
+      <w:proofErr w:type="spellStart"/>
+      <w:r>
+        <w:rPr>
+          <w:rFonts w:ascii="Arial" w:hAnsi="Arial" w:cs="Arial"/>
+        </w:rPr>
+        <w:t>nyaman</w:t>
+      </w:r>
+      <w:proofErr w:type="spellEnd"/>
+      <w:r>
+        <w:rPr>
+          <w:rFonts w:ascii="Arial" w:hAnsi="Arial" w:cs="Arial"/>
+        </w:rPr>
+        <w:t xml:space="preserve"> di </w:t>
+      </w:r>
+      <w:proofErr w:type="spellStart"/>
+      <w:r>
+        <w:rPr>
+          <w:rFonts w:ascii="Arial" w:hAnsi="Arial" w:cs="Arial"/>
+        </w:rPr>
+        <w:t>mata</w:t>
+      </w:r>
+      <w:proofErr w:type="spellEnd"/>
+      <w:r>
+        <w:rPr>
+          <w:rFonts w:ascii="Arial" w:hAnsi="Arial" w:cs="Arial"/>
+        </w:rPr>
+        <w:t xml:space="preserve"> </w:t>
+      </w:r>
+      <w:proofErr w:type="spellStart"/>
+      <w:r>
+        <w:rPr>
+          <w:rFonts w:ascii="Arial" w:hAnsi="Arial" w:cs="Arial"/>
+        </w:rPr>
+        <w:t>melalui</w:t>
+      </w:r>
+      <w:proofErr w:type="spellEnd"/>
+      <w:r>
+        <w:rPr>
+          <w:rFonts w:ascii="Arial" w:hAnsi="Arial" w:cs="Arial"/>
+        </w:rPr>
+        <w:t xml:space="preserve"> </w:t>
+      </w:r>
+      <w:proofErr w:type="spellStart"/>
       <w:r>
         <w:rPr>
           <w:rFonts w:ascii="Arial" w:hAnsi="Arial" w:cs="Arial"/>
           <w:b/>
           <w:bCs/>
         </w:rPr>
-        <w:t xml:space="preserve"> </w:t>
-      </w:r>
-      <w:proofErr w:type="spellStart"/>
+        <w:t>lingkungan</w:t>
+      </w:r>
+      <w:proofErr w:type="spellEnd"/>
       <w:r>
         <w:rPr>
           <w:rFonts w:ascii="Arial" w:hAnsi="Arial" w:cs="Arial"/>
           <w:b/>
           <w:bCs/>
         </w:rPr>
-        <w:t>intuitif</w:t>
-      </w:r>
-      <w:proofErr w:type="spellEnd"/>
-      <w:r>
-        <w:rPr>
-          <w:rFonts w:ascii="Arial" w:hAnsi="Arial" w:cs="Arial"/>
-        </w:rPr>
-        <w:t xml:space="preserve">, </w:t>
-      </w:r>
-      <w:proofErr w:type="spellStart"/>
-      <w:r>
-        <w:rPr>
-          <w:rFonts w:ascii="Arial" w:hAnsi="Arial" w:cs="Arial"/>
-        </w:rPr>
-        <w:t>mematahkan</w:t>
-      </w:r>
-      <w:proofErr w:type="spellEnd"/>
-      <w:r>
-        <w:rPr>
-          <w:rFonts w:ascii="Arial" w:hAnsi="Arial" w:cs="Arial"/>
-        </w:rPr>
-        <w:t xml:space="preserve"> </w:t>
-      </w:r>
-      <w:proofErr w:type="spellStart"/>
-      <w:r>
-        <w:rPr>
-          <w:rFonts w:ascii="Arial" w:hAnsi="Arial" w:cs="Arial"/>
-        </w:rPr>
-        <w:t>kekakuan</w:t>
-      </w:r>
-      <w:proofErr w:type="spellEnd"/>
-      <w:r>
-        <w:rPr>
-          <w:rFonts w:ascii="Arial" w:hAnsi="Arial" w:cs="Arial"/>
-        </w:rPr>
-        <w:t xml:space="preserve"> </w:t>
-      </w:r>
-      <w:proofErr w:type="spellStart"/>
-      <w:r>
-        <w:rPr>
-          <w:rFonts w:ascii="Arial" w:hAnsi="Arial" w:cs="Arial"/>
-        </w:rPr>
-        <w:t>desain</w:t>
-      </w:r>
-      <w:proofErr w:type="spellEnd"/>
-      <w:r>
-        <w:rPr>
-          <w:rFonts w:ascii="Arial" w:hAnsi="Arial" w:cs="Arial"/>
-        </w:rPr>
-        <w:t xml:space="preserve"> </w:t>
-      </w:r>
-      <w:proofErr w:type="spellStart"/>
-      <w:r>
-        <w:rPr>
-          <w:rFonts w:ascii="Arial" w:hAnsi="Arial" w:cs="Arial"/>
-        </w:rPr>
-        <w:t>datar</w:t>
-      </w:r>
-      <w:proofErr w:type="spellEnd"/>
-      <w:r>
-        <w:rPr>
-          <w:rFonts w:ascii="Arial" w:hAnsi="Arial" w:cs="Arial"/>
-        </w:rPr>
-        <w:t xml:space="preserve"> </w:t>
-      </w:r>
-      <w:proofErr w:type="spellStart"/>
-      <w:r>
-        <w:rPr>
-          <w:rFonts w:ascii="Arial" w:hAnsi="Arial" w:cs="Arial"/>
-        </w:rPr>
-        <w:t>tradisional</w:t>
-      </w:r>
-      <w:proofErr w:type="spellEnd"/>
-      <w:r>
-        <w:rPr>
-          <w:rFonts w:ascii="Arial" w:hAnsi="Arial" w:cs="Arial"/>
-        </w:rPr>
-        <w:t xml:space="preserve">. SRUI </w:t>
-      </w:r>
-      <w:proofErr w:type="spellStart"/>
-      <w:r>
-        <w:rPr>
-          <w:rFonts w:ascii="Arial" w:hAnsi="Arial" w:cs="Arial"/>
-        </w:rPr>
-        <w:t>dirancang</w:t>
-      </w:r>
-      <w:proofErr w:type="spellEnd"/>
-      <w:r>
-        <w:rPr>
-          <w:rFonts w:ascii="Arial" w:hAnsi="Arial" w:cs="Arial"/>
-        </w:rPr>
-        <w:t xml:space="preserve"> </w:t>
-      </w:r>
-      <w:proofErr w:type="spellStart"/>
-      <w:r>
-        <w:rPr>
-          <w:rFonts w:ascii="Arial" w:hAnsi="Arial" w:cs="Arial"/>
-        </w:rPr>
-        <w:t>secara</w:t>
-      </w:r>
-      <w:proofErr w:type="spellEnd"/>
-      <w:r>
-        <w:rPr>
-          <w:rFonts w:ascii="Arial" w:hAnsi="Arial" w:cs="Arial"/>
-        </w:rPr>
-        <w:t xml:space="preserve"> </w:t>
-      </w:r>
-      <w:proofErr w:type="spellStart"/>
-      <w:r>
-        <w:rPr>
-          <w:rFonts w:ascii="Arial" w:hAnsi="Arial" w:cs="Arial"/>
-        </w:rPr>
-        <w:t>eksklusif</w:t>
-      </w:r>
-      <w:proofErr w:type="spellEnd"/>
-      <w:r>
-        <w:rPr>
-          <w:rFonts w:ascii="Arial" w:hAnsi="Arial" w:cs="Arial"/>
-        </w:rPr>
-        <w:t xml:space="preserve"> </w:t>
-      </w:r>
-      <w:proofErr w:type="spellStart"/>
-      <w:r>
-        <w:rPr>
-          <w:rFonts w:ascii="Arial" w:hAnsi="Arial" w:cs="Arial"/>
-        </w:rPr>
-        <w:t>untuk</w:t>
-      </w:r>
-      <w:proofErr w:type="spellEnd"/>
-      <w:r>
-        <w:rPr>
-          <w:rFonts w:ascii="Arial" w:hAnsi="Arial" w:cs="Arial"/>
-        </w:rPr>
-        <w:t xml:space="preserve"> </w:t>
-      </w:r>
-      <w:proofErr w:type="spellStart"/>
-      <w:r>
-        <w:rPr>
-          <w:rFonts w:ascii="Arial" w:hAnsi="Arial" w:cs="Arial"/>
-        </w:rPr>
-        <w:t>memberikan</w:t>
-      </w:r>
-      <w:proofErr w:type="spellEnd"/>
-      <w:r>
-        <w:rPr>
-          <w:rFonts w:ascii="Arial" w:hAnsi="Arial" w:cs="Arial"/>
-        </w:rPr>
-        <w:t xml:space="preserve"> </w:t>
-      </w:r>
-      <w:proofErr w:type="spellStart"/>
-      <w:r>
-        <w:rPr>
-          <w:rFonts w:ascii="Arial" w:hAnsi="Arial" w:cs="Arial"/>
-        </w:rPr>
-        <w:t>pengalaman</w:t>
-      </w:r>
-      <w:proofErr w:type="spellEnd"/>
-      <w:r>
-        <w:rPr>
-          <w:rFonts w:ascii="Arial" w:hAnsi="Arial" w:cs="Arial"/>
-        </w:rPr>
-        <w:t xml:space="preserve"> visual yang </w:t>
-      </w:r>
-      <w:proofErr w:type="spellStart"/>
-      <w:r>
-        <w:rPr>
-          <w:rFonts w:ascii="Arial" w:hAnsi="Arial" w:cs="Arial"/>
-        </w:rPr>
-        <w:t>mendalam</w:t>
-      </w:r>
-      <w:proofErr w:type="spellEnd"/>
-      <w:r>
-        <w:rPr>
-          <w:rFonts w:ascii="Arial" w:hAnsi="Arial" w:cs="Arial"/>
-        </w:rPr>
-        <w:t xml:space="preserve"> </w:t>
-      </w:r>
-      <w:proofErr w:type="spellStart"/>
-      <w:r>
-        <w:rPr>
-          <w:rFonts w:ascii="Arial" w:hAnsi="Arial" w:cs="Arial"/>
-        </w:rPr>
-        <w:t>dan</w:t>
-      </w:r>
-      <w:proofErr w:type="spellEnd"/>
-      <w:r>
-        <w:rPr>
-          <w:rFonts w:ascii="Arial" w:hAnsi="Arial" w:cs="Arial"/>
-        </w:rPr>
-        <w:t xml:space="preserve"> </w:t>
-      </w:r>
-      <w:proofErr w:type="spellStart"/>
-      <w:r>
-        <w:rPr>
-          <w:rFonts w:ascii="Arial" w:hAnsi="Arial" w:cs="Arial"/>
-        </w:rPr>
-        <w:t>nyaman</w:t>
-      </w:r>
-      <w:proofErr w:type="spellEnd"/>
-      <w:r>
-        <w:rPr>
-          <w:rFonts w:ascii="Arial" w:hAnsi="Arial" w:cs="Arial"/>
-        </w:rPr>
-        <w:t xml:space="preserve"> di </w:t>
-      </w:r>
-      <w:proofErr w:type="spellStart"/>
-      <w:r>
-        <w:rPr>
-          <w:rFonts w:ascii="Arial" w:hAnsi="Arial" w:cs="Arial"/>
-        </w:rPr>
-        <w:t>mata</w:t>
-      </w:r>
-      <w:proofErr w:type="spellEnd"/>
-      <w:r>
-        <w:rPr>
-          <w:rFonts w:ascii="Arial" w:hAnsi="Arial" w:cs="Arial"/>
-        </w:rPr>
-        <w:t xml:space="preserve"> </w:t>
-      </w:r>
-      <w:proofErr w:type="spellStart"/>
-      <w:r>
-        <w:rPr>
-          <w:rFonts w:ascii="Arial" w:hAnsi="Arial" w:cs="Arial"/>
-        </w:rPr>
-        <w:t>melalui</w:t>
-      </w:r>
-      <w:proofErr w:type="spellEnd"/>
-      <w:r>
-        <w:rPr>
-          <w:rFonts w:ascii="Arial" w:hAnsi="Arial" w:cs="Arial"/>
-        </w:rPr>
         <w:t xml:space="preserve"> </w:t>
       </w:r>
       <w:proofErr w:type="spellStart"/>
@@ -967,7 +907,7 @@
           <w:b/>
           <w:bCs/>
         </w:rPr>
-        <w:t>lingkungan</w:t>
+        <w:t>tema</w:t>
       </w:r>
       <w:proofErr w:type="spellEnd"/>
       <w:r>
@@ -985,7 +925,7 @@
           <w:b/>
           <w:bCs/>
         </w:rPr>
-        <w:t>tema</w:t>
+        <w:t>gelap</w:t>
       </w:r>
       <w:proofErr w:type="spellEnd"/>
       <w:r>
@@ -994,37 +934,13 @@
           <w:b/>
           <w:bCs/>
         </w:rPr>
-        <w:t xml:space="preserve"> </w:t>
-      </w:r>
-      <w:proofErr w:type="spellStart"/>
-      <w:r>
-        <w:rPr>
-          <w:rFonts w:ascii="Arial" w:hAnsi="Arial" w:cs="Arial"/>
-          <w:b/>
-          <w:bCs/>
-        </w:rPr>
-        <w:t>gelap</w:t>
-      </w:r>
-      <w:proofErr w:type="spellEnd"/>
-      <w:r>
-        <w:rPr>
-          <w:rFonts w:ascii="Arial" w:hAnsi="Arial" w:cs="Arial"/>
-          <w:b/>
-          <w:bCs/>
-        </w:rPr>
         <w:t xml:space="preserve"> (Dark Environment)</w:t>
       </w:r>
       <w:r>
         <w:rPr>
           <w:rFonts w:ascii="Arial" w:hAnsi="Arial" w:cs="Arial"/>
         </w:rPr>
-        <w:t xml:space="preserve"> yan</w:t>
-      </w:r>
-      <w:r>
-        <w:rPr>
-          <w:rFonts w:ascii="Arial" w:hAnsi="Arial" w:cs="Arial"/>
-        </w:rPr>
-        <w:t xml:space="preserve">g </w:t>
+        <w:t xml:space="preserve"> yang </w:t>
       </w:r>
       <w:proofErr w:type="spellStart"/>
       <w:r>
@@ -1038,21 +954,7 @@
         <w:rPr>
           <w:rFonts w:ascii="Arial" w:hAnsi="Arial" w:cs="Arial"/>
         </w:rPr>
-        <w:t xml:space="preserve">. </w:t>
-      </w:r>
-      <w:proofErr w:type="spellStart"/>
-      <w:r>
-        <w:rPr>
-          <w:rFonts w:ascii="Arial" w:hAnsi="Arial" w:cs="Arial"/>
-        </w:rPr>
-        <w:t>Tidak</w:t>
-      </w:r>
-      <w:proofErr w:type="spellEnd"/>
-      <w:r>
-        <w:rPr>
-          <w:rFonts w:ascii="Arial" w:hAnsi="Arial" w:cs="Arial"/>
-        </w:rPr>
-        <w:t xml:space="preserve"> </w:t>
+        <w:t xml:space="preserve">. Tidak </w:t>
       </w:r>
       <w:proofErr w:type="spellStart"/>
       <w:r>
@@ -1235,21 +1137,7 @@
         <w:rPr>
           <w:rFonts w:ascii="Arial" w:hAnsi="Arial" w:cs="Arial"/>
         </w:rPr>
-        <w:t xml:space="preserve"> </w:t>
-      </w:r>
-      <w:proofErr w:type="spellStart"/>
-      <w:r>
-        <w:rPr>
-          <w:rFonts w:ascii="Arial" w:hAnsi="Arial" w:cs="Arial"/>
-        </w:rPr>
-        <w:t>Desain</w:t>
-      </w:r>
-      <w:proofErr w:type="spellEnd"/>
-      <w:r>
-        <w:rPr>
-          <w:rFonts w:ascii="Arial" w:hAnsi="Arial" w:cs="Arial"/>
-        </w:rPr>
-        <w:t xml:space="preserve">: The </w:t>
+        <w:t xml:space="preserve"> Desain: The </w:t>
       </w:r>
       <w:proofErr w:type="spellStart"/>
       <w:r>
@@ -1273,19 +1161,11 @@
           <w:rFonts w:ascii="Arial" w:hAnsi="Arial" w:cs="Arial"/>
         </w:rPr>
       </w:pPr>
-      <w:proofErr w:type="spellStart"/>
-      <w:r>
-        <w:rPr>
-          <w:rFonts w:ascii="Arial" w:hAnsi="Arial" w:cs="Arial"/>
-        </w:rPr>
-        <w:t>Hanya</w:t>
-      </w:r>
-      <w:proofErr w:type="spellEnd"/>
-      <w:r>
-        <w:rPr>
-          <w:rFonts w:ascii="Arial" w:hAnsi="Arial" w:cs="Arial"/>
-        </w:rPr>
-        <w:t xml:space="preserve"> </w:t>
+      <w:r>
+        <w:rPr>
+          <w:rFonts w:ascii="Arial" w:hAnsi="Arial" w:cs="Arial"/>
+        </w:rPr>
+        <w:t xml:space="preserve">Hanya </w:t>
       </w:r>
       <w:proofErr w:type="spellStart"/>
       <w:r>
@@ -1313,21 +1193,7 @@
         <w:rPr>
           <w:rFonts w:ascii="Arial" w:hAnsi="Arial" w:cs="Arial"/>
         </w:rPr>
-        <w:t xml:space="preserve">? Tidak. </w:t>
-      </w:r>
-      <w:proofErr w:type="spellStart"/>
-      <w:r>
-        <w:rPr>
-          <w:rFonts w:ascii="Arial" w:hAnsi="Arial" w:cs="Arial"/>
-        </w:rPr>
-        <w:t>Ini</w:t>
-      </w:r>
-      <w:proofErr w:type="spellEnd"/>
-      <w:r>
-        <w:rPr>
-          <w:rFonts w:ascii="Arial" w:hAnsi="Arial" w:cs="Arial"/>
-        </w:rPr>
-        <w:t xml:space="preserve"> </w:t>
+        <w:t xml:space="preserve">? Tidak. Ini </w:t>
       </w:r>
       <w:proofErr w:type="spellStart"/>
       <w:r>
@@ -1383,21 +1249,7 @@
         <w:rPr>
           <w:rFonts w:ascii="Arial" w:hAnsi="Arial" w:cs="Arial"/>
         </w:rPr>
-        <w:t xml:space="preserve"> </w:t>
-      </w:r>
-      <w:proofErr w:type="spellStart"/>
-      <w:r>
-        <w:rPr>
-          <w:rFonts w:ascii="Arial" w:hAnsi="Arial" w:cs="Arial"/>
-        </w:rPr>
-        <w:t>pilar</w:t>
-      </w:r>
-      <w:proofErr w:type="spellEnd"/>
-      <w:r>
-        <w:rPr>
-          <w:rFonts w:ascii="Arial" w:hAnsi="Arial" w:cs="Arial"/>
-        </w:rPr>
-        <w:t xml:space="preserve"> </w:t>
+        <w:t xml:space="preserve"> pilar </w:t>
       </w:r>
       <w:proofErr w:type="spellStart"/>
       <w:r>
@@ -1468,7 +1320,6 @@
                 <w:rFonts w:ascii="Arial" w:hAnsi="Arial" w:cs="Arial"/>
               </w:rPr>
             </w:pPr>
-            <w:proofErr w:type="spellStart"/>
             <w:r>
               <w:rPr>
                 <w:rFonts w:ascii="Arial" w:hAnsi="Arial" w:cs="Arial"/>
@@ -1476,16 +1327,7 @@
                 <w:bCs/>
               </w:rPr>
               <w:lastRenderedPageBreak/>
-              <w:t>Pilar</w:t>
-            </w:r>
-            <w:proofErr w:type="spellEnd"/>
-            <w:r>
-              <w:rPr>
-                <w:rFonts w:ascii="Arial" w:hAnsi="Arial" w:cs="Arial"/>
-                <w:b/>
-                <w:bCs/>
-              </w:rPr>
-              <w:t xml:space="preserve"> </w:t>
+              <w:t xml:space="preserve">Pilar </w:t>
             </w:r>
             <w:proofErr w:type="spellStart"/>
             <w:r>
@@ -1517,15 +1359,7 @@
                 <w:b/>
                 <w:bCs/>
               </w:rPr>
-              <w:t>Penj</w:t>
-            </w:r>
-            <w:r>
-              <w:rPr>
-                <w:rFonts w:ascii="Arial" w:hAnsi="Arial" w:cs="Arial"/>
-                <w:b/>
-                <w:bCs/>
-              </w:rPr>
-              <w:t>elasan</w:t>
+              <w:t>Penjelasan</w:t>
             </w:r>
             <w:proofErr w:type="spellEnd"/>
           </w:p>
@@ -1854,21 +1688,7 @@
               <w:rPr>
                 <w:rFonts w:ascii="Arial" w:hAnsi="Arial" w:cs="Arial"/>
               </w:rPr>
-              <w:t xml:space="preserve"> </w:t>
-            </w:r>
-            <w:proofErr w:type="spellStart"/>
-            <w:r>
-              <w:rPr>
-                <w:rFonts w:ascii="Arial" w:hAnsi="Arial" w:cs="Arial"/>
-              </w:rPr>
-              <w:t>pada</w:t>
-            </w:r>
-            <w:proofErr w:type="spellEnd"/>
-            <w:r>
-              <w:rPr>
-                <w:rFonts w:ascii="Arial" w:hAnsi="Arial" w:cs="Arial"/>
-              </w:rPr>
-              <w:t xml:space="preserve"> usability, </w:t>
+              <w:t xml:space="preserve"> pada usability, </w:t>
             </w:r>
             <w:proofErr w:type="spellStart"/>
             <w:r>
@@ -2625,21 +2445,7 @@
         <w:rPr>
           <w:rFonts w:ascii="Arial" w:hAnsi="Arial" w:cs="Arial"/>
         </w:rPr>
-        <w:t xml:space="preserve"> </w:t>
-      </w:r>
-      <w:proofErr w:type="spellStart"/>
-      <w:r>
-        <w:rPr>
-          <w:rFonts w:ascii="Arial" w:hAnsi="Arial" w:cs="Arial"/>
-        </w:rPr>
-        <w:t>pada</w:t>
-      </w:r>
-      <w:proofErr w:type="spellEnd"/>
-      <w:r>
-        <w:rPr>
-          <w:rFonts w:ascii="Arial" w:hAnsi="Arial" w:cs="Arial"/>
-        </w:rPr>
-        <w:t xml:space="preserve"> framework </w:t>
+        <w:t xml:space="preserve"> pada framework </w:t>
       </w:r>
       <w:proofErr w:type="spellStart"/>
       <w:r>
@@ -2944,25 +2750,7 @@
           <w:b/>
           <w:bCs/>
         </w:rPr>
-        <w:t>`</w:t>
-      </w:r>
-      <w:proofErr w:type="spellStart"/>
-      <w:r>
-        <w:rPr>
-          <w:rFonts w:ascii="Arial" w:hAnsi="Arial" w:cs="Arial"/>
-          <w:b/>
-          <w:bCs/>
-        </w:rPr>
-        <w:t>srui-base.css</w:t>
-      </w:r>
-      <w:proofErr w:type="spellEnd"/>
-      <w:r>
-        <w:rPr>
-          <w:rFonts w:ascii="Arial" w:hAnsi="Arial" w:cs="Arial"/>
-          <w:b/>
-          <w:bCs/>
-        </w:rPr>
-        <w:t>`</w:t>
+        <w:t>`srui-base.css`</w:t>
       </w:r>
       <w:r>
         <w:rPr>
@@ -3135,7 +2923,6 @@
           <w:sz w:val="20"/>
           <w:szCs w:val="20"/>
         </w:rPr>
-        <w:lastRenderedPageBreak/>
         <w:t xml:space="preserve">         </w:t>
       </w:r>
       <w:r>
@@ -3266,16 +3053,7 @@
           <w:sz w:val="20"/>
           <w:szCs w:val="20"/>
         </w:rPr>
-        <w:t xml:space="preserve"> </w:t>
-      </w:r>
-      <w:r>
-        <w:rPr>
-          <w:rFonts w:ascii="Arial" w:eastAsia="Courier New" w:hAnsi="Arial" w:cs="Arial"/>
-          <w:color w:val="FFFFFF"/>
-          <w:sz w:val="20"/>
-          <w:szCs w:val="20"/>
-        </w:rPr>
-        <w:t xml:space="preserve">     font-size: 100%; /* 16px </w:t>
+        <w:t xml:space="preserve">      font-size: 100%; /* 16px </w:t>
       </w:r>
       <w:proofErr w:type="spellStart"/>
       <w:r>
@@ -3465,27 +3243,7 @@
           <w:sz w:val="20"/>
           <w:szCs w:val="20"/>
         </w:rPr>
-        <w:t xml:space="preserve">: </w:t>
-      </w:r>
-      <w:proofErr w:type="spellStart"/>
-      <w:r>
-        <w:rPr>
-          <w:rFonts w:ascii="Arial" w:eastAsia="Courier New" w:hAnsi="Arial" w:cs="Arial"/>
-          <w:color w:val="FFFFFF"/>
-          <w:sz w:val="20"/>
-          <w:szCs w:val="20"/>
-        </w:rPr>
-        <w:t>var</w:t>
-      </w:r>
-      <w:proofErr w:type="spellEnd"/>
-      <w:r>
-        <w:rPr>
-          <w:rFonts w:ascii="Arial" w:eastAsia="Courier New" w:hAnsi="Arial" w:cs="Arial"/>
-          <w:color w:val="FFFFFF"/>
-          <w:sz w:val="20"/>
-          <w:szCs w:val="20"/>
-        </w:rPr>
-        <w:t>(--</w:t>
+        <w:t>: var(--</w:t>
       </w:r>
       <w:proofErr w:type="spellStart"/>
       <w:r>
@@ -3540,27 +3298,7 @@
           <w:sz w:val="20"/>
           <w:szCs w:val="20"/>
         </w:rPr>
-        <w:t xml:space="preserve">: </w:t>
-      </w:r>
-      <w:proofErr w:type="spellStart"/>
-      <w:r>
-        <w:rPr>
-          <w:rFonts w:ascii="Arial" w:eastAsia="Courier New" w:hAnsi="Arial" w:cs="Arial"/>
-          <w:color w:val="FFFFFF"/>
-          <w:sz w:val="20"/>
-          <w:szCs w:val="20"/>
-        </w:rPr>
-        <w:t>var</w:t>
-      </w:r>
-      <w:proofErr w:type="spellEnd"/>
-      <w:r>
-        <w:rPr>
-          <w:rFonts w:ascii="Arial" w:eastAsia="Courier New" w:hAnsi="Arial" w:cs="Arial"/>
-          <w:color w:val="FFFFFF"/>
-          <w:sz w:val="20"/>
-          <w:szCs w:val="20"/>
-        </w:rPr>
-        <w:t>(--</w:t>
+        <w:t>: var(--</w:t>
       </w:r>
       <w:proofErr w:type="spellStart"/>
       <w:r>
@@ -3595,27 +3333,7 @@
           <w:sz w:val="20"/>
           <w:szCs w:val="20"/>
         </w:rPr>
-        <w:t xml:space="preserve">      font-family: </w:t>
-      </w:r>
-      <w:proofErr w:type="spellStart"/>
-      <w:r>
-        <w:rPr>
-          <w:rFonts w:ascii="Arial" w:eastAsia="Courier New" w:hAnsi="Arial" w:cs="Arial"/>
-          <w:color w:val="FFFFFF"/>
-          <w:sz w:val="20"/>
-          <w:szCs w:val="20"/>
-        </w:rPr>
-        <w:t>var</w:t>
-      </w:r>
-      <w:proofErr w:type="spellEnd"/>
-      <w:r>
-        <w:rPr>
-          <w:rFonts w:ascii="Arial" w:eastAsia="Courier New" w:hAnsi="Arial" w:cs="Arial"/>
-          <w:color w:val="FFFFFF"/>
-          <w:sz w:val="20"/>
-          <w:szCs w:val="20"/>
-        </w:rPr>
-        <w:t>(--</w:t>
+        <w:t xml:space="preserve">      font-family: var(--</w:t>
       </w:r>
       <w:proofErr w:type="spellStart"/>
       <w:r>
@@ -3840,36 +3558,7 @@
           <w:sz w:val="20"/>
           <w:szCs w:val="20"/>
         </w:rPr>
-        <w:t xml:space="preserve"> </w:t>
-      </w:r>
-      <w:r>
-        <w:rPr>
-          <w:rFonts w:ascii="Arial" w:eastAsia="Courier New" w:hAnsi="Arial" w:cs="Arial"/>
-          <w:color w:val="FFFFFF"/>
-          <w:sz w:val="20"/>
-          <w:szCs w:val="20"/>
-        </w:rPr>
-        <w:t xml:space="preserve">     outline: 2px solid </w:t>
-      </w:r>
-      <w:proofErr w:type="spellStart"/>
-      <w:r>
-        <w:rPr>
-          <w:rFonts w:ascii="Arial" w:eastAsia="Courier New" w:hAnsi="Arial" w:cs="Arial"/>
-          <w:color w:val="FFFFFF"/>
-          <w:sz w:val="20"/>
-          <w:szCs w:val="20"/>
-        </w:rPr>
-        <w:t>var</w:t>
-      </w:r>
-      <w:proofErr w:type="spellEnd"/>
-      <w:r>
-        <w:rPr>
-          <w:rFonts w:ascii="Arial" w:eastAsia="Courier New" w:hAnsi="Arial" w:cs="Arial"/>
-          <w:color w:val="FFFFFF"/>
-          <w:sz w:val="20"/>
-          <w:szCs w:val="20"/>
-        </w:rPr>
-        <w:t>(--</w:t>
+        <w:t xml:space="preserve">      outline: 2px solid var(--</w:t>
       </w:r>
       <w:proofErr w:type="spellStart"/>
       <w:r>
@@ -3994,16 +3683,7 @@
           <w:sz w:val="20"/>
           <w:szCs w:val="20"/>
         </w:rPr>
-        <w:t xml:space="preserve">        animation-du</w:t>
-      </w:r>
-      <w:r>
-        <w:rPr>
-          <w:rFonts w:ascii="Arial" w:eastAsia="Courier New" w:hAnsi="Arial" w:cs="Arial"/>
-          <w:color w:val="FFFFFF"/>
-          <w:sz w:val="20"/>
-          <w:szCs w:val="20"/>
-        </w:rPr>
-        <w:t xml:space="preserve">ration: 0.01ms !important;    </w:t>
+        <w:t xml:space="preserve">        animation-duration: 0.01ms !important;    </w:t>
       </w:r>
       <w:r>
         <w:rPr>
@@ -4092,7 +3772,6 @@
         <w:rPr>
           <w:rFonts w:ascii="Arial" w:hAnsi="Arial" w:cs="Arial"/>
         </w:rPr>
-        <w:lastRenderedPageBreak/>
         <w:t xml:space="preserve">3.2. </w:t>
       </w:r>
       <w:proofErr w:type="spellStart"/>
@@ -4212,21 +3891,7 @@
         <w:rPr>
           <w:rFonts w:ascii="Arial" w:hAnsi="Arial" w:cs="Arial"/>
         </w:rPr>
-        <w:t xml:space="preserve">. </w:t>
-      </w:r>
-      <w:proofErr w:type="spellStart"/>
-      <w:r>
-        <w:rPr>
-          <w:rFonts w:ascii="Arial" w:hAnsi="Arial" w:cs="Arial"/>
-        </w:rPr>
-        <w:t>Ini</w:t>
-      </w:r>
-      <w:proofErr w:type="spellEnd"/>
-      <w:r>
-        <w:rPr>
-          <w:rFonts w:ascii="Arial" w:hAnsi="Arial" w:cs="Arial"/>
-        </w:rPr>
-        <w:t xml:space="preserve"> </w:t>
+        <w:t xml:space="preserve">. Ini </w:t>
       </w:r>
       <w:proofErr w:type="spellStart"/>
       <w:r>
@@ -4261,13 +3926,7 @@
         <w:rPr>
           <w:rFonts w:ascii="Arial" w:hAnsi="Arial" w:cs="Arial"/>
         </w:rPr>
-        <w:t>sekali</w:t>
-      </w:r>
-      <w:r>
-        <w:rPr>
-          <w:rFonts w:ascii="Arial" w:hAnsi="Arial" w:cs="Arial"/>
-        </w:rPr>
-        <w:t>gus</w:t>
+        <w:t>sekaligus</w:t>
       </w:r>
       <w:proofErr w:type="spellEnd"/>
       <w:r>
@@ -4719,16 +4378,7 @@
           <w:sz w:val="20"/>
           <w:szCs w:val="20"/>
         </w:rPr>
-        <w:t xml:space="preserve">      /* ===== WARN</w:t>
-      </w:r>
-      <w:r>
-        <w:rPr>
-          <w:rFonts w:ascii="Arial" w:eastAsia="Courier New" w:hAnsi="Arial" w:cs="Arial"/>
-          <w:color w:val="FFFFFF"/>
-          <w:sz w:val="20"/>
-          <w:szCs w:val="20"/>
-        </w:rPr>
-        <w:t xml:space="preserve">A SEMANTIK ===== */    </w:t>
+        <w:t xml:space="preserve">      /* ===== WARNA SEMANTIK ===== */    </w:t>
       </w:r>
       <w:r>
         <w:rPr>
@@ -4973,16 +4623,7 @@
           <w:sz w:val="20"/>
           <w:szCs w:val="20"/>
         </w:rPr>
-        <w:t>-font-prim</w:t>
-      </w:r>
-      <w:r>
-        <w:rPr>
-          <w:rFonts w:ascii="Arial" w:eastAsia="Courier New" w:hAnsi="Arial" w:cs="Arial"/>
-          <w:color w:val="FFFFFF"/>
-          <w:sz w:val="20"/>
-          <w:szCs w:val="20"/>
-        </w:rPr>
-        <w:t xml:space="preserve">ary: 'Outfit', 'Arial', sans-serif;    </w:t>
+        <w:t xml:space="preserve">-font-primary: 'Outfit', 'Arial', sans-serif;    </w:t>
       </w:r>
       <w:r>
         <w:rPr>
@@ -5152,8 +4793,109 @@
           <w:sz w:val="20"/>
           <w:szCs w:val="20"/>
         </w:rPr>
-        <w:t xml:space="preserve">      /* ===== RADIUS =====</w:t>
-      </w:r>
+        <w:t xml:space="preserve">      /* ===== RADIUS ===== */    </w:t>
+      </w:r>
+      <w:r>
+        <w:rPr>
+          <w:rFonts w:ascii="Arial" w:hAnsi="Arial" w:cs="Arial"/>
+        </w:rPr>
+        <w:br/>
+      </w:r>
+      <w:r>
+        <w:rPr>
+          <w:rFonts w:ascii="Arial" w:eastAsia="Courier New" w:hAnsi="Arial" w:cs="Arial"/>
+          <w:color w:val="FFFFFF"/>
+          <w:sz w:val="20"/>
+          <w:szCs w:val="20"/>
+        </w:rPr>
+        <w:t xml:space="preserve">      --</w:t>
+      </w:r>
+      <w:proofErr w:type="spellStart"/>
+      <w:r>
+        <w:rPr>
+          <w:rFonts w:ascii="Arial" w:eastAsia="Courier New" w:hAnsi="Arial" w:cs="Arial"/>
+          <w:color w:val="FFFFFF"/>
+          <w:sz w:val="20"/>
+          <w:szCs w:val="20"/>
+        </w:rPr>
+        <w:t>srui</w:t>
+      </w:r>
+      <w:proofErr w:type="spellEnd"/>
+      <w:r>
+        <w:rPr>
+          <w:rFonts w:ascii="Arial" w:eastAsia="Courier New" w:hAnsi="Arial" w:cs="Arial"/>
+          <w:color w:val="FFFFFF"/>
+          <w:sz w:val="20"/>
+          <w:szCs w:val="20"/>
+        </w:rPr>
+        <w:t>-radius-</w:t>
+      </w:r>
+      <w:proofErr w:type="spellStart"/>
+      <w:r>
+        <w:rPr>
+          <w:rFonts w:ascii="Arial" w:eastAsia="Courier New" w:hAnsi="Arial" w:cs="Arial"/>
+          <w:color w:val="FFFFFF"/>
+          <w:sz w:val="20"/>
+          <w:szCs w:val="20"/>
+        </w:rPr>
+        <w:t>sm</w:t>
+      </w:r>
+      <w:proofErr w:type="spellEnd"/>
+      <w:r>
+        <w:rPr>
+          <w:rFonts w:ascii="Arial" w:eastAsia="Courier New" w:hAnsi="Arial" w:cs="Arial"/>
+          <w:color w:val="FFFFFF"/>
+          <w:sz w:val="20"/>
+          <w:szCs w:val="20"/>
+        </w:rPr>
+        <w:t xml:space="preserve">: 12px;    </w:t>
+      </w:r>
+      <w:r>
+        <w:rPr>
+          <w:rFonts w:ascii="Arial" w:hAnsi="Arial" w:cs="Arial"/>
+        </w:rPr>
+        <w:br/>
+      </w:r>
+      <w:r>
+        <w:rPr>
+          <w:rFonts w:ascii="Arial" w:eastAsia="Courier New" w:hAnsi="Arial" w:cs="Arial"/>
+          <w:color w:val="FFFFFF"/>
+          <w:sz w:val="20"/>
+          <w:szCs w:val="20"/>
+        </w:rPr>
+        <w:t xml:space="preserve">      --</w:t>
+      </w:r>
+      <w:proofErr w:type="spellStart"/>
+      <w:r>
+        <w:rPr>
+          <w:rFonts w:ascii="Arial" w:eastAsia="Courier New" w:hAnsi="Arial" w:cs="Arial"/>
+          <w:color w:val="FFFFFF"/>
+          <w:sz w:val="20"/>
+          <w:szCs w:val="20"/>
+        </w:rPr>
+        <w:t>srui</w:t>
+      </w:r>
+      <w:proofErr w:type="spellEnd"/>
+      <w:r>
+        <w:rPr>
+          <w:rFonts w:ascii="Arial" w:eastAsia="Courier New" w:hAnsi="Arial" w:cs="Arial"/>
+          <w:color w:val="FFFFFF"/>
+          <w:sz w:val="20"/>
+          <w:szCs w:val="20"/>
+        </w:rPr>
+        <w:t xml:space="preserve">-radius-md: 15px;     /* radius </w:t>
+      </w:r>
+      <w:proofErr w:type="spellStart"/>
+      <w:r>
+        <w:rPr>
+          <w:rFonts w:ascii="Arial" w:eastAsia="Courier New" w:hAnsi="Arial" w:cs="Arial"/>
+          <w:color w:val="FFFFFF"/>
+          <w:sz w:val="20"/>
+          <w:szCs w:val="20"/>
+        </w:rPr>
+        <w:t>standar</w:t>
+      </w:r>
+      <w:proofErr w:type="spellEnd"/>
       <w:r>
         <w:rPr>
           <w:rFonts w:ascii="Arial" w:eastAsia="Courier New" w:hAnsi="Arial" w:cs="Arial"/>
@@ -5206,17 +4948,17 @@
           <w:sz w:val="20"/>
           <w:szCs w:val="20"/>
         </w:rPr>
-        <w:t>sm</w:t>
-      </w:r>
-      <w:proofErr w:type="spellEnd"/>
-      <w:r>
-        <w:rPr>
-          <w:rFonts w:ascii="Arial" w:eastAsia="Courier New" w:hAnsi="Arial" w:cs="Arial"/>
-          <w:color w:val="FFFFFF"/>
-          <w:sz w:val="20"/>
-          <w:szCs w:val="20"/>
-        </w:rPr>
-        <w:t xml:space="preserve">: 12px;    </w:t>
+        <w:t>lg</w:t>
+      </w:r>
+      <w:proofErr w:type="spellEnd"/>
+      <w:r>
+        <w:rPr>
+          <w:rFonts w:ascii="Arial" w:eastAsia="Courier New" w:hAnsi="Arial" w:cs="Arial"/>
+          <w:color w:val="FFFFFF"/>
+          <w:sz w:val="20"/>
+          <w:szCs w:val="20"/>
+        </w:rPr>
+        <w:t xml:space="preserve">: 25px;    </w:t>
       </w:r>
       <w:r>
         <w:rPr>
@@ -5251,27 +4993,192 @@
           <w:sz w:val="20"/>
           <w:szCs w:val="20"/>
         </w:rPr>
-        <w:t xml:space="preserve">-radius-md: 15px;     /* radius </w:t>
-      </w:r>
-      <w:proofErr w:type="spellStart"/>
-      <w:r>
-        <w:rPr>
-          <w:rFonts w:ascii="Arial" w:eastAsia="Courier New" w:hAnsi="Arial" w:cs="Arial"/>
-          <w:color w:val="FFFFFF"/>
-          <w:sz w:val="20"/>
-          <w:szCs w:val="20"/>
-        </w:rPr>
-        <w:t>standar</w:t>
-      </w:r>
-      <w:proofErr w:type="spellEnd"/>
-      <w:r>
-        <w:rPr>
-          <w:rFonts w:ascii="Arial" w:eastAsia="Courier New" w:hAnsi="Arial" w:cs="Arial"/>
-          <w:color w:val="FFFFFF"/>
-          <w:sz w:val="20"/>
-          <w:szCs w:val="20"/>
-        </w:rPr>
-        <w:t xml:space="preserve"> */    </w:t>
+        <w:t xml:space="preserve">-radius-pill: 9999px;    </w:t>
+      </w:r>
+      <w:r>
+        <w:rPr>
+          <w:rFonts w:ascii="Arial" w:hAnsi="Arial" w:cs="Arial"/>
+        </w:rPr>
+        <w:br/>
+      </w:r>
+      <w:r>
+        <w:rPr>
+          <w:rFonts w:ascii="Arial" w:eastAsia="Courier New" w:hAnsi="Arial" w:cs="Arial"/>
+          <w:color w:val="FFFFFF"/>
+          <w:sz w:val="20"/>
+          <w:szCs w:val="20"/>
+        </w:rPr>
+        <w:t xml:space="preserve">         </w:t>
+      </w:r>
+      <w:r>
+        <w:rPr>
+          <w:rFonts w:ascii="Arial" w:hAnsi="Arial" w:cs="Arial"/>
+        </w:rPr>
+        <w:br/>
+      </w:r>
+      <w:r>
+        <w:rPr>
+          <w:rFonts w:ascii="Arial" w:eastAsia="Courier New" w:hAnsi="Arial" w:cs="Arial"/>
+          <w:color w:val="FFFFFF"/>
+          <w:sz w:val="20"/>
+          <w:szCs w:val="20"/>
+        </w:rPr>
+        <w:t xml:space="preserve">      /* ===== SPACING (</w:t>
+      </w:r>
+      <w:proofErr w:type="spellStart"/>
+      <w:r>
+        <w:rPr>
+          <w:rFonts w:ascii="Arial" w:eastAsia="Courier New" w:hAnsi="Arial" w:cs="Arial"/>
+          <w:color w:val="FFFFFF"/>
+          <w:sz w:val="20"/>
+          <w:szCs w:val="20"/>
+        </w:rPr>
+        <w:t>skala</w:t>
+      </w:r>
+      <w:proofErr w:type="spellEnd"/>
+      <w:r>
+        <w:rPr>
+          <w:rFonts w:ascii="Arial" w:eastAsia="Courier New" w:hAnsi="Arial" w:cs="Arial"/>
+          <w:color w:val="FFFFFF"/>
+          <w:sz w:val="20"/>
+          <w:szCs w:val="20"/>
+        </w:rPr>
+        <w:t xml:space="preserve"> 4px) ===== */    </w:t>
+      </w:r>
+      <w:r>
+        <w:rPr>
+          <w:rFonts w:ascii="Arial" w:hAnsi="Arial" w:cs="Arial"/>
+        </w:rPr>
+        <w:br/>
+      </w:r>
+      <w:r>
+        <w:rPr>
+          <w:rFonts w:ascii="Arial" w:eastAsia="Courier New" w:hAnsi="Arial" w:cs="Arial"/>
+          <w:color w:val="FFFFFF"/>
+          <w:sz w:val="20"/>
+          <w:szCs w:val="20"/>
+        </w:rPr>
+        <w:t xml:space="preserve">      --srui-space-1: 0.25rem;    /* 4px */    </w:t>
+      </w:r>
+      <w:r>
+        <w:rPr>
+          <w:rFonts w:ascii="Arial" w:hAnsi="Arial" w:cs="Arial"/>
+        </w:rPr>
+        <w:br/>
+      </w:r>
+      <w:r>
+        <w:rPr>
+          <w:rFonts w:ascii="Arial" w:eastAsia="Courier New" w:hAnsi="Arial" w:cs="Arial"/>
+          <w:color w:val="FFFFFF"/>
+          <w:sz w:val="20"/>
+          <w:szCs w:val="20"/>
+        </w:rPr>
+        <w:t xml:space="preserve">      --srui-space-2: 0.5rem;     /* 8px */    </w:t>
+      </w:r>
+      <w:r>
+        <w:rPr>
+          <w:rFonts w:ascii="Arial" w:hAnsi="Arial" w:cs="Arial"/>
+        </w:rPr>
+        <w:br/>
+      </w:r>
+      <w:r>
+        <w:rPr>
+          <w:rFonts w:ascii="Arial" w:eastAsia="Courier New" w:hAnsi="Arial" w:cs="Arial"/>
+          <w:color w:val="FFFFFF"/>
+          <w:sz w:val="20"/>
+          <w:szCs w:val="20"/>
+        </w:rPr>
+        <w:t xml:space="preserve">      --srui-space-3: 0.75rem;    /* 12px */    </w:t>
+      </w:r>
+      <w:r>
+        <w:rPr>
+          <w:rFonts w:ascii="Arial" w:hAnsi="Arial" w:cs="Arial"/>
+        </w:rPr>
+        <w:br/>
+      </w:r>
+      <w:r>
+        <w:rPr>
+          <w:rFonts w:ascii="Arial" w:eastAsia="Courier New" w:hAnsi="Arial" w:cs="Arial"/>
+          <w:color w:val="FFFFFF"/>
+          <w:sz w:val="20"/>
+          <w:szCs w:val="20"/>
+        </w:rPr>
+        <w:t xml:space="preserve">      --srui-space-4: 1rem;       /* 16px */    </w:t>
+      </w:r>
+      <w:r>
+        <w:rPr>
+          <w:rFonts w:ascii="Arial" w:hAnsi="Arial" w:cs="Arial"/>
+        </w:rPr>
+        <w:br/>
+      </w:r>
+      <w:r>
+        <w:rPr>
+          <w:rFonts w:ascii="Arial" w:eastAsia="Courier New" w:hAnsi="Arial" w:cs="Arial"/>
+          <w:color w:val="FFFFFF"/>
+          <w:sz w:val="20"/>
+          <w:szCs w:val="20"/>
+        </w:rPr>
+        <w:t xml:space="preserve">      --srui-space-6: 1.5rem;     /* 24px */    </w:t>
+      </w:r>
+      <w:r>
+        <w:rPr>
+          <w:rFonts w:ascii="Arial" w:hAnsi="Arial" w:cs="Arial"/>
+        </w:rPr>
+        <w:br/>
+      </w:r>
+      <w:r>
+        <w:rPr>
+          <w:rFonts w:ascii="Arial" w:eastAsia="Courier New" w:hAnsi="Arial" w:cs="Arial"/>
+          <w:color w:val="FFFFFF"/>
+          <w:sz w:val="20"/>
+          <w:szCs w:val="20"/>
+        </w:rPr>
+        <w:t xml:space="preserve">      --srui-space-8: 2rem;       /* 32px */    </w:t>
+      </w:r>
+      <w:r>
+        <w:rPr>
+          <w:rFonts w:ascii="Arial" w:hAnsi="Arial" w:cs="Arial"/>
+        </w:rPr>
+        <w:br/>
+      </w:r>
+      <w:r>
+        <w:rPr>
+          <w:rFonts w:ascii="Arial" w:eastAsia="Courier New" w:hAnsi="Arial" w:cs="Arial"/>
+          <w:color w:val="FFFFFF"/>
+          <w:sz w:val="20"/>
+          <w:szCs w:val="20"/>
+        </w:rPr>
+        <w:t xml:space="preserve">      --srui-space-12: 3rem;      /* 48px */    </w:t>
+      </w:r>
+      <w:r>
+        <w:rPr>
+          <w:rFonts w:ascii="Arial" w:hAnsi="Arial" w:cs="Arial"/>
+        </w:rPr>
+        <w:br/>
+      </w:r>
+      <w:r>
+        <w:rPr>
+          <w:rFonts w:ascii="Arial" w:eastAsia="Courier New" w:hAnsi="Arial" w:cs="Arial"/>
+          <w:color w:val="FFFFFF"/>
+          <w:sz w:val="20"/>
+          <w:szCs w:val="20"/>
+        </w:rPr>
+        <w:t xml:space="preserve">         </w:t>
+      </w:r>
+      <w:r>
+        <w:rPr>
+          <w:rFonts w:ascii="Arial" w:hAnsi="Arial" w:cs="Arial"/>
+        </w:rPr>
+        <w:br/>
+      </w:r>
+      <w:r>
+        <w:rPr>
+          <w:rFonts w:ascii="Arial" w:eastAsia="Courier New" w:hAnsi="Arial" w:cs="Arial"/>
+          <w:color w:val="FFFFFF"/>
+          <w:sz w:val="20"/>
+          <w:szCs w:val="20"/>
+        </w:rPr>
+        <w:t xml:space="preserve">      /* ===== SHADOW ===== */    </w:t>
       </w:r>
       <w:r>
         <w:rPr>
@@ -5306,27 +5213,27 @@
           <w:sz w:val="20"/>
           <w:szCs w:val="20"/>
         </w:rPr>
-        <w:t>-radius-</w:t>
-      </w:r>
-      <w:proofErr w:type="spellStart"/>
-      <w:r>
-        <w:rPr>
-          <w:rFonts w:ascii="Arial" w:eastAsia="Courier New" w:hAnsi="Arial" w:cs="Arial"/>
-          <w:color w:val="FFFFFF"/>
-          <w:sz w:val="20"/>
-          <w:szCs w:val="20"/>
-        </w:rPr>
-        <w:t>lg</w:t>
-      </w:r>
-      <w:proofErr w:type="spellEnd"/>
-      <w:r>
-        <w:rPr>
-          <w:rFonts w:ascii="Arial" w:eastAsia="Courier New" w:hAnsi="Arial" w:cs="Arial"/>
-          <w:color w:val="FFFFFF"/>
-          <w:sz w:val="20"/>
-          <w:szCs w:val="20"/>
-        </w:rPr>
-        <w:t xml:space="preserve">: 25px;    </w:t>
+        <w:t xml:space="preserve">-shadow-card: 0 2px 8px </w:t>
+      </w:r>
+      <w:proofErr w:type="spellStart"/>
+      <w:r>
+        <w:rPr>
+          <w:rFonts w:ascii="Arial" w:eastAsia="Courier New" w:hAnsi="Arial" w:cs="Arial"/>
+          <w:color w:val="FFFFFF"/>
+          <w:sz w:val="20"/>
+          <w:szCs w:val="20"/>
+        </w:rPr>
+        <w:t>rgba</w:t>
+      </w:r>
+      <w:proofErr w:type="spellEnd"/>
+      <w:r>
+        <w:rPr>
+          <w:rFonts w:ascii="Arial" w:eastAsia="Courier New" w:hAnsi="Arial" w:cs="Arial"/>
+          <w:color w:val="FFFFFF"/>
+          <w:sz w:val="20"/>
+          <w:szCs w:val="20"/>
+        </w:rPr>
+        <w:t xml:space="preserve">(0,0,0,0.4);    </w:t>
       </w:r>
       <w:r>
         <w:rPr>
@@ -5361,22 +5268,41 @@
           <w:sz w:val="20"/>
           <w:szCs w:val="20"/>
         </w:rPr>
-        <w:t xml:space="preserve">-radius-pill: 9999px;    </w:t>
-      </w:r>
-      <w:r>
-        <w:rPr>
-          <w:rFonts w:ascii="Arial" w:hAnsi="Arial" w:cs="Arial"/>
-        </w:rPr>
-        <w:br/>
-      </w:r>
-      <w:r>
-        <w:rPr>
-          <w:rFonts w:ascii="Arial" w:eastAsia="Courier New" w:hAnsi="Arial" w:cs="Arial"/>
-          <w:color w:val="FFFFFF"/>
-          <w:sz w:val="20"/>
-          <w:szCs w:val="20"/>
-        </w:rPr>
-        <w:lastRenderedPageBreak/>
+        <w:t xml:space="preserve">-shadow-raised: 0 4px 12px </w:t>
+      </w:r>
+      <w:proofErr w:type="spellStart"/>
+      <w:r>
+        <w:rPr>
+          <w:rFonts w:ascii="Arial" w:eastAsia="Courier New" w:hAnsi="Arial" w:cs="Arial"/>
+          <w:color w:val="FFFFFF"/>
+          <w:sz w:val="20"/>
+          <w:szCs w:val="20"/>
+        </w:rPr>
+        <w:t>rgba</w:t>
+      </w:r>
+      <w:proofErr w:type="spellEnd"/>
+      <w:r>
+        <w:rPr>
+          <w:rFonts w:ascii="Arial" w:eastAsia="Courier New" w:hAnsi="Arial" w:cs="Arial"/>
+          <w:color w:val="FFFFFF"/>
+          <w:sz w:val="20"/>
+          <w:szCs w:val="20"/>
+        </w:rPr>
+        <w:t xml:space="preserve">(0,0,0,0.5);    </w:t>
+      </w:r>
+      <w:r>
+        <w:rPr>
+          <w:rFonts w:ascii="Arial" w:hAnsi="Arial" w:cs="Arial"/>
+        </w:rPr>
+        <w:br/>
+      </w:r>
+      <w:r>
+        <w:rPr>
+          <w:rFonts w:ascii="Arial" w:eastAsia="Courier New" w:hAnsi="Arial" w:cs="Arial"/>
+          <w:color w:val="FFFFFF"/>
+          <w:sz w:val="20"/>
+          <w:szCs w:val="20"/>
+        </w:rPr>
         <w:t xml:space="preserve">         </w:t>
       </w:r>
       <w:r>
@@ -5392,150 +5318,147 @@
           <w:sz w:val="20"/>
           <w:szCs w:val="20"/>
         </w:rPr>
-        <w:t xml:space="preserve">      /* ===== SPACING (</w:t>
-      </w:r>
-      <w:proofErr w:type="spellStart"/>
-      <w:r>
-        <w:rPr>
-          <w:rFonts w:ascii="Arial" w:eastAsia="Courier New" w:hAnsi="Arial" w:cs="Arial"/>
-          <w:color w:val="FFFFFF"/>
-          <w:sz w:val="20"/>
-          <w:szCs w:val="20"/>
-        </w:rPr>
-        <w:t>skala</w:t>
-      </w:r>
-      <w:proofErr w:type="spellEnd"/>
-      <w:r>
-        <w:rPr>
-          <w:rFonts w:ascii="Arial" w:eastAsia="Courier New" w:hAnsi="Arial" w:cs="Arial"/>
-          <w:color w:val="FFFFFF"/>
-          <w:sz w:val="20"/>
-          <w:szCs w:val="20"/>
-        </w:rPr>
-        <w:t xml:space="preserve"> 4px) ===== */    </w:t>
-      </w:r>
-      <w:r>
-        <w:rPr>
-          <w:rFonts w:ascii="Arial" w:hAnsi="Arial" w:cs="Arial"/>
-        </w:rPr>
-        <w:br/>
-      </w:r>
-      <w:r>
-        <w:rPr>
-          <w:rFonts w:ascii="Arial" w:eastAsia="Courier New" w:hAnsi="Arial" w:cs="Arial"/>
-          <w:color w:val="FFFFFF"/>
-          <w:sz w:val="20"/>
-          <w:szCs w:val="20"/>
-        </w:rPr>
-        <w:t xml:space="preserve">      --srui-space-1: 0.2</w:t>
-      </w:r>
-      <w:r>
-        <w:rPr>
-          <w:rFonts w:ascii="Arial" w:eastAsia="Courier New" w:hAnsi="Arial" w:cs="Arial"/>
-          <w:color w:val="FFFFFF"/>
-          <w:sz w:val="20"/>
-          <w:szCs w:val="20"/>
-        </w:rPr>
-        <w:t xml:space="preserve">5rem;    /* 4px */    </w:t>
-      </w:r>
-      <w:r>
-        <w:rPr>
-          <w:rFonts w:ascii="Arial" w:hAnsi="Arial" w:cs="Arial"/>
-        </w:rPr>
-        <w:br/>
-      </w:r>
-      <w:r>
-        <w:rPr>
-          <w:rFonts w:ascii="Arial" w:eastAsia="Courier New" w:hAnsi="Arial" w:cs="Arial"/>
-          <w:color w:val="FFFFFF"/>
-          <w:sz w:val="20"/>
-          <w:szCs w:val="20"/>
-        </w:rPr>
-        <w:t xml:space="preserve">      --srui-space-2: 0.5rem;     /* 8px */    </w:t>
-      </w:r>
-      <w:r>
-        <w:rPr>
-          <w:rFonts w:ascii="Arial" w:hAnsi="Arial" w:cs="Arial"/>
-        </w:rPr>
-        <w:br/>
-      </w:r>
-      <w:r>
-        <w:rPr>
-          <w:rFonts w:ascii="Arial" w:eastAsia="Courier New" w:hAnsi="Arial" w:cs="Arial"/>
-          <w:color w:val="FFFFFF"/>
-          <w:sz w:val="20"/>
-          <w:szCs w:val="20"/>
-        </w:rPr>
-        <w:t xml:space="preserve">      --srui-space-3: 0.75rem;    /* 12px */    </w:t>
-      </w:r>
-      <w:r>
-        <w:rPr>
-          <w:rFonts w:ascii="Arial" w:hAnsi="Arial" w:cs="Arial"/>
-        </w:rPr>
-        <w:br/>
-      </w:r>
-      <w:r>
-        <w:rPr>
-          <w:rFonts w:ascii="Arial" w:eastAsia="Courier New" w:hAnsi="Arial" w:cs="Arial"/>
-          <w:color w:val="FFFFFF"/>
-          <w:sz w:val="20"/>
-          <w:szCs w:val="20"/>
-        </w:rPr>
-        <w:t xml:space="preserve">      --srui-space-4: 1rem;       /* 16px */    </w:t>
-      </w:r>
-      <w:r>
-        <w:rPr>
-          <w:rFonts w:ascii="Arial" w:hAnsi="Arial" w:cs="Arial"/>
-        </w:rPr>
-        <w:br/>
-      </w:r>
-      <w:r>
-        <w:rPr>
-          <w:rFonts w:ascii="Arial" w:eastAsia="Courier New" w:hAnsi="Arial" w:cs="Arial"/>
-          <w:color w:val="FFFFFF"/>
-          <w:sz w:val="20"/>
-          <w:szCs w:val="20"/>
-        </w:rPr>
-        <w:t xml:space="preserve">      --srui-space-6: 1.5rem;     /* 24px */    </w:t>
-      </w:r>
-      <w:r>
-        <w:rPr>
-          <w:rFonts w:ascii="Arial" w:hAnsi="Arial" w:cs="Arial"/>
-        </w:rPr>
-        <w:br/>
-      </w:r>
-      <w:r>
-        <w:rPr>
-          <w:rFonts w:ascii="Arial" w:eastAsia="Courier New" w:hAnsi="Arial" w:cs="Arial"/>
-          <w:color w:val="FFFFFF"/>
-          <w:sz w:val="20"/>
-          <w:szCs w:val="20"/>
-        </w:rPr>
-        <w:t xml:space="preserve">      --srui-space-8: 2rem;       /* 3</w:t>
-      </w:r>
-      <w:r>
-        <w:rPr>
-          <w:rFonts w:ascii="Arial" w:eastAsia="Courier New" w:hAnsi="Arial" w:cs="Arial"/>
-          <w:color w:val="FFFFFF"/>
-          <w:sz w:val="20"/>
-          <w:szCs w:val="20"/>
-        </w:rPr>
-        <w:t xml:space="preserve">2px */    </w:t>
-      </w:r>
-      <w:r>
-        <w:rPr>
-          <w:rFonts w:ascii="Arial" w:hAnsi="Arial" w:cs="Arial"/>
-        </w:rPr>
-        <w:br/>
-      </w:r>
-      <w:r>
-        <w:rPr>
-          <w:rFonts w:ascii="Arial" w:eastAsia="Courier New" w:hAnsi="Arial" w:cs="Arial"/>
-          <w:color w:val="FFFFFF"/>
-          <w:sz w:val="20"/>
-          <w:szCs w:val="20"/>
-        </w:rPr>
-        <w:t xml:space="preserve">      --srui-space-12: 3rem;      /* 48px */    </w:t>
+        <w:t xml:space="preserve">      /* ===== MOTION ===== */    </w:t>
+      </w:r>
+      <w:r>
+        <w:rPr>
+          <w:rFonts w:ascii="Arial" w:hAnsi="Arial" w:cs="Arial"/>
+        </w:rPr>
+        <w:br/>
+      </w:r>
+      <w:r>
+        <w:rPr>
+          <w:rFonts w:ascii="Arial" w:eastAsia="Courier New" w:hAnsi="Arial" w:cs="Arial"/>
+          <w:color w:val="FFFFFF"/>
+          <w:sz w:val="20"/>
+          <w:szCs w:val="20"/>
+        </w:rPr>
+        <w:t xml:space="preserve">      --</w:t>
+      </w:r>
+      <w:proofErr w:type="spellStart"/>
+      <w:r>
+        <w:rPr>
+          <w:rFonts w:ascii="Arial" w:eastAsia="Courier New" w:hAnsi="Arial" w:cs="Arial"/>
+          <w:color w:val="FFFFFF"/>
+          <w:sz w:val="20"/>
+          <w:szCs w:val="20"/>
+        </w:rPr>
+        <w:t>srui</w:t>
+      </w:r>
+      <w:proofErr w:type="spellEnd"/>
+      <w:r>
+        <w:rPr>
+          <w:rFonts w:ascii="Arial" w:eastAsia="Courier New" w:hAnsi="Arial" w:cs="Arial"/>
+          <w:color w:val="FFFFFF"/>
+          <w:sz w:val="20"/>
+          <w:szCs w:val="20"/>
+        </w:rPr>
+        <w:t xml:space="preserve">-duration-fast: 0.1s;    </w:t>
+      </w:r>
+      <w:r>
+        <w:rPr>
+          <w:rFonts w:ascii="Arial" w:hAnsi="Arial" w:cs="Arial"/>
+        </w:rPr>
+        <w:br/>
+      </w:r>
+      <w:r>
+        <w:rPr>
+          <w:rFonts w:ascii="Arial" w:eastAsia="Courier New" w:hAnsi="Arial" w:cs="Arial"/>
+          <w:color w:val="FFFFFF"/>
+          <w:sz w:val="20"/>
+          <w:szCs w:val="20"/>
+        </w:rPr>
+        <w:t xml:space="preserve">      --</w:t>
+      </w:r>
+      <w:proofErr w:type="spellStart"/>
+      <w:r>
+        <w:rPr>
+          <w:rFonts w:ascii="Arial" w:eastAsia="Courier New" w:hAnsi="Arial" w:cs="Arial"/>
+          <w:color w:val="FFFFFF"/>
+          <w:sz w:val="20"/>
+          <w:szCs w:val="20"/>
+        </w:rPr>
+        <w:t>srui</w:t>
+      </w:r>
+      <w:proofErr w:type="spellEnd"/>
+      <w:r>
+        <w:rPr>
+          <w:rFonts w:ascii="Arial" w:eastAsia="Courier New" w:hAnsi="Arial" w:cs="Arial"/>
+          <w:color w:val="FFFFFF"/>
+          <w:sz w:val="20"/>
+          <w:szCs w:val="20"/>
+        </w:rPr>
+        <w:t xml:space="preserve">-duration-normal: 0.3s;    </w:t>
+      </w:r>
+      <w:r>
+        <w:rPr>
+          <w:rFonts w:ascii="Arial" w:hAnsi="Arial" w:cs="Arial"/>
+        </w:rPr>
+        <w:br/>
+      </w:r>
+      <w:r>
+        <w:rPr>
+          <w:rFonts w:ascii="Arial" w:eastAsia="Courier New" w:hAnsi="Arial" w:cs="Arial"/>
+          <w:color w:val="FFFFFF"/>
+          <w:sz w:val="20"/>
+          <w:szCs w:val="20"/>
+        </w:rPr>
+        <w:t xml:space="preserve">      --</w:t>
+      </w:r>
+      <w:proofErr w:type="spellStart"/>
+      <w:r>
+        <w:rPr>
+          <w:rFonts w:ascii="Arial" w:eastAsia="Courier New" w:hAnsi="Arial" w:cs="Arial"/>
+          <w:color w:val="FFFFFF"/>
+          <w:sz w:val="20"/>
+          <w:szCs w:val="20"/>
+        </w:rPr>
+        <w:t>srui</w:t>
+      </w:r>
+      <w:proofErr w:type="spellEnd"/>
+      <w:r>
+        <w:rPr>
+          <w:rFonts w:ascii="Arial" w:eastAsia="Courier New" w:hAnsi="Arial" w:cs="Arial"/>
+          <w:color w:val="FFFFFF"/>
+          <w:sz w:val="20"/>
+          <w:szCs w:val="20"/>
+        </w:rPr>
+        <w:t xml:space="preserve">-easing-press: ease-out;    </w:t>
+      </w:r>
+      <w:r>
+        <w:rPr>
+          <w:rFonts w:ascii="Arial" w:hAnsi="Arial" w:cs="Arial"/>
+        </w:rPr>
+        <w:br/>
+      </w:r>
+      <w:r>
+        <w:rPr>
+          <w:rFonts w:ascii="Arial" w:eastAsia="Courier New" w:hAnsi="Arial" w:cs="Arial"/>
+          <w:color w:val="FFFFFF"/>
+          <w:sz w:val="20"/>
+          <w:szCs w:val="20"/>
+        </w:rPr>
+        <w:t xml:space="preserve">      --</w:t>
+      </w:r>
+      <w:proofErr w:type="spellStart"/>
+      <w:r>
+        <w:rPr>
+          <w:rFonts w:ascii="Arial" w:eastAsia="Courier New" w:hAnsi="Arial" w:cs="Arial"/>
+          <w:color w:val="FFFFFF"/>
+          <w:sz w:val="20"/>
+          <w:szCs w:val="20"/>
+        </w:rPr>
+        <w:t>srui</w:t>
+      </w:r>
+      <w:proofErr w:type="spellEnd"/>
+      <w:r>
+        <w:rPr>
+          <w:rFonts w:ascii="Arial" w:eastAsia="Courier New" w:hAnsi="Arial" w:cs="Arial"/>
+          <w:color w:val="FFFFFF"/>
+          <w:sz w:val="20"/>
+          <w:szCs w:val="20"/>
+        </w:rPr>
+        <w:t xml:space="preserve">-easing-smooth: ease-in-out;    </w:t>
       </w:r>
       <w:r>
         <w:rPr>
@@ -5565,7 +5488,7 @@
           <w:sz w:val="20"/>
           <w:szCs w:val="20"/>
         </w:rPr>
-        <w:t xml:space="preserve">      /* ===== SHADOW ===== */    </w:t>
+        <w:t xml:space="preserve">      /* ===== Z-INDEX LAYER ===== */    </w:t>
       </w:r>
       <w:r>
         <w:rPr>
@@ -5600,27 +5523,7 @@
           <w:sz w:val="20"/>
           <w:szCs w:val="20"/>
         </w:rPr>
-        <w:t xml:space="preserve">-shadow-card: 0 2px 8px </w:t>
-      </w:r>
-      <w:proofErr w:type="spellStart"/>
-      <w:r>
-        <w:rPr>
-          <w:rFonts w:ascii="Arial" w:eastAsia="Courier New" w:hAnsi="Arial" w:cs="Arial"/>
-          <w:color w:val="FFFFFF"/>
-          <w:sz w:val="20"/>
-          <w:szCs w:val="20"/>
-        </w:rPr>
-        <w:t>rgba</w:t>
-      </w:r>
-      <w:proofErr w:type="spellEnd"/>
-      <w:r>
-        <w:rPr>
-          <w:rFonts w:ascii="Arial" w:eastAsia="Courier New" w:hAnsi="Arial" w:cs="Arial"/>
-          <w:color w:val="FFFFFF"/>
-          <w:sz w:val="20"/>
-          <w:szCs w:val="20"/>
-        </w:rPr>
-        <w:t xml:space="preserve">(0,0,0,0.4);    </w:t>
+        <w:t xml:space="preserve">-z-dropdown: 100;    </w:t>
       </w:r>
       <w:r>
         <w:rPr>
@@ -5655,27 +5558,77 @@
           <w:sz w:val="20"/>
           <w:szCs w:val="20"/>
         </w:rPr>
-        <w:t xml:space="preserve">-shadow-raised: 0 4px 12px </w:t>
-      </w:r>
-      <w:proofErr w:type="spellStart"/>
-      <w:r>
-        <w:rPr>
-          <w:rFonts w:ascii="Arial" w:eastAsia="Courier New" w:hAnsi="Arial" w:cs="Arial"/>
-          <w:color w:val="FFFFFF"/>
-          <w:sz w:val="20"/>
-          <w:szCs w:val="20"/>
-        </w:rPr>
-        <w:t>rgba</w:t>
-      </w:r>
-      <w:proofErr w:type="spellEnd"/>
-      <w:r>
-        <w:rPr>
-          <w:rFonts w:ascii="Arial" w:eastAsia="Courier New" w:hAnsi="Arial" w:cs="Arial"/>
-          <w:color w:val="FFFFFF"/>
-          <w:sz w:val="20"/>
-          <w:szCs w:val="20"/>
-        </w:rPr>
-        <w:t xml:space="preserve">(0,0,0,0.5);    </w:t>
+        <w:t xml:space="preserve">-z-sticky: 200;    </w:t>
+      </w:r>
+      <w:r>
+        <w:rPr>
+          <w:rFonts w:ascii="Arial" w:hAnsi="Arial" w:cs="Arial"/>
+        </w:rPr>
+        <w:br/>
+      </w:r>
+      <w:r>
+        <w:rPr>
+          <w:rFonts w:ascii="Arial" w:eastAsia="Courier New" w:hAnsi="Arial" w:cs="Arial"/>
+          <w:color w:val="FFFFFF"/>
+          <w:sz w:val="20"/>
+          <w:szCs w:val="20"/>
+        </w:rPr>
+        <w:t xml:space="preserve">      --</w:t>
+      </w:r>
+      <w:proofErr w:type="spellStart"/>
+      <w:r>
+        <w:rPr>
+          <w:rFonts w:ascii="Arial" w:eastAsia="Courier New" w:hAnsi="Arial" w:cs="Arial"/>
+          <w:color w:val="FFFFFF"/>
+          <w:sz w:val="20"/>
+          <w:szCs w:val="20"/>
+        </w:rPr>
+        <w:t>srui</w:t>
+      </w:r>
+      <w:proofErr w:type="spellEnd"/>
+      <w:r>
+        <w:rPr>
+          <w:rFonts w:ascii="Arial" w:eastAsia="Courier New" w:hAnsi="Arial" w:cs="Arial"/>
+          <w:color w:val="FFFFFF"/>
+          <w:sz w:val="20"/>
+          <w:szCs w:val="20"/>
+        </w:rPr>
+        <w:t xml:space="preserve">-z-modal: 300;    </w:t>
+      </w:r>
+      <w:r>
+        <w:rPr>
+          <w:rFonts w:ascii="Arial" w:hAnsi="Arial" w:cs="Arial"/>
+        </w:rPr>
+        <w:br/>
+      </w:r>
+      <w:r>
+        <w:rPr>
+          <w:rFonts w:ascii="Arial" w:eastAsia="Courier New" w:hAnsi="Arial" w:cs="Arial"/>
+          <w:color w:val="FFFFFF"/>
+          <w:sz w:val="20"/>
+          <w:szCs w:val="20"/>
+        </w:rPr>
+        <w:t xml:space="preserve">      --</w:t>
+      </w:r>
+      <w:proofErr w:type="spellStart"/>
+      <w:r>
+        <w:rPr>
+          <w:rFonts w:ascii="Arial" w:eastAsia="Courier New" w:hAnsi="Arial" w:cs="Arial"/>
+          <w:color w:val="FFFFFF"/>
+          <w:sz w:val="20"/>
+          <w:szCs w:val="20"/>
+        </w:rPr>
+        <w:t>srui</w:t>
+      </w:r>
+      <w:proofErr w:type="spellEnd"/>
+      <w:r>
+        <w:rPr>
+          <w:rFonts w:ascii="Arial" w:eastAsia="Courier New" w:hAnsi="Arial" w:cs="Arial"/>
+          <w:color w:val="FFFFFF"/>
+          <w:sz w:val="20"/>
+          <w:szCs w:val="20"/>
+        </w:rPr>
+        <w:t xml:space="preserve">-z-toast: 400;    </w:t>
       </w:r>
       <w:r>
         <w:rPr>
@@ -5705,16 +5658,7 @@
           <w:sz w:val="20"/>
           <w:szCs w:val="20"/>
         </w:rPr>
-        <w:t xml:space="preserve">      /* ===== MOTION ==</w:t>
-      </w:r>
-      <w:r>
-        <w:rPr>
-          <w:rFonts w:ascii="Arial" w:eastAsia="Courier New" w:hAnsi="Arial" w:cs="Arial"/>
-          <w:color w:val="FFFFFF"/>
-          <w:sz w:val="20"/>
-          <w:szCs w:val="20"/>
-        </w:rPr>
-        <w:t xml:space="preserve">=== */    </w:t>
+        <w:t xml:space="preserve">      /* ===== INTERAKSI SCALE ===== */    </w:t>
       </w:r>
       <w:r>
         <w:rPr>
@@ -5749,356 +5693,7 @@
           <w:sz w:val="20"/>
           <w:szCs w:val="20"/>
         </w:rPr>
-        <w:t xml:space="preserve">-duration-fast: 0.1s;    </w:t>
-      </w:r>
-      <w:r>
-        <w:rPr>
-          <w:rFonts w:ascii="Arial" w:hAnsi="Arial" w:cs="Arial"/>
-        </w:rPr>
-        <w:br/>
-      </w:r>
-      <w:r>
-        <w:rPr>
-          <w:rFonts w:ascii="Arial" w:eastAsia="Courier New" w:hAnsi="Arial" w:cs="Arial"/>
-          <w:color w:val="FFFFFF"/>
-          <w:sz w:val="20"/>
-          <w:szCs w:val="20"/>
-        </w:rPr>
-        <w:t xml:space="preserve">      --</w:t>
-      </w:r>
-      <w:proofErr w:type="spellStart"/>
-      <w:r>
-        <w:rPr>
-          <w:rFonts w:ascii="Arial" w:eastAsia="Courier New" w:hAnsi="Arial" w:cs="Arial"/>
-          <w:color w:val="FFFFFF"/>
-          <w:sz w:val="20"/>
-          <w:szCs w:val="20"/>
-        </w:rPr>
-        <w:t>srui</w:t>
-      </w:r>
-      <w:proofErr w:type="spellEnd"/>
-      <w:r>
-        <w:rPr>
-          <w:rFonts w:ascii="Arial" w:eastAsia="Courier New" w:hAnsi="Arial" w:cs="Arial"/>
-          <w:color w:val="FFFFFF"/>
-          <w:sz w:val="20"/>
-          <w:szCs w:val="20"/>
-        </w:rPr>
-        <w:t xml:space="preserve">-duration-normal: 0.3s;    </w:t>
-      </w:r>
-      <w:r>
-        <w:rPr>
-          <w:rFonts w:ascii="Arial" w:hAnsi="Arial" w:cs="Arial"/>
-        </w:rPr>
-        <w:br/>
-      </w:r>
-      <w:r>
-        <w:rPr>
-          <w:rFonts w:ascii="Arial" w:eastAsia="Courier New" w:hAnsi="Arial" w:cs="Arial"/>
-          <w:color w:val="FFFFFF"/>
-          <w:sz w:val="20"/>
-          <w:szCs w:val="20"/>
-        </w:rPr>
-        <w:t xml:space="preserve">      --</w:t>
-      </w:r>
-      <w:proofErr w:type="spellStart"/>
-      <w:r>
-        <w:rPr>
-          <w:rFonts w:ascii="Arial" w:eastAsia="Courier New" w:hAnsi="Arial" w:cs="Arial"/>
-          <w:color w:val="FFFFFF"/>
-          <w:sz w:val="20"/>
-          <w:szCs w:val="20"/>
-        </w:rPr>
-        <w:t>srui</w:t>
-      </w:r>
-      <w:proofErr w:type="spellEnd"/>
-      <w:r>
-        <w:rPr>
-          <w:rFonts w:ascii="Arial" w:eastAsia="Courier New" w:hAnsi="Arial" w:cs="Arial"/>
-          <w:color w:val="FFFFFF"/>
-          <w:sz w:val="20"/>
-          <w:szCs w:val="20"/>
-        </w:rPr>
-        <w:t xml:space="preserve">-easing-press: ease-out;    </w:t>
-      </w:r>
-      <w:r>
-        <w:rPr>
-          <w:rFonts w:ascii="Arial" w:hAnsi="Arial" w:cs="Arial"/>
-        </w:rPr>
-        <w:br/>
-      </w:r>
-      <w:r>
-        <w:rPr>
-          <w:rFonts w:ascii="Arial" w:eastAsia="Courier New" w:hAnsi="Arial" w:cs="Arial"/>
-          <w:color w:val="FFFFFF"/>
-          <w:sz w:val="20"/>
-          <w:szCs w:val="20"/>
-        </w:rPr>
-        <w:t xml:space="preserve">      --</w:t>
-      </w:r>
-      <w:proofErr w:type="spellStart"/>
-      <w:r>
-        <w:rPr>
-          <w:rFonts w:ascii="Arial" w:eastAsia="Courier New" w:hAnsi="Arial" w:cs="Arial"/>
-          <w:color w:val="FFFFFF"/>
-          <w:sz w:val="20"/>
-          <w:szCs w:val="20"/>
-        </w:rPr>
-        <w:t>srui</w:t>
-      </w:r>
-      <w:proofErr w:type="spellEnd"/>
-      <w:r>
-        <w:rPr>
-          <w:rFonts w:ascii="Arial" w:eastAsia="Courier New" w:hAnsi="Arial" w:cs="Arial"/>
-          <w:color w:val="FFFFFF"/>
-          <w:sz w:val="20"/>
-          <w:szCs w:val="20"/>
-        </w:rPr>
-        <w:t xml:space="preserve">-easing-smooth: ease-in-out;    </w:t>
-      </w:r>
-      <w:r>
-        <w:rPr>
-          <w:rFonts w:ascii="Arial" w:hAnsi="Arial" w:cs="Arial"/>
-        </w:rPr>
-        <w:br/>
-      </w:r>
-      <w:r>
-        <w:rPr>
-          <w:rFonts w:ascii="Arial" w:eastAsia="Courier New" w:hAnsi="Arial" w:cs="Arial"/>
-          <w:color w:val="FFFFFF"/>
-          <w:sz w:val="20"/>
-          <w:szCs w:val="20"/>
-        </w:rPr>
-        <w:t xml:space="preserve">         </w:t>
-      </w:r>
-      <w:r>
-        <w:rPr>
-          <w:rFonts w:ascii="Arial" w:hAnsi="Arial" w:cs="Arial"/>
-        </w:rPr>
-        <w:br/>
-      </w:r>
-      <w:r>
-        <w:rPr>
-          <w:rFonts w:ascii="Arial" w:eastAsia="Courier New" w:hAnsi="Arial" w:cs="Arial"/>
-          <w:color w:val="FFFFFF"/>
-          <w:sz w:val="20"/>
-          <w:szCs w:val="20"/>
-        </w:rPr>
-        <w:t xml:space="preserve">      /* ===== Z-INDEX LAYER ===== */    </w:t>
-      </w:r>
-      <w:r>
-        <w:rPr>
-          <w:rFonts w:ascii="Arial" w:hAnsi="Arial" w:cs="Arial"/>
-        </w:rPr>
-        <w:br/>
-      </w:r>
-      <w:r>
-        <w:rPr>
-          <w:rFonts w:ascii="Arial" w:eastAsia="Courier New" w:hAnsi="Arial" w:cs="Arial"/>
-          <w:color w:val="FFFFFF"/>
-          <w:sz w:val="20"/>
-          <w:szCs w:val="20"/>
-        </w:rPr>
-        <w:t xml:space="preserve">      --</w:t>
-      </w:r>
-      <w:proofErr w:type="spellStart"/>
-      <w:r>
-        <w:rPr>
-          <w:rFonts w:ascii="Arial" w:eastAsia="Courier New" w:hAnsi="Arial" w:cs="Arial"/>
-          <w:color w:val="FFFFFF"/>
-          <w:sz w:val="20"/>
-          <w:szCs w:val="20"/>
-        </w:rPr>
-        <w:t>srui</w:t>
-      </w:r>
-      <w:proofErr w:type="spellEnd"/>
-      <w:r>
-        <w:rPr>
-          <w:rFonts w:ascii="Arial" w:eastAsia="Courier New" w:hAnsi="Arial" w:cs="Arial"/>
-          <w:color w:val="FFFFFF"/>
-          <w:sz w:val="20"/>
-          <w:szCs w:val="20"/>
-        </w:rPr>
-        <w:t xml:space="preserve">-z-dropdown: 100;    </w:t>
-      </w:r>
-      <w:r>
-        <w:rPr>
-          <w:rFonts w:ascii="Arial" w:hAnsi="Arial" w:cs="Arial"/>
-        </w:rPr>
-        <w:br/>
-      </w:r>
-      <w:r>
-        <w:rPr>
-          <w:rFonts w:ascii="Arial" w:eastAsia="Courier New" w:hAnsi="Arial" w:cs="Arial"/>
-          <w:color w:val="FFFFFF"/>
-          <w:sz w:val="20"/>
-          <w:szCs w:val="20"/>
-        </w:rPr>
-        <w:t xml:space="preserve">      --</w:t>
-      </w:r>
-      <w:proofErr w:type="spellStart"/>
-      <w:r>
-        <w:rPr>
-          <w:rFonts w:ascii="Arial" w:eastAsia="Courier New" w:hAnsi="Arial" w:cs="Arial"/>
-          <w:color w:val="FFFFFF"/>
-          <w:sz w:val="20"/>
-          <w:szCs w:val="20"/>
-        </w:rPr>
-        <w:t>srui</w:t>
-      </w:r>
-      <w:proofErr w:type="spellEnd"/>
-      <w:r>
-        <w:rPr>
-          <w:rFonts w:ascii="Arial" w:eastAsia="Courier New" w:hAnsi="Arial" w:cs="Arial"/>
-          <w:color w:val="FFFFFF"/>
-          <w:sz w:val="20"/>
-          <w:szCs w:val="20"/>
-        </w:rPr>
-        <w:t xml:space="preserve">-z-sticky: 200;    </w:t>
-      </w:r>
-      <w:r>
-        <w:rPr>
-          <w:rFonts w:ascii="Arial" w:hAnsi="Arial" w:cs="Arial"/>
-        </w:rPr>
-        <w:br/>
-      </w:r>
-      <w:r>
-        <w:rPr>
-          <w:rFonts w:ascii="Arial" w:eastAsia="Courier New" w:hAnsi="Arial" w:cs="Arial"/>
-          <w:color w:val="FFFFFF"/>
-          <w:sz w:val="20"/>
-          <w:szCs w:val="20"/>
-        </w:rPr>
-        <w:t xml:space="preserve">      --</w:t>
-      </w:r>
-      <w:proofErr w:type="spellStart"/>
-      <w:r>
-        <w:rPr>
-          <w:rFonts w:ascii="Arial" w:eastAsia="Courier New" w:hAnsi="Arial" w:cs="Arial"/>
-          <w:color w:val="FFFFFF"/>
-          <w:sz w:val="20"/>
-          <w:szCs w:val="20"/>
-        </w:rPr>
-        <w:t>srui</w:t>
-      </w:r>
-      <w:proofErr w:type="spellEnd"/>
-      <w:r>
-        <w:rPr>
-          <w:rFonts w:ascii="Arial" w:eastAsia="Courier New" w:hAnsi="Arial" w:cs="Arial"/>
-          <w:color w:val="FFFFFF"/>
-          <w:sz w:val="20"/>
-          <w:szCs w:val="20"/>
-        </w:rPr>
-        <w:t xml:space="preserve">-z-modal: 300;    </w:t>
-      </w:r>
-      <w:r>
-        <w:rPr>
-          <w:rFonts w:ascii="Arial" w:hAnsi="Arial" w:cs="Arial"/>
-        </w:rPr>
-        <w:br/>
-      </w:r>
-      <w:r>
-        <w:rPr>
-          <w:rFonts w:ascii="Arial" w:eastAsia="Courier New" w:hAnsi="Arial" w:cs="Arial"/>
-          <w:color w:val="FFFFFF"/>
-          <w:sz w:val="20"/>
-          <w:szCs w:val="20"/>
-        </w:rPr>
-        <w:t xml:space="preserve">      --</w:t>
-      </w:r>
-      <w:proofErr w:type="spellStart"/>
-      <w:r>
-        <w:rPr>
-          <w:rFonts w:ascii="Arial" w:eastAsia="Courier New" w:hAnsi="Arial" w:cs="Arial"/>
-          <w:color w:val="FFFFFF"/>
-          <w:sz w:val="20"/>
-          <w:szCs w:val="20"/>
-        </w:rPr>
-        <w:t>srui</w:t>
-      </w:r>
-      <w:proofErr w:type="spellEnd"/>
-      <w:r>
-        <w:rPr>
-          <w:rFonts w:ascii="Arial" w:eastAsia="Courier New" w:hAnsi="Arial" w:cs="Arial"/>
-          <w:color w:val="FFFFFF"/>
-          <w:sz w:val="20"/>
-          <w:szCs w:val="20"/>
-        </w:rPr>
-        <w:t xml:space="preserve">-z-toast: 400;    </w:t>
-      </w:r>
-      <w:r>
-        <w:rPr>
-          <w:rFonts w:ascii="Arial" w:hAnsi="Arial" w:cs="Arial"/>
-        </w:rPr>
-        <w:br/>
-      </w:r>
-      <w:r>
-        <w:rPr>
-          <w:rFonts w:ascii="Arial" w:eastAsia="Courier New" w:hAnsi="Arial" w:cs="Arial"/>
-          <w:color w:val="FFFFFF"/>
-          <w:sz w:val="20"/>
-          <w:szCs w:val="20"/>
-        </w:rPr>
-        <w:t xml:space="preserve">         </w:t>
-      </w:r>
-      <w:r>
-        <w:rPr>
-          <w:rFonts w:ascii="Arial" w:hAnsi="Arial" w:cs="Arial"/>
-        </w:rPr>
-        <w:br/>
-      </w:r>
-      <w:r>
-        <w:rPr>
-          <w:rFonts w:ascii="Arial" w:eastAsia="Courier New" w:hAnsi="Arial" w:cs="Arial"/>
-          <w:color w:val="FFFFFF"/>
-          <w:sz w:val="20"/>
-          <w:szCs w:val="20"/>
-        </w:rPr>
-        <w:t xml:space="preserve">      /* ===== INTERAKSI SCALE ===== */    </w:t>
-      </w:r>
-      <w:r>
-        <w:rPr>
-          <w:rFonts w:ascii="Arial" w:hAnsi="Arial" w:cs="Arial"/>
-        </w:rPr>
-        <w:br/>
-      </w:r>
-      <w:r>
-        <w:rPr>
-          <w:rFonts w:ascii="Arial" w:eastAsia="Courier New" w:hAnsi="Arial" w:cs="Arial"/>
-          <w:color w:val="FFFFFF"/>
-          <w:sz w:val="20"/>
-          <w:szCs w:val="20"/>
-        </w:rPr>
-        <w:t xml:space="preserve">      --</w:t>
-      </w:r>
-      <w:proofErr w:type="spellStart"/>
-      <w:r>
-        <w:rPr>
-          <w:rFonts w:ascii="Arial" w:eastAsia="Courier New" w:hAnsi="Arial" w:cs="Arial"/>
-          <w:color w:val="FFFFFF"/>
-          <w:sz w:val="20"/>
-          <w:szCs w:val="20"/>
-        </w:rPr>
-        <w:t>srui</w:t>
-      </w:r>
-      <w:proofErr w:type="spellEnd"/>
-      <w:r>
-        <w:rPr>
-          <w:rFonts w:ascii="Arial" w:eastAsia="Courier New" w:hAnsi="Arial" w:cs="Arial"/>
-          <w:color w:val="FFFFFF"/>
-          <w:sz w:val="20"/>
-          <w:szCs w:val="20"/>
-        </w:rPr>
-        <w:t xml:space="preserve">-hover-scale: 0.96; </w:t>
-      </w:r>
-      <w:r>
-        <w:rPr>
-          <w:rFonts w:ascii="Arial" w:eastAsia="Courier New" w:hAnsi="Arial" w:cs="Arial"/>
-          <w:color w:val="FFFFFF"/>
-          <w:sz w:val="20"/>
-          <w:szCs w:val="20"/>
-        </w:rPr>
-        <w:t xml:space="preserve">   </w:t>
+        <w:t xml:space="preserve">-hover-scale: 0.96;    </w:t>
       </w:r>
       <w:r>
         <w:rPr>
@@ -6206,16 +5801,8 @@
         <w:rPr>
           <w:rFonts w:ascii="Arial" w:hAnsi="Arial" w:cs="Arial"/>
         </w:rPr>
-        <w:t xml:space="preserve">: Outfit + </w:t>
-      </w:r>
-      <w:proofErr w:type="spellStart"/>
-      <w:r>
-        <w:rPr>
-          <w:rFonts w:ascii="Arial" w:hAnsi="Arial" w:cs="Arial"/>
-        </w:rPr>
-        <w:t>Fallback</w:t>
-      </w:r>
-      <w:proofErr w:type="spellEnd"/>
+        <w:t>: Outfit + Fallback</w:t>
+      </w:r>
     </w:p>
     <w:p>
       <w:pPr>
@@ -6312,21 +5899,7 @@
         <w:rPr>
           <w:rFonts w:ascii="Arial" w:hAnsi="Arial" w:cs="Arial"/>
         </w:rPr>
-        <w:t xml:space="preserve">, modern, </w:t>
-      </w:r>
-      <w:proofErr w:type="spellStart"/>
-      <w:r>
-        <w:rPr>
-          <w:rFonts w:ascii="Arial" w:hAnsi="Arial" w:cs="Arial"/>
-        </w:rPr>
-        <w:t>dan</w:t>
-      </w:r>
-      <w:proofErr w:type="spellEnd"/>
-      <w:r>
-        <w:rPr>
-          <w:rFonts w:ascii="Arial" w:hAnsi="Arial" w:cs="Arial"/>
-        </w:rPr>
-        <w:t xml:space="preserve"> </w:t>
+        <w:t xml:space="preserve">, modern, dan </w:t>
       </w:r>
       <w:proofErr w:type="spellStart"/>
       <w:r>
@@ -6382,7 +5955,6 @@
         <w:rPr>
           <w:rFonts w:ascii="Arial" w:hAnsi="Arial" w:cs="Arial"/>
         </w:rPr>
-        <w:lastRenderedPageBreak/>
         <w:t xml:space="preserve"> </w:t>
       </w:r>
     </w:p>
@@ -6432,16 +6004,7 @@
           <w:sz w:val="20"/>
           <w:szCs w:val="20"/>
         </w:rPr>
-        <w:t xml:space="preserve">      fo</w:t>
-      </w:r>
-      <w:r>
-        <w:rPr>
-          <w:rFonts w:ascii="Arial" w:eastAsia="Courier New" w:hAnsi="Arial" w:cs="Arial"/>
-          <w:color w:val="FFFFFF"/>
-          <w:sz w:val="20"/>
-          <w:szCs w:val="20"/>
-        </w:rPr>
-        <w:t xml:space="preserve">nt-family: 'Outfit';    </w:t>
+        <w:t xml:space="preserve">      font-family: 'Outfit';    </w:t>
       </w:r>
       <w:r>
         <w:rPr>
@@ -6476,7 +6039,25 @@
           <w:sz w:val="20"/>
           <w:szCs w:val="20"/>
         </w:rPr>
-        <w:t>: url('https://cdn.jsdelivr.net/gh/Allwaysever/SuperRoundedUI/fonts/outfit-Regular.ttf') format('</w:t>
+        <w:t>: url('https://cdn.jsdelivr.net/gh/Allwaysever/SuperRoundedUI/fonts/</w:t>
+      </w:r>
+      <w:r>
+        <w:rPr>
+          <w:rFonts w:ascii="Arial" w:eastAsia="Courier New" w:hAnsi="Arial" w:cs="Arial"/>
+          <w:color w:val="FFFFFF"/>
+          <w:sz w:val="20"/>
+          <w:szCs w:val="20"/>
+        </w:rPr>
+        <w:t>O</w:t>
+      </w:r>
+      <w:r>
+        <w:rPr>
+          <w:rFonts w:ascii="Arial" w:eastAsia="Courier New" w:hAnsi="Arial" w:cs="Arial"/>
+          <w:color w:val="FFFFFF"/>
+          <w:sz w:val="20"/>
+          <w:szCs w:val="20"/>
+        </w:rPr>
+        <w:t>utfit-Regular.ttf') format('</w:t>
       </w:r>
       <w:proofErr w:type="spellStart"/>
       <w:r>
@@ -6571,16 +6152,7 @@
           <w:sz w:val="20"/>
           <w:szCs w:val="20"/>
         </w:rPr>
-        <w:t xml:space="preserve">      font-family: '</w:t>
-      </w:r>
-      <w:r>
-        <w:rPr>
-          <w:rFonts w:ascii="Arial" w:eastAsia="Courier New" w:hAnsi="Arial" w:cs="Arial"/>
-          <w:color w:val="FFFFFF"/>
-          <w:sz w:val="20"/>
-          <w:szCs w:val="20"/>
-        </w:rPr>
-        <w:t xml:space="preserve">Outfit';    </w:t>
+        <w:t xml:space="preserve">      font-family: 'Outfit';    </w:t>
       </w:r>
       <w:r>
         <w:rPr>
@@ -6615,7 +6187,25 @@
           <w:sz w:val="20"/>
           <w:szCs w:val="20"/>
         </w:rPr>
-        <w:t>: url('https://cdn.jsdelivr.net/gh/Allwaysever/SuperRoundedUI/fonts/outfit-Medium.ttf') format('</w:t>
+        <w:t>: url('https://cdn.jsdelivr.net/gh/Allwaysever/SuperRoundedUI/fonts/</w:t>
+      </w:r>
+      <w:r>
+        <w:rPr>
+          <w:rFonts w:ascii="Arial" w:eastAsia="Courier New" w:hAnsi="Arial" w:cs="Arial"/>
+          <w:color w:val="FFFFFF"/>
+          <w:sz w:val="20"/>
+          <w:szCs w:val="20"/>
+        </w:rPr>
+        <w:t>O</w:t>
+      </w:r>
+      <w:r>
+        <w:rPr>
+          <w:rFonts w:ascii="Arial" w:eastAsia="Courier New" w:hAnsi="Arial" w:cs="Arial"/>
+          <w:color w:val="FFFFFF"/>
+          <w:sz w:val="20"/>
+          <w:szCs w:val="20"/>
+        </w:rPr>
+        <w:t>utfit-Medium.ttf') format('</w:t>
       </w:r>
       <w:proofErr w:type="spellStart"/>
       <w:r>
@@ -6745,7 +6335,25 @@
           <w:sz w:val="20"/>
           <w:szCs w:val="20"/>
         </w:rPr>
-        <w:t>: url('https://cdn.jsdelivr.net/gh/Allwaysever/SuperRoundedUI/fonts/outfit-Bold.ttf') format('</w:t>
+        <w:t>: url('https://cdn.jsdelivr.net/gh/Allwaysever/SuperRoundedUI/fonts/</w:t>
+      </w:r>
+      <w:r>
+        <w:rPr>
+          <w:rFonts w:ascii="Arial" w:eastAsia="Courier New" w:hAnsi="Arial" w:cs="Arial"/>
+          <w:color w:val="FFFFFF"/>
+          <w:sz w:val="20"/>
+          <w:szCs w:val="20"/>
+        </w:rPr>
+        <w:t>O</w:t>
+      </w:r>
+      <w:r>
+        <w:rPr>
+          <w:rFonts w:ascii="Arial" w:eastAsia="Courier New" w:hAnsi="Arial" w:cs="Arial"/>
+          <w:color w:val="FFFFFF"/>
+          <w:sz w:val="20"/>
+          <w:szCs w:val="20"/>
+        </w:rPr>
+        <w:t>utfit-Bold.ttf') format('</w:t>
       </w:r>
       <w:proofErr w:type="spellStart"/>
       <w:r>
@@ -6849,166 +6457,156 @@
           <w:rFonts w:ascii="Arial" w:hAnsi="Arial" w:cs="Arial"/>
         </w:rPr>
       </w:pPr>
-      <w:proofErr w:type="spellStart"/>
       <w:r>
         <w:rPr>
           <w:rFonts w:ascii="Arial" w:hAnsi="Arial" w:cs="Arial"/>
           <w:b/>
           <w:bCs/>
         </w:rPr>
-        <w:t>Kontras</w:t>
-      </w:r>
-      <w:proofErr w:type="spellEnd"/>
+        <w:t xml:space="preserve">Kontras </w:t>
+      </w:r>
+      <w:proofErr w:type="spellStart"/>
       <w:r>
         <w:rPr>
           <w:rFonts w:ascii="Arial" w:hAnsi="Arial" w:cs="Arial"/>
           <w:b/>
           <w:bCs/>
         </w:rPr>
-        <w:t xml:space="preserve"> </w:t>
-      </w:r>
-      <w:proofErr w:type="spellStart"/>
+        <w:t>wajib</w:t>
+      </w:r>
+      <w:proofErr w:type="spellEnd"/>
       <w:r>
         <w:rPr>
           <w:rFonts w:ascii="Arial" w:hAnsi="Arial" w:cs="Arial"/>
           <w:b/>
           <w:bCs/>
         </w:rPr>
-        <w:t>wajib</w:t>
-      </w:r>
-      <w:proofErr w:type="spellEnd"/>
+        <w:t>:</w:t>
+      </w:r>
+      <w:r>
+        <w:rPr>
+          <w:rFonts w:ascii="Arial" w:hAnsi="Arial" w:cs="Arial"/>
+        </w:rPr>
+        <w:t xml:space="preserve"> </w:t>
+      </w:r>
+      <w:proofErr w:type="spellStart"/>
+      <w:r>
+        <w:rPr>
+          <w:rFonts w:ascii="Arial" w:hAnsi="Arial" w:cs="Arial"/>
+        </w:rPr>
+        <w:t>Semua</w:t>
+      </w:r>
+      <w:proofErr w:type="spellEnd"/>
+      <w:r>
+        <w:rPr>
+          <w:rFonts w:ascii="Arial" w:hAnsi="Arial" w:cs="Arial"/>
+        </w:rPr>
+        <w:t xml:space="preserve"> </w:t>
+      </w:r>
+      <w:proofErr w:type="spellStart"/>
+      <w:r>
+        <w:rPr>
+          <w:rFonts w:ascii="Arial" w:hAnsi="Arial" w:cs="Arial"/>
+        </w:rPr>
+        <w:t>teks</w:t>
+      </w:r>
+      <w:proofErr w:type="spellEnd"/>
+      <w:r>
+        <w:rPr>
+          <w:rFonts w:ascii="Arial" w:hAnsi="Arial" w:cs="Arial"/>
+        </w:rPr>
+        <w:t xml:space="preserve"> di </w:t>
+      </w:r>
+      <w:proofErr w:type="spellStart"/>
+      <w:r>
+        <w:rPr>
+          <w:rFonts w:ascii="Arial" w:hAnsi="Arial" w:cs="Arial"/>
+        </w:rPr>
+        <w:t>atas</w:t>
+      </w:r>
+      <w:proofErr w:type="spellEnd"/>
+      <w:r>
+        <w:rPr>
+          <w:rFonts w:ascii="Arial" w:hAnsi="Arial" w:cs="Arial"/>
+        </w:rPr>
+        <w:t xml:space="preserve"> </w:t>
+      </w:r>
+      <w:proofErr w:type="spellStart"/>
+      <w:r>
+        <w:rPr>
+          <w:rFonts w:ascii="Arial" w:hAnsi="Arial" w:cs="Arial"/>
+        </w:rPr>
+        <w:t>latar</w:t>
+      </w:r>
+      <w:proofErr w:type="spellEnd"/>
+      <w:r>
+        <w:rPr>
+          <w:rFonts w:ascii="Arial" w:hAnsi="Arial" w:cs="Arial"/>
+        </w:rPr>
+        <w:t xml:space="preserve"> </w:t>
+      </w:r>
+      <w:proofErr w:type="spellStart"/>
+      <w:r>
+        <w:rPr>
+          <w:rFonts w:ascii="Arial" w:hAnsi="Arial" w:cs="Arial"/>
+        </w:rPr>
+        <w:t>gelap</w:t>
+      </w:r>
+      <w:proofErr w:type="spellEnd"/>
+      <w:r>
+        <w:rPr>
+          <w:rFonts w:ascii="Arial" w:hAnsi="Arial" w:cs="Arial"/>
+        </w:rPr>
+        <w:t xml:space="preserve"> </w:t>
+      </w:r>
+      <w:proofErr w:type="spellStart"/>
+      <w:r>
+        <w:rPr>
+          <w:rFonts w:ascii="Arial" w:hAnsi="Arial" w:cs="Arial"/>
+        </w:rPr>
+        <w:t>harus</w:t>
+      </w:r>
+      <w:proofErr w:type="spellEnd"/>
+      <w:r>
+        <w:rPr>
+          <w:rFonts w:ascii="Arial" w:hAnsi="Arial" w:cs="Arial"/>
+        </w:rPr>
+        <w:t xml:space="preserve"> </w:t>
+      </w:r>
+      <w:proofErr w:type="spellStart"/>
+      <w:r>
+        <w:rPr>
+          <w:rFonts w:ascii="Arial" w:hAnsi="Arial" w:cs="Arial"/>
+        </w:rPr>
+        <w:t>mencapai</w:t>
+      </w:r>
+      <w:proofErr w:type="spellEnd"/>
+      <w:r>
+        <w:rPr>
+          <w:rFonts w:ascii="Arial" w:hAnsi="Arial" w:cs="Arial"/>
+        </w:rPr>
+        <w:t xml:space="preserve"> minimal </w:t>
+      </w:r>
+      <w:proofErr w:type="spellStart"/>
+      <w:r>
+        <w:rPr>
+          <w:rFonts w:ascii="Arial" w:hAnsi="Arial" w:cs="Arial"/>
+        </w:rPr>
+        <w:t>rasio</w:t>
+      </w:r>
+      <w:proofErr w:type="spellEnd"/>
+      <w:r>
+        <w:rPr>
+          <w:rFonts w:ascii="Arial" w:hAnsi="Arial" w:cs="Arial"/>
+        </w:rPr>
+        <w:t xml:space="preserve"> </w:t>
+      </w:r>
       <w:r>
         <w:rPr>
           <w:rFonts w:ascii="Arial" w:hAnsi="Arial" w:cs="Arial"/>
           <w:b/>
           <w:bCs/>
         </w:rPr>
-        <w:t>:</w:t>
-      </w:r>
-      <w:r>
-        <w:rPr>
-          <w:rFonts w:ascii="Arial" w:hAnsi="Arial" w:cs="Arial"/>
-        </w:rPr>
-        <w:t xml:space="preserve"> </w:t>
-      </w:r>
-      <w:proofErr w:type="spellStart"/>
-      <w:r>
-        <w:rPr>
-          <w:rFonts w:ascii="Arial" w:hAnsi="Arial" w:cs="Arial"/>
-        </w:rPr>
-        <w:t>Semua</w:t>
-      </w:r>
-      <w:proofErr w:type="spellEnd"/>
-      <w:r>
-        <w:rPr>
-          <w:rFonts w:ascii="Arial" w:hAnsi="Arial" w:cs="Arial"/>
-        </w:rPr>
-        <w:t xml:space="preserve"> </w:t>
-      </w:r>
-      <w:proofErr w:type="spellStart"/>
-      <w:r>
-        <w:rPr>
-          <w:rFonts w:ascii="Arial" w:hAnsi="Arial" w:cs="Arial"/>
-        </w:rPr>
-        <w:t>teks</w:t>
-      </w:r>
-      <w:proofErr w:type="spellEnd"/>
-      <w:r>
-        <w:rPr>
-          <w:rFonts w:ascii="Arial" w:hAnsi="Arial" w:cs="Arial"/>
-        </w:rPr>
-        <w:t xml:space="preserve"> di </w:t>
-      </w:r>
-      <w:proofErr w:type="spellStart"/>
-      <w:r>
-        <w:rPr>
-          <w:rFonts w:ascii="Arial" w:hAnsi="Arial" w:cs="Arial"/>
-        </w:rPr>
-        <w:t>atas</w:t>
-      </w:r>
-      <w:proofErr w:type="spellEnd"/>
-      <w:r>
-        <w:rPr>
-          <w:rFonts w:ascii="Arial" w:hAnsi="Arial" w:cs="Arial"/>
-        </w:rPr>
-        <w:t xml:space="preserve"> </w:t>
-      </w:r>
-      <w:proofErr w:type="spellStart"/>
-      <w:r>
-        <w:rPr>
-          <w:rFonts w:ascii="Arial" w:hAnsi="Arial" w:cs="Arial"/>
-        </w:rPr>
-        <w:t>latar</w:t>
-      </w:r>
-      <w:proofErr w:type="spellEnd"/>
-      <w:r>
-        <w:rPr>
-          <w:rFonts w:ascii="Arial" w:hAnsi="Arial" w:cs="Arial"/>
-        </w:rPr>
-        <w:t xml:space="preserve"> </w:t>
-      </w:r>
-      <w:proofErr w:type="spellStart"/>
-      <w:r>
-        <w:rPr>
-          <w:rFonts w:ascii="Arial" w:hAnsi="Arial" w:cs="Arial"/>
-        </w:rPr>
-        <w:t>gelap</w:t>
-      </w:r>
-      <w:proofErr w:type="spellEnd"/>
-      <w:r>
-        <w:rPr>
-          <w:rFonts w:ascii="Arial" w:hAnsi="Arial" w:cs="Arial"/>
-        </w:rPr>
-        <w:t xml:space="preserve"> </w:t>
-      </w:r>
-      <w:proofErr w:type="spellStart"/>
-      <w:r>
-        <w:rPr>
-          <w:rFonts w:ascii="Arial" w:hAnsi="Arial" w:cs="Arial"/>
-        </w:rPr>
-        <w:t>harus</w:t>
-      </w:r>
-      <w:proofErr w:type="spellEnd"/>
-      <w:r>
-        <w:rPr>
-          <w:rFonts w:ascii="Arial" w:hAnsi="Arial" w:cs="Arial"/>
-        </w:rPr>
-        <w:t xml:space="preserve"> </w:t>
-      </w:r>
-      <w:proofErr w:type="spellStart"/>
-      <w:r>
-        <w:rPr>
-          <w:rFonts w:ascii="Arial" w:hAnsi="Arial" w:cs="Arial"/>
-        </w:rPr>
-        <w:t>mencapai</w:t>
-      </w:r>
-      <w:proofErr w:type="spellEnd"/>
-      <w:r>
-        <w:rPr>
-          <w:rFonts w:ascii="Arial" w:hAnsi="Arial" w:cs="Arial"/>
-        </w:rPr>
-        <w:t xml:space="preserve"> minimal </w:t>
-      </w:r>
-      <w:proofErr w:type="spellStart"/>
-      <w:r>
-        <w:rPr>
-          <w:rFonts w:ascii="Arial" w:hAnsi="Arial" w:cs="Arial"/>
-        </w:rPr>
-        <w:t>rasio</w:t>
-      </w:r>
-      <w:proofErr w:type="spellEnd"/>
-      <w:r>
-        <w:rPr>
-          <w:rFonts w:ascii="Arial" w:hAnsi="Arial" w:cs="Arial"/>
-        </w:rPr>
-        <w:t xml:space="preserve"> </w:t>
-      </w:r>
-      <w:r>
-        <w:rPr>
-          <w:rFonts w:ascii="Arial" w:hAnsi="Arial" w:cs="Arial"/>
-          <w:b/>
-          <w:bCs/>
-        </w:rPr>
         <w:t>AAA</w:t>
       </w:r>
       <w:r>
@@ -7072,35 +6670,7 @@
         <w:rPr>
           <w:rFonts w:ascii="Arial" w:hAnsi="Arial" w:cs="Arial"/>
         </w:rPr>
-        <w:t xml:space="preserve"> </w:t>
-      </w:r>
-      <w:proofErr w:type="spellStart"/>
-      <w:r>
-        <w:rPr>
-          <w:rFonts w:ascii="Arial" w:hAnsi="Arial" w:cs="Arial"/>
-        </w:rPr>
-        <w:t>badan</w:t>
-      </w:r>
-      <w:proofErr w:type="spellEnd"/>
-      <w:r>
-        <w:rPr>
-          <w:rFonts w:ascii="Arial" w:hAnsi="Arial" w:cs="Arial"/>
-        </w:rPr>
-        <w:t xml:space="preserve"> </w:t>
-      </w:r>
-      <w:proofErr w:type="spellStart"/>
-      <w:r>
-        <w:rPr>
-          <w:rFonts w:ascii="Arial" w:hAnsi="Arial" w:cs="Arial"/>
-        </w:rPr>
-        <w:t>dan</w:t>
-      </w:r>
-      <w:proofErr w:type="spellEnd"/>
-      <w:r>
-        <w:rPr>
-          <w:rFonts w:ascii="Arial" w:hAnsi="Arial" w:cs="Arial"/>
-        </w:rPr>
-        <w:t xml:space="preserve"> </w:t>
+        <w:t xml:space="preserve"> badan dan </w:t>
       </w:r>
       <w:r>
         <w:rPr>
@@ -7270,21 +6840,7 @@
         <w:rPr>
           <w:rFonts w:ascii="Arial" w:hAnsi="Arial" w:cs="Arial"/>
         </w:rPr>
-        <w:t xml:space="preserve"> </w:t>
-      </w:r>
-      <w:proofErr w:type="spellStart"/>
-      <w:r>
-        <w:rPr>
-          <w:rFonts w:ascii="Arial" w:hAnsi="Arial" w:cs="Arial"/>
-        </w:rPr>
-        <w:t>Warna</w:t>
-      </w:r>
-      <w:proofErr w:type="spellEnd"/>
-      <w:r>
-        <w:rPr>
-          <w:rFonts w:ascii="Arial" w:hAnsi="Arial" w:cs="Arial"/>
-        </w:rPr>
-        <w:t xml:space="preserve"> </w:t>
+        <w:t xml:space="preserve"> Warna </w:t>
       </w:r>
       <w:proofErr w:type="spellStart"/>
       <w:r>
@@ -7298,16 +6854,8 @@
         <w:rPr>
           <w:rFonts w:ascii="Arial" w:hAnsi="Arial" w:cs="Arial"/>
         </w:rPr>
-        <w:t xml:space="preserve"> </w:t>
-      </w:r>
-      <w:proofErr w:type="spellStart"/>
-      <w:r>
-        <w:rPr>
-          <w:rFonts w:ascii="Arial" w:hAnsi="Arial" w:cs="Arial"/>
-        </w:rPr>
-        <w:t>Gelap</w:t>
-      </w:r>
-      <w:proofErr w:type="spellEnd"/>
+        <w:t xml:space="preserve"> Gelap</w:t>
+      </w:r>
     </w:p>
     <w:p>
       <w:pPr>
@@ -7316,19 +6864,11 @@
           <w:rFonts w:ascii="Arial" w:hAnsi="Arial" w:cs="Arial"/>
         </w:rPr>
       </w:pPr>
-      <w:proofErr w:type="spellStart"/>
-      <w:r>
-        <w:rPr>
-          <w:rFonts w:ascii="Arial" w:hAnsi="Arial" w:cs="Arial"/>
-        </w:rPr>
-        <w:t>Tidak</w:t>
-      </w:r>
-      <w:proofErr w:type="spellEnd"/>
-      <w:r>
-        <w:rPr>
-          <w:rFonts w:ascii="Arial" w:hAnsi="Arial" w:cs="Arial"/>
-        </w:rPr>
-        <w:t xml:space="preserve"> </w:t>
+      <w:r>
+        <w:rPr>
+          <w:rFonts w:ascii="Arial" w:hAnsi="Arial" w:cs="Arial"/>
+        </w:rPr>
+        <w:t xml:space="preserve">Tidak </w:t>
       </w:r>
       <w:proofErr w:type="spellStart"/>
       <w:r>
@@ -7516,7 +7056,6 @@
                 <w:b/>
                 <w:bCs/>
               </w:rPr>
-              <w:lastRenderedPageBreak/>
               <w:t>Nama</w:t>
             </w:r>
           </w:p>
@@ -7701,19 +7240,11 @@
                 <w:rFonts w:ascii="Arial" w:hAnsi="Arial" w:cs="Arial"/>
               </w:rPr>
             </w:pPr>
-            <w:proofErr w:type="spellStart"/>
             <w:r>
               <w:rPr>
                 <w:rFonts w:ascii="Arial" w:hAnsi="Arial" w:cs="Arial"/>
               </w:rPr>
-              <w:t>Kanvas</w:t>
-            </w:r>
-            <w:proofErr w:type="spellEnd"/>
-            <w:r>
-              <w:rPr>
-                <w:rFonts w:ascii="Arial" w:hAnsi="Arial" w:cs="Arial"/>
-              </w:rPr>
-              <w:t xml:space="preserve"> </w:t>
+              <w:t xml:space="preserve">Kanvas </w:t>
             </w:r>
             <w:proofErr w:type="spellStart"/>
             <w:r>
@@ -7855,19 +7386,11 @@
                 <w:rFonts w:ascii="Arial" w:hAnsi="Arial" w:cs="Arial"/>
               </w:rPr>
             </w:pPr>
-            <w:proofErr w:type="spellStart"/>
             <w:r>
               <w:rPr>
                 <w:rFonts w:ascii="Arial" w:hAnsi="Arial" w:cs="Arial"/>
               </w:rPr>
-              <w:t>Teks</w:t>
-            </w:r>
-            <w:proofErr w:type="spellEnd"/>
-            <w:r>
-              <w:rPr>
-                <w:rFonts w:ascii="Arial" w:hAnsi="Arial" w:cs="Arial"/>
-              </w:rPr>
-              <w:t xml:space="preserve"> </w:t>
+              <w:t xml:space="preserve">Teks </w:t>
             </w:r>
             <w:proofErr w:type="spellStart"/>
             <w:r>
@@ -7933,19 +7456,11 @@
                 <w:rFonts w:ascii="Arial" w:hAnsi="Arial" w:cs="Arial"/>
               </w:rPr>
             </w:pPr>
-            <w:proofErr w:type="spellStart"/>
             <w:r>
               <w:rPr>
                 <w:rFonts w:ascii="Arial" w:hAnsi="Arial" w:cs="Arial"/>
               </w:rPr>
-              <w:t>Teks</w:t>
-            </w:r>
-            <w:proofErr w:type="spellEnd"/>
-            <w:r>
-              <w:rPr>
-                <w:rFonts w:ascii="Arial" w:hAnsi="Arial" w:cs="Arial"/>
-              </w:rPr>
-              <w:t xml:space="preserve"> di </w:t>
+              <w:t xml:space="preserve">Teks di </w:t>
             </w:r>
             <w:proofErr w:type="spellStart"/>
             <w:r>
@@ -8025,19 +7540,11 @@
                 <w:rFonts w:ascii="Arial" w:hAnsi="Arial" w:cs="Arial"/>
               </w:rPr>
             </w:pPr>
-            <w:proofErr w:type="spellStart"/>
             <w:r>
               <w:rPr>
                 <w:rFonts w:ascii="Arial" w:hAnsi="Arial" w:cs="Arial"/>
               </w:rPr>
-              <w:t>Garis</w:t>
-            </w:r>
-            <w:proofErr w:type="spellEnd"/>
-            <w:r>
-              <w:rPr>
-                <w:rFonts w:ascii="Arial" w:hAnsi="Arial" w:cs="Arial"/>
-              </w:rPr>
-              <w:t xml:space="preserve"> input, </w:t>
+              <w:t xml:space="preserve">Garis input, </w:t>
             </w:r>
             <w:proofErr w:type="spellStart"/>
             <w:r>
@@ -8193,19 +7700,11 @@
                 <w:rFonts w:ascii="Arial" w:hAnsi="Arial" w:cs="Arial"/>
               </w:rPr>
             </w:pPr>
-            <w:proofErr w:type="spellStart"/>
             <w:r>
               <w:rPr>
                 <w:rFonts w:ascii="Arial" w:hAnsi="Arial" w:cs="Arial"/>
               </w:rPr>
-              <w:t>Ikon</w:t>
-            </w:r>
-            <w:proofErr w:type="spellEnd"/>
-            <w:r>
-              <w:rPr>
-                <w:rFonts w:ascii="Arial" w:hAnsi="Arial" w:cs="Arial"/>
-              </w:rPr>
-              <w:t xml:space="preserve"> </w:t>
+              <w:t xml:space="preserve">Ikon </w:t>
             </w:r>
             <w:proofErr w:type="spellStart"/>
             <w:r>
@@ -8287,21 +7786,7 @@
         <w:rPr>
           <w:rFonts w:ascii="Arial" w:hAnsi="Arial" w:cs="Arial"/>
         </w:rPr>
-        <w:t xml:space="preserve"> </w:t>
-      </w:r>
-      <w:proofErr w:type="spellStart"/>
-      <w:r>
-        <w:rPr>
-          <w:rFonts w:ascii="Arial" w:hAnsi="Arial" w:cs="Arial"/>
-        </w:rPr>
-        <w:t>Dasar</w:t>
-      </w:r>
-      <w:proofErr w:type="spellEnd"/>
-      <w:r>
-        <w:rPr>
-          <w:rFonts w:ascii="Arial" w:hAnsi="Arial" w:cs="Arial"/>
-        </w:rPr>
-        <w:t xml:space="preserve"> (Pure CSS)</w:t>
+        <w:t xml:space="preserve"> Dasar (Pure CSS)</w:t>
       </w:r>
     </w:p>
     <w:p>
@@ -8568,21 +8053,7 @@
         <w:rPr>
           <w:rFonts w:ascii="Arial" w:hAnsi="Arial" w:cs="Arial"/>
         </w:rPr>
-        <w:t xml:space="preserve">6.1. </w:t>
-      </w:r>
-      <w:proofErr w:type="spellStart"/>
-      <w:r>
-        <w:rPr>
-          <w:rFonts w:ascii="Arial" w:hAnsi="Arial" w:cs="Arial"/>
-        </w:rPr>
-        <w:t>Kartu</w:t>
-      </w:r>
-      <w:proofErr w:type="spellEnd"/>
-      <w:r>
-        <w:rPr>
-          <w:rFonts w:ascii="Arial" w:hAnsi="Arial" w:cs="Arial"/>
-        </w:rPr>
-        <w:t xml:space="preserve"> &amp; </w:t>
+        <w:t xml:space="preserve">6.1. Kartu &amp; </w:t>
       </w:r>
       <w:proofErr w:type="spellStart"/>
       <w:r>
@@ -8679,27 +8150,7 @@
           <w:sz w:val="20"/>
           <w:szCs w:val="20"/>
         </w:rPr>
-        <w:t xml:space="preserve">: </w:t>
-      </w:r>
-      <w:proofErr w:type="spellStart"/>
-      <w:r>
-        <w:rPr>
-          <w:rFonts w:ascii="Arial" w:eastAsia="Courier New" w:hAnsi="Arial" w:cs="Arial"/>
-          <w:color w:val="FFFFFF"/>
-          <w:sz w:val="20"/>
-          <w:szCs w:val="20"/>
-        </w:rPr>
-        <w:t>var</w:t>
-      </w:r>
-      <w:proofErr w:type="spellEnd"/>
-      <w:r>
-        <w:rPr>
-          <w:rFonts w:ascii="Arial" w:eastAsia="Courier New" w:hAnsi="Arial" w:cs="Arial"/>
-          <w:color w:val="FFFFFF"/>
-          <w:sz w:val="20"/>
-          <w:szCs w:val="20"/>
-        </w:rPr>
-        <w:t>(--</w:t>
+        <w:t>: var(--</w:t>
       </w:r>
       <w:proofErr w:type="spellStart"/>
       <w:r>
@@ -8734,27 +8185,7 @@
           <w:sz w:val="20"/>
           <w:szCs w:val="20"/>
         </w:rPr>
-        <w:t xml:space="preserve">      border-radius: </w:t>
-      </w:r>
-      <w:proofErr w:type="spellStart"/>
-      <w:r>
-        <w:rPr>
-          <w:rFonts w:ascii="Arial" w:eastAsia="Courier New" w:hAnsi="Arial" w:cs="Arial"/>
-          <w:color w:val="FFFFFF"/>
-          <w:sz w:val="20"/>
-          <w:szCs w:val="20"/>
-        </w:rPr>
-        <w:t>var</w:t>
-      </w:r>
-      <w:proofErr w:type="spellEnd"/>
-      <w:r>
-        <w:rPr>
-          <w:rFonts w:ascii="Arial" w:eastAsia="Courier New" w:hAnsi="Arial" w:cs="Arial"/>
-          <w:color w:val="FFFFFF"/>
-          <w:sz w:val="20"/>
-          <w:szCs w:val="20"/>
-        </w:rPr>
-        <w:t>(--</w:t>
+        <w:t xml:space="preserve">      border-radius: var(--</w:t>
       </w:r>
       <w:proofErr w:type="spellStart"/>
       <w:r>
@@ -8804,27 +8235,7 @@
           <w:sz w:val="20"/>
           <w:szCs w:val="20"/>
         </w:rPr>
-        <w:t xml:space="preserve">      box-shadow: </w:t>
-      </w:r>
-      <w:proofErr w:type="spellStart"/>
-      <w:r>
-        <w:rPr>
-          <w:rFonts w:ascii="Arial" w:eastAsia="Courier New" w:hAnsi="Arial" w:cs="Arial"/>
-          <w:color w:val="FFFFFF"/>
-          <w:sz w:val="20"/>
-          <w:szCs w:val="20"/>
-        </w:rPr>
-        <w:t>var</w:t>
-      </w:r>
-      <w:proofErr w:type="spellEnd"/>
-      <w:r>
-        <w:rPr>
-          <w:rFonts w:ascii="Arial" w:eastAsia="Courier New" w:hAnsi="Arial" w:cs="Arial"/>
-          <w:color w:val="FFFFFF"/>
-          <w:sz w:val="20"/>
-          <w:szCs w:val="20"/>
-        </w:rPr>
-        <w:t>(--</w:t>
+        <w:t xml:space="preserve">      box-shadow: var(--</w:t>
       </w:r>
       <w:proofErr w:type="spellStart"/>
       <w:r>
@@ -8964,7 +8375,6 @@
           <w:sz w:val="20"/>
           <w:szCs w:val="20"/>
         </w:rPr>
-        <w:lastRenderedPageBreak/>
         <w:t xml:space="preserve">         </w:t>
       </w:r>
       <w:r>
@@ -9085,46 +8495,17 @@
           <w:sz w:val="20"/>
           <w:szCs w:val="20"/>
         </w:rPr>
-        <w:t xml:space="preserve">      border-radius: </w:t>
-      </w:r>
-      <w:proofErr w:type="spellStart"/>
-      <w:r>
-        <w:rPr>
-          <w:rFonts w:ascii="Arial" w:eastAsia="Courier New" w:hAnsi="Arial" w:cs="Arial"/>
-          <w:color w:val="FFFFFF"/>
-          <w:sz w:val="20"/>
-          <w:szCs w:val="20"/>
-        </w:rPr>
-        <w:t>var</w:t>
-      </w:r>
-      <w:proofErr w:type="spellEnd"/>
-      <w:r>
-        <w:rPr>
-          <w:rFonts w:ascii="Arial" w:eastAsia="Courier New" w:hAnsi="Arial" w:cs="Arial"/>
-          <w:color w:val="FFFFFF"/>
-          <w:sz w:val="20"/>
-          <w:szCs w:val="20"/>
-        </w:rPr>
-        <w:t>(--</w:t>
-      </w:r>
-      <w:proofErr w:type="spellStart"/>
-      <w:r>
-        <w:rPr>
-          <w:rFonts w:ascii="Arial" w:eastAsia="Courier New" w:hAnsi="Arial" w:cs="Arial"/>
-          <w:color w:val="FFFFFF"/>
-          <w:sz w:val="20"/>
-          <w:szCs w:val="20"/>
-        </w:rPr>
-        <w:t>s</w:t>
-      </w:r>
-      <w:r>
-        <w:rPr>
-          <w:rFonts w:ascii="Arial" w:eastAsia="Courier New" w:hAnsi="Arial" w:cs="Arial"/>
-          <w:color w:val="FFFFFF"/>
-          <w:sz w:val="20"/>
-          <w:szCs w:val="20"/>
-        </w:rPr>
-        <w:t>rui</w:t>
+        <w:t xml:space="preserve">      border-radius: var(--</w:t>
+      </w:r>
+      <w:proofErr w:type="spellStart"/>
+      <w:r>
+        <w:rPr>
+          <w:rFonts w:ascii="Arial" w:eastAsia="Courier New" w:hAnsi="Arial" w:cs="Arial"/>
+          <w:color w:val="FFFFFF"/>
+          <w:sz w:val="20"/>
+          <w:szCs w:val="20"/>
+        </w:rPr>
+        <w:t>srui</w:t>
       </w:r>
       <w:proofErr w:type="spellEnd"/>
       <w:r>
@@ -9169,27 +8550,7 @@
           <w:sz w:val="20"/>
           <w:szCs w:val="20"/>
         </w:rPr>
-        <w:t xml:space="preserve">      box-shadow: </w:t>
-      </w:r>
-      <w:proofErr w:type="spellStart"/>
-      <w:r>
-        <w:rPr>
-          <w:rFonts w:ascii="Arial" w:eastAsia="Courier New" w:hAnsi="Arial" w:cs="Arial"/>
-          <w:color w:val="FFFFFF"/>
-          <w:sz w:val="20"/>
-          <w:szCs w:val="20"/>
-        </w:rPr>
-        <w:t>var</w:t>
-      </w:r>
-      <w:proofErr w:type="spellEnd"/>
-      <w:r>
-        <w:rPr>
-          <w:rFonts w:ascii="Arial" w:eastAsia="Courier New" w:hAnsi="Arial" w:cs="Arial"/>
-          <w:color w:val="FFFFFF"/>
-          <w:sz w:val="20"/>
-          <w:szCs w:val="20"/>
-        </w:rPr>
-        <w:t>(--</w:t>
+        <w:t xml:space="preserve">      box-shadow: var(--</w:t>
       </w:r>
       <w:proofErr w:type="spellStart"/>
       <w:r>
@@ -9387,82 +8748,22 @@
           <w:sz w:val="20"/>
           <w:szCs w:val="20"/>
         </w:rPr>
-        <w:t xml:space="preserve">      padding: </w:t>
-      </w:r>
-      <w:proofErr w:type="spellStart"/>
-      <w:r>
-        <w:rPr>
-          <w:rFonts w:ascii="Arial" w:eastAsia="Courier New" w:hAnsi="Arial" w:cs="Arial"/>
-          <w:color w:val="FFFFFF"/>
-          <w:sz w:val="20"/>
-          <w:szCs w:val="20"/>
-        </w:rPr>
-        <w:t>var</w:t>
-      </w:r>
-      <w:proofErr w:type="spellEnd"/>
-      <w:r>
-        <w:rPr>
-          <w:rFonts w:ascii="Arial" w:eastAsia="Courier New" w:hAnsi="Arial" w:cs="Arial"/>
-          <w:color w:val="FFFFFF"/>
-          <w:sz w:val="20"/>
-          <w:szCs w:val="20"/>
-        </w:rPr>
-        <w:t xml:space="preserve">(--srui-space-1) </w:t>
-      </w:r>
-      <w:proofErr w:type="spellStart"/>
-      <w:r>
-        <w:rPr>
-          <w:rFonts w:ascii="Arial" w:eastAsia="Courier New" w:hAnsi="Arial" w:cs="Arial"/>
-          <w:color w:val="FFFFFF"/>
-          <w:sz w:val="20"/>
-          <w:szCs w:val="20"/>
-        </w:rPr>
-        <w:t>var</w:t>
-      </w:r>
-      <w:proofErr w:type="spellEnd"/>
-      <w:r>
-        <w:rPr>
-          <w:rFonts w:ascii="Arial" w:eastAsia="Courier New" w:hAnsi="Arial" w:cs="Arial"/>
-          <w:color w:val="FFFFFF"/>
-          <w:sz w:val="20"/>
-          <w:szCs w:val="20"/>
-        </w:rPr>
-        <w:t xml:space="preserve">(--srui-space-3);    </w:t>
-      </w:r>
-      <w:r>
-        <w:rPr>
-          <w:rFonts w:ascii="Arial" w:hAnsi="Arial" w:cs="Arial"/>
-        </w:rPr>
-        <w:br/>
-      </w:r>
-      <w:r>
-        <w:rPr>
-          <w:rFonts w:ascii="Arial" w:eastAsia="Courier New" w:hAnsi="Arial" w:cs="Arial"/>
-          <w:color w:val="FFFFFF"/>
-          <w:sz w:val="20"/>
-          <w:szCs w:val="20"/>
-        </w:rPr>
-        <w:t xml:space="preserve">      border-radius: </w:t>
-      </w:r>
-      <w:proofErr w:type="spellStart"/>
-      <w:r>
-        <w:rPr>
-          <w:rFonts w:ascii="Arial" w:eastAsia="Courier New" w:hAnsi="Arial" w:cs="Arial"/>
-          <w:color w:val="FFFFFF"/>
-          <w:sz w:val="20"/>
-          <w:szCs w:val="20"/>
-        </w:rPr>
-        <w:t>var</w:t>
-      </w:r>
-      <w:proofErr w:type="spellEnd"/>
-      <w:r>
-        <w:rPr>
-          <w:rFonts w:ascii="Arial" w:eastAsia="Courier New" w:hAnsi="Arial" w:cs="Arial"/>
-          <w:color w:val="FFFFFF"/>
-          <w:sz w:val="20"/>
-          <w:szCs w:val="20"/>
-        </w:rPr>
-        <w:t>(--</w:t>
+        <w:t xml:space="preserve">      padding: var(--srui-space-1) var(--srui-space-3);    </w:t>
+      </w:r>
+      <w:r>
+        <w:rPr>
+          <w:rFonts w:ascii="Arial" w:hAnsi="Arial" w:cs="Arial"/>
+        </w:rPr>
+        <w:br/>
+      </w:r>
+      <w:r>
+        <w:rPr>
+          <w:rFonts w:ascii="Arial" w:eastAsia="Courier New" w:hAnsi="Arial" w:cs="Arial"/>
+          <w:color w:val="FFFFFF"/>
+          <w:sz w:val="20"/>
+          <w:szCs w:val="20"/>
+        </w:rPr>
+        <w:t xml:space="preserve">      border-radius: var(--</w:t>
       </w:r>
       <w:proofErr w:type="spellStart"/>
       <w:r>
@@ -9517,27 +8818,7 @@
           <w:sz w:val="20"/>
           <w:szCs w:val="20"/>
         </w:rPr>
-        <w:t xml:space="preserve">: </w:t>
-      </w:r>
-      <w:proofErr w:type="spellStart"/>
-      <w:r>
-        <w:rPr>
-          <w:rFonts w:ascii="Arial" w:eastAsia="Courier New" w:hAnsi="Arial" w:cs="Arial"/>
-          <w:color w:val="FFFFFF"/>
-          <w:sz w:val="20"/>
-          <w:szCs w:val="20"/>
-        </w:rPr>
-        <w:t>var</w:t>
-      </w:r>
-      <w:proofErr w:type="spellEnd"/>
-      <w:r>
-        <w:rPr>
-          <w:rFonts w:ascii="Arial" w:eastAsia="Courier New" w:hAnsi="Arial" w:cs="Arial"/>
-          <w:color w:val="FFFFFF"/>
-          <w:sz w:val="20"/>
-          <w:szCs w:val="20"/>
-        </w:rPr>
-        <w:t>(--</w:t>
+        <w:t>: var(--</w:t>
       </w:r>
       <w:proofErr w:type="spellStart"/>
       <w:r>
@@ -9592,27 +8873,7 @@
           <w:sz w:val="20"/>
           <w:szCs w:val="20"/>
         </w:rPr>
-        <w:t xml:space="preserve">: </w:t>
-      </w:r>
-      <w:proofErr w:type="spellStart"/>
-      <w:r>
-        <w:rPr>
-          <w:rFonts w:ascii="Arial" w:eastAsia="Courier New" w:hAnsi="Arial" w:cs="Arial"/>
-          <w:color w:val="FFFFFF"/>
-          <w:sz w:val="20"/>
-          <w:szCs w:val="20"/>
-        </w:rPr>
-        <w:t>var</w:t>
-      </w:r>
-      <w:proofErr w:type="spellEnd"/>
-      <w:r>
-        <w:rPr>
-          <w:rFonts w:ascii="Arial" w:eastAsia="Courier New" w:hAnsi="Arial" w:cs="Arial"/>
-          <w:color w:val="FFFFFF"/>
-          <w:sz w:val="20"/>
-          <w:szCs w:val="20"/>
-        </w:rPr>
-        <w:t>(--</w:t>
+        <w:t>: var(--</w:t>
       </w:r>
       <w:proofErr w:type="spellStart"/>
       <w:r>
@@ -9647,27 +8908,7 @@
           <w:sz w:val="20"/>
           <w:szCs w:val="20"/>
         </w:rPr>
-        <w:t xml:space="preserve">      font-weight: </w:t>
-      </w:r>
-      <w:proofErr w:type="spellStart"/>
-      <w:r>
-        <w:rPr>
-          <w:rFonts w:ascii="Arial" w:eastAsia="Courier New" w:hAnsi="Arial" w:cs="Arial"/>
-          <w:color w:val="FFFFFF"/>
-          <w:sz w:val="20"/>
-          <w:szCs w:val="20"/>
-        </w:rPr>
-        <w:t>var</w:t>
-      </w:r>
-      <w:proofErr w:type="spellEnd"/>
-      <w:r>
-        <w:rPr>
-          <w:rFonts w:ascii="Arial" w:eastAsia="Courier New" w:hAnsi="Arial" w:cs="Arial"/>
-          <w:color w:val="FFFFFF"/>
-          <w:sz w:val="20"/>
-          <w:szCs w:val="20"/>
-        </w:rPr>
-        <w:t>(--</w:t>
+        <w:t xml:space="preserve">      font-weight: var(--</w:t>
       </w:r>
       <w:proofErr w:type="spellStart"/>
       <w:r>
@@ -9802,27 +9043,7 @@
           <w:sz w:val="20"/>
           <w:szCs w:val="20"/>
         </w:rPr>
-        <w:t xml:space="preserve">: </w:t>
-      </w:r>
-      <w:proofErr w:type="spellStart"/>
-      <w:r>
-        <w:rPr>
-          <w:rFonts w:ascii="Arial" w:eastAsia="Courier New" w:hAnsi="Arial" w:cs="Arial"/>
-          <w:color w:val="FFFFFF"/>
-          <w:sz w:val="20"/>
-          <w:szCs w:val="20"/>
-        </w:rPr>
-        <w:t>var</w:t>
-      </w:r>
-      <w:proofErr w:type="spellEnd"/>
-      <w:r>
-        <w:rPr>
-          <w:rFonts w:ascii="Arial" w:eastAsia="Courier New" w:hAnsi="Arial" w:cs="Arial"/>
-          <w:color w:val="FFFFFF"/>
-          <w:sz w:val="20"/>
-          <w:szCs w:val="20"/>
-        </w:rPr>
-        <w:t>(--</w:t>
+        <w:t>: var(--</w:t>
       </w:r>
       <w:proofErr w:type="spellStart"/>
       <w:r>
@@ -9877,27 +9098,7 @@
           <w:sz w:val="20"/>
           <w:szCs w:val="20"/>
         </w:rPr>
-        <w:t xml:space="preserve">: </w:t>
-      </w:r>
-      <w:proofErr w:type="spellStart"/>
-      <w:r>
-        <w:rPr>
-          <w:rFonts w:ascii="Arial" w:eastAsia="Courier New" w:hAnsi="Arial" w:cs="Arial"/>
-          <w:color w:val="FFFFFF"/>
-          <w:sz w:val="20"/>
-          <w:szCs w:val="20"/>
-        </w:rPr>
-        <w:t>var</w:t>
-      </w:r>
-      <w:proofErr w:type="spellEnd"/>
-      <w:r>
-        <w:rPr>
-          <w:rFonts w:ascii="Arial" w:eastAsia="Courier New" w:hAnsi="Arial" w:cs="Arial"/>
-          <w:color w:val="FFFFFF"/>
-          <w:sz w:val="20"/>
-          <w:szCs w:val="20"/>
-        </w:rPr>
-        <w:t>(--</w:t>
+        <w:t>: var(--</w:t>
       </w:r>
       <w:proofErr w:type="spellStart"/>
       <w:r>
@@ -9990,16 +9191,8 @@
         <w:rPr>
           <w:rFonts w:ascii="Arial" w:hAnsi="Arial" w:cs="Arial"/>
         </w:rPr>
-        <w:t xml:space="preserve"> </w:t>
-      </w:r>
-      <w:proofErr w:type="spellStart"/>
-      <w:r>
-        <w:rPr>
-          <w:rFonts w:ascii="Arial" w:hAnsi="Arial" w:cs="Arial"/>
-        </w:rPr>
-        <w:t>Instan</w:t>
-      </w:r>
-      <w:proofErr w:type="spellEnd"/>
+        <w:t xml:space="preserve"> Instan</w:t>
+      </w:r>
     </w:p>
     <w:p>
       <w:pPr>
@@ -10087,27 +9280,7 @@
           <w:sz w:val="20"/>
           <w:szCs w:val="20"/>
         </w:rPr>
-        <w:t xml:space="preserve">: </w:t>
-      </w:r>
-      <w:proofErr w:type="spellStart"/>
-      <w:r>
-        <w:rPr>
-          <w:rFonts w:ascii="Arial" w:eastAsia="Courier New" w:hAnsi="Arial" w:cs="Arial"/>
-          <w:color w:val="FFFFFF"/>
-          <w:sz w:val="20"/>
-          <w:szCs w:val="20"/>
-        </w:rPr>
-        <w:t>var</w:t>
-      </w:r>
-      <w:proofErr w:type="spellEnd"/>
-      <w:r>
-        <w:rPr>
-          <w:rFonts w:ascii="Arial" w:eastAsia="Courier New" w:hAnsi="Arial" w:cs="Arial"/>
-          <w:color w:val="FFFFFF"/>
-          <w:sz w:val="20"/>
-          <w:szCs w:val="20"/>
-        </w:rPr>
-        <w:t>(--</w:t>
+        <w:t>: var(--</w:t>
       </w:r>
       <w:proofErr w:type="spellStart"/>
       <w:r>
@@ -10172,7 +9345,6 @@
           <w:sz w:val="20"/>
           <w:szCs w:val="20"/>
         </w:rPr>
-        <w:lastRenderedPageBreak/>
         <w:t xml:space="preserve">    .</w:t>
       </w:r>
       <w:proofErr w:type="spellStart"/>
@@ -10228,27 +9400,7 @@
           <w:sz w:val="20"/>
           <w:szCs w:val="20"/>
         </w:rPr>
-        <w:t xml:space="preserve">: </w:t>
-      </w:r>
-      <w:proofErr w:type="spellStart"/>
-      <w:r>
-        <w:rPr>
-          <w:rFonts w:ascii="Arial" w:eastAsia="Courier New" w:hAnsi="Arial" w:cs="Arial"/>
-          <w:color w:val="FFFFFF"/>
-          <w:sz w:val="20"/>
-          <w:szCs w:val="20"/>
-        </w:rPr>
-        <w:t>var</w:t>
-      </w:r>
-      <w:proofErr w:type="spellEnd"/>
-      <w:r>
-        <w:rPr>
-          <w:rFonts w:ascii="Arial" w:eastAsia="Courier New" w:hAnsi="Arial" w:cs="Arial"/>
-          <w:color w:val="FFFFFF"/>
-          <w:sz w:val="20"/>
-          <w:szCs w:val="20"/>
-        </w:rPr>
-        <w:t>(--</w:t>
+        <w:t>: var(--</w:t>
       </w:r>
       <w:proofErr w:type="spellStart"/>
       <w:r>
@@ -10368,27 +9520,7 @@
           <w:sz w:val="20"/>
           <w:szCs w:val="20"/>
         </w:rPr>
-        <w:t xml:space="preserve">: </w:t>
-      </w:r>
-      <w:proofErr w:type="spellStart"/>
-      <w:r>
-        <w:rPr>
-          <w:rFonts w:ascii="Arial" w:eastAsia="Courier New" w:hAnsi="Arial" w:cs="Arial"/>
-          <w:color w:val="FFFFFF"/>
-          <w:sz w:val="20"/>
-          <w:szCs w:val="20"/>
-        </w:rPr>
-        <w:t>var</w:t>
-      </w:r>
-      <w:proofErr w:type="spellEnd"/>
-      <w:r>
-        <w:rPr>
-          <w:rFonts w:ascii="Arial" w:eastAsia="Courier New" w:hAnsi="Arial" w:cs="Arial"/>
-          <w:color w:val="FFFFFF"/>
-          <w:sz w:val="20"/>
-          <w:szCs w:val="20"/>
-        </w:rPr>
-        <w:t>(--</w:t>
+        <w:t>: var(--</w:t>
       </w:r>
       <w:proofErr w:type="spellStart"/>
       <w:r>
@@ -10510,16 +9642,8 @@
         <w:rPr>
           <w:rFonts w:ascii="Arial" w:hAnsi="Arial" w:cs="Arial"/>
         </w:rPr>
-        <w:t xml:space="preserve"> &amp; </w:t>
-      </w:r>
-      <w:proofErr w:type="spellStart"/>
-      <w:r>
-        <w:rPr>
-          <w:rFonts w:ascii="Arial" w:hAnsi="Arial" w:cs="Arial"/>
-        </w:rPr>
-        <w:t>Gerakan</w:t>
-      </w:r>
-      <w:proofErr w:type="spellEnd"/>
+        <w:t xml:space="preserve"> &amp; Gerakan</w:t>
+      </w:r>
     </w:p>
     <w:p>
       <w:pPr>
@@ -10629,18 +9753,8 @@
           <w:b/>
           <w:bCs/>
         </w:rPr>
-        <w:t xml:space="preserve"> </w:t>
-      </w:r>
-      <w:proofErr w:type="spellStart"/>
-      <w:r>
-        <w:rPr>
-          <w:rFonts w:ascii="Arial" w:hAnsi="Arial" w:cs="Arial"/>
-          <w:b/>
-          <w:bCs/>
-        </w:rPr>
-        <w:t>statis</w:t>
-      </w:r>
-      <w:proofErr w:type="spellEnd"/>
+        <w:t xml:space="preserve"> statis</w:t>
+      </w:r>
       <w:r>
         <w:rPr>
           <w:rFonts w:ascii="Arial" w:hAnsi="Arial" w:cs="Arial"/>
@@ -10687,21 +9801,7 @@
         <w:rPr>
           <w:rFonts w:ascii="Arial" w:hAnsi="Arial" w:cs="Arial"/>
         </w:rPr>
-        <w:t xml:space="preserve"> </w:t>
-      </w:r>
-      <w:proofErr w:type="spellStart"/>
-      <w:r>
-        <w:rPr>
-          <w:rFonts w:ascii="Arial" w:hAnsi="Arial" w:cs="Arial"/>
-        </w:rPr>
-        <w:t>datar</w:t>
-      </w:r>
-      <w:proofErr w:type="spellEnd"/>
-      <w:r>
-        <w:rPr>
-          <w:rFonts w:ascii="Arial" w:hAnsi="Arial" w:cs="Arial"/>
-        </w:rPr>
-        <w:t>.</w:t>
+        <w:t xml:space="preserve"> datar.</w:t>
       </w:r>
     </w:p>
     <w:p>
@@ -10784,27 +9884,7 @@
           <w:sz w:val="20"/>
           <w:szCs w:val="20"/>
         </w:rPr>
-        <w:t xml:space="preserve">      transition: transform </w:t>
-      </w:r>
-      <w:proofErr w:type="spellStart"/>
-      <w:r>
-        <w:rPr>
-          <w:rFonts w:ascii="Arial" w:eastAsia="Courier New" w:hAnsi="Arial" w:cs="Arial"/>
-          <w:color w:val="FFFFFF"/>
-          <w:sz w:val="20"/>
-          <w:szCs w:val="20"/>
-        </w:rPr>
-        <w:t>var</w:t>
-      </w:r>
-      <w:proofErr w:type="spellEnd"/>
-      <w:r>
-        <w:rPr>
-          <w:rFonts w:ascii="Arial" w:eastAsia="Courier New" w:hAnsi="Arial" w:cs="Arial"/>
-          <w:color w:val="FFFFFF"/>
-          <w:sz w:val="20"/>
-          <w:szCs w:val="20"/>
-        </w:rPr>
-        <w:t>(--</w:t>
+        <w:t xml:space="preserve">      transition: transform var(--</w:t>
       </w:r>
       <w:proofErr w:type="spellStart"/>
       <w:r>
@@ -10824,27 +9904,7 @@
           <w:sz w:val="20"/>
           <w:szCs w:val="20"/>
         </w:rPr>
-        <w:t xml:space="preserve">-duration-fast) </w:t>
-      </w:r>
-      <w:proofErr w:type="spellStart"/>
-      <w:r>
-        <w:rPr>
-          <w:rFonts w:ascii="Arial" w:eastAsia="Courier New" w:hAnsi="Arial" w:cs="Arial"/>
-          <w:color w:val="FFFFFF"/>
-          <w:sz w:val="20"/>
-          <w:szCs w:val="20"/>
-        </w:rPr>
-        <w:t>var</w:t>
-      </w:r>
-      <w:proofErr w:type="spellEnd"/>
-      <w:r>
-        <w:rPr>
-          <w:rFonts w:ascii="Arial" w:eastAsia="Courier New" w:hAnsi="Arial" w:cs="Arial"/>
-          <w:color w:val="FFFFFF"/>
-          <w:sz w:val="20"/>
-          <w:szCs w:val="20"/>
-        </w:rPr>
-        <w:t>(--</w:t>
+        <w:t>-duration-fast) var(--</w:t>
       </w:r>
       <w:proofErr w:type="spellStart"/>
       <w:r>
@@ -10944,27 +10004,7 @@
           <w:sz w:val="20"/>
           <w:szCs w:val="20"/>
         </w:rPr>
-        <w:t xml:space="preserve">      transform: scale(</w:t>
-      </w:r>
-      <w:proofErr w:type="spellStart"/>
-      <w:r>
-        <w:rPr>
-          <w:rFonts w:ascii="Arial" w:eastAsia="Courier New" w:hAnsi="Arial" w:cs="Arial"/>
-          <w:color w:val="FFFFFF"/>
-          <w:sz w:val="20"/>
-          <w:szCs w:val="20"/>
-        </w:rPr>
-        <w:t>var</w:t>
-      </w:r>
-      <w:proofErr w:type="spellEnd"/>
-      <w:r>
-        <w:rPr>
-          <w:rFonts w:ascii="Arial" w:eastAsia="Courier New" w:hAnsi="Arial" w:cs="Arial"/>
-          <w:color w:val="FFFFFF"/>
-          <w:sz w:val="20"/>
-          <w:szCs w:val="20"/>
-        </w:rPr>
-        <w:t>(--</w:t>
+        <w:t xml:space="preserve">      transform: scale(var(--</w:t>
       </w:r>
       <w:proofErr w:type="spellStart"/>
       <w:r>
@@ -11049,36 +10089,7 @@
           <w:sz w:val="20"/>
           <w:szCs w:val="20"/>
         </w:rPr>
-        <w:t xml:space="preserve">    </w:t>
-      </w:r>
-      <w:r>
-        <w:rPr>
-          <w:rFonts w:ascii="Arial" w:eastAsia="Courier New" w:hAnsi="Arial" w:cs="Arial"/>
-          <w:color w:val="FFFFFF"/>
-          <w:sz w:val="20"/>
-          <w:szCs w:val="20"/>
-        </w:rPr>
-        <w:t xml:space="preserve">  transform: scale(</w:t>
-      </w:r>
-      <w:proofErr w:type="spellStart"/>
-      <w:r>
-        <w:rPr>
-          <w:rFonts w:ascii="Arial" w:eastAsia="Courier New" w:hAnsi="Arial" w:cs="Arial"/>
-          <w:color w:val="FFFFFF"/>
-          <w:sz w:val="20"/>
-          <w:szCs w:val="20"/>
-        </w:rPr>
-        <w:t>var</w:t>
-      </w:r>
-      <w:proofErr w:type="spellEnd"/>
-      <w:r>
-        <w:rPr>
-          <w:rFonts w:ascii="Arial" w:eastAsia="Courier New" w:hAnsi="Arial" w:cs="Arial"/>
-          <w:color w:val="FFFFFF"/>
-          <w:sz w:val="20"/>
-          <w:szCs w:val="20"/>
-        </w:rPr>
-        <w:t>(--</w:t>
+        <w:t xml:space="preserve">      transform: scale(var(--</w:t>
       </w:r>
       <w:proofErr w:type="spellStart"/>
       <w:r>
@@ -11207,21 +10218,7 @@
         <w:rPr>
           <w:rFonts w:ascii="Arial" w:hAnsi="Arial" w:cs="Arial"/>
         </w:rPr>
-        <w:t xml:space="preserve"> </w:t>
-      </w:r>
-      <w:proofErr w:type="spellStart"/>
-      <w:r>
-        <w:rPr>
-          <w:rFonts w:ascii="Arial" w:hAnsi="Arial" w:cs="Arial"/>
-        </w:rPr>
-        <w:t>pada</w:t>
-      </w:r>
-      <w:proofErr w:type="spellEnd"/>
-      <w:r>
-        <w:rPr>
-          <w:rFonts w:ascii="Arial" w:hAnsi="Arial" w:cs="Arial"/>
-        </w:rPr>
-        <w:t xml:space="preserve"> </w:t>
+        <w:t xml:space="preserve"> pada </w:t>
       </w:r>
       <w:proofErr w:type="spellStart"/>
       <w:r>
@@ -11353,7 +10350,6 @@
           <w:sz w:val="20"/>
           <w:szCs w:val="20"/>
         </w:rPr>
-        <w:lastRenderedPageBreak/>
         <w:t xml:space="preserve">         </w:t>
       </w:r>
       <w:r>
@@ -11605,21 +10601,7 @@
         <w:rPr>
           <w:rFonts w:ascii="Arial" w:hAnsi="Arial" w:cs="Arial"/>
         </w:rPr>
-        <w:t xml:space="preserve"> </w:t>
-      </w:r>
-      <w:proofErr w:type="spellStart"/>
-      <w:r>
-        <w:rPr>
-          <w:rFonts w:ascii="Arial" w:hAnsi="Arial" w:cs="Arial"/>
-        </w:rPr>
-        <w:t>ikon</w:t>
-      </w:r>
-      <w:proofErr w:type="spellEnd"/>
-      <w:r>
-        <w:rPr>
-          <w:rFonts w:ascii="Arial" w:hAnsi="Arial" w:cs="Arial"/>
-        </w:rPr>
-        <w:t xml:space="preserve"> – </w:t>
+        <w:t xml:space="preserve"> ikon – </w:t>
       </w:r>
       <w:proofErr w:type="spellStart"/>
       <w:r>
@@ -11690,13 +10672,7 @@
         <w:rPr>
           <w:rFonts w:ascii="Arial" w:hAnsi="Arial" w:cs="Arial"/>
         </w:rPr>
-        <w:t xml:space="preserve">: Font Awesome </w:t>
-      </w:r>
-      <w:r>
-        <w:rPr>
-          <w:rFonts w:ascii="Arial" w:hAnsi="Arial" w:cs="Arial"/>
-        </w:rPr>
-        <w:t>6.0.0-BETA3 (Solid/Regular)</w:t>
+        <w:t>: Font Awesome 6.0.0-BETA3 (Solid/Regular)</w:t>
       </w:r>
     </w:p>
     <w:p>
@@ -11706,19 +10682,11 @@
           <w:rFonts w:ascii="Arial" w:hAnsi="Arial" w:cs="Arial"/>
         </w:rPr>
       </w:pPr>
-      <w:proofErr w:type="spellStart"/>
-      <w:r>
-        <w:rPr>
-          <w:rFonts w:ascii="Arial" w:hAnsi="Arial" w:cs="Arial"/>
-        </w:rPr>
-        <w:t>Wajib</w:t>
-      </w:r>
-      <w:proofErr w:type="spellEnd"/>
-      <w:r>
-        <w:rPr>
-          <w:rFonts w:ascii="Arial" w:hAnsi="Arial" w:cs="Arial"/>
-        </w:rPr>
-        <w:t xml:space="preserve"> </w:t>
+      <w:r>
+        <w:rPr>
+          <w:rFonts w:ascii="Arial" w:hAnsi="Arial" w:cs="Arial"/>
+        </w:rPr>
+        <w:t xml:space="preserve">Wajib </w:t>
       </w:r>
       <w:proofErr w:type="spellStart"/>
       <w:r>
@@ -11732,21 +10700,7 @@
         <w:rPr>
           <w:rFonts w:ascii="Arial" w:hAnsi="Arial" w:cs="Arial"/>
         </w:rPr>
-        <w:t xml:space="preserve"> Font Awesome. </w:t>
-      </w:r>
-      <w:proofErr w:type="spellStart"/>
-      <w:r>
-        <w:rPr>
-          <w:rFonts w:ascii="Arial" w:hAnsi="Arial" w:cs="Arial"/>
-        </w:rPr>
-        <w:t>Ikon</w:t>
-      </w:r>
-      <w:proofErr w:type="spellEnd"/>
-      <w:r>
-        <w:rPr>
-          <w:rFonts w:ascii="Arial" w:hAnsi="Arial" w:cs="Arial"/>
-        </w:rPr>
-        <w:t xml:space="preserve"> </w:t>
+        <w:t xml:space="preserve"> Font Awesome. Ikon </w:t>
       </w:r>
       <w:proofErr w:type="spellStart"/>
       <w:r>
@@ -11840,23 +10794,13 @@
           <w:rFonts w:ascii="Arial" w:hAnsi="Arial" w:cs="Arial"/>
         </w:rPr>
       </w:pPr>
-      <w:proofErr w:type="spellStart"/>
       <w:r>
         <w:rPr>
           <w:rFonts w:ascii="Arial" w:hAnsi="Arial" w:cs="Arial"/>
           <w:b/>
           <w:bCs/>
         </w:rPr>
-        <w:t>Panduan</w:t>
-      </w:r>
-      <w:proofErr w:type="spellEnd"/>
-      <w:r>
-        <w:rPr>
-          <w:rFonts w:ascii="Arial" w:hAnsi="Arial" w:cs="Arial"/>
-          <w:b/>
-          <w:bCs/>
-        </w:rPr>
-        <w:t xml:space="preserve"> </w:t>
+        <w:t xml:space="preserve">Panduan </w:t>
       </w:r>
       <w:proofErr w:type="spellStart"/>
       <w:r>
@@ -12118,19 +11062,11 @@
           <w:rFonts w:ascii="Arial" w:hAnsi="Arial" w:cs="Arial"/>
         </w:rPr>
       </w:pPr>
-      <w:proofErr w:type="spellStart"/>
-      <w:r>
-        <w:rPr>
-          <w:rFonts w:ascii="Arial" w:hAnsi="Arial" w:cs="Arial"/>
-        </w:rPr>
-        <w:t>Ikon</w:t>
-      </w:r>
-      <w:proofErr w:type="spellEnd"/>
-      <w:r>
-        <w:rPr>
-          <w:rFonts w:ascii="Arial" w:hAnsi="Arial" w:cs="Arial"/>
-        </w:rPr>
-        <w:t xml:space="preserve"> </w:t>
+      <w:r>
+        <w:rPr>
+          <w:rFonts w:ascii="Arial" w:hAnsi="Arial" w:cs="Arial"/>
+        </w:rPr>
+        <w:t xml:space="preserve">Ikon </w:t>
       </w:r>
       <w:proofErr w:type="spellStart"/>
       <w:r>
@@ -12185,21 +11121,7 @@
         <w:rPr>
           <w:rFonts w:ascii="Arial" w:hAnsi="Arial" w:cs="Arial"/>
         </w:rPr>
-        <w:t xml:space="preserve">. </w:t>
-      </w:r>
-      <w:proofErr w:type="spellStart"/>
-      <w:r>
-        <w:rPr>
-          <w:rFonts w:ascii="Arial" w:hAnsi="Arial" w:cs="Arial"/>
-        </w:rPr>
-        <w:t>Ikon</w:t>
-      </w:r>
-      <w:proofErr w:type="spellEnd"/>
-      <w:r>
-        <w:rPr>
-          <w:rFonts w:ascii="Arial" w:hAnsi="Arial" w:cs="Arial"/>
-        </w:rPr>
-        <w:t xml:space="preserve"> yang </w:t>
+        <w:t xml:space="preserve">. Ikon yang </w:t>
       </w:r>
       <w:proofErr w:type="spellStart"/>
       <w:r>
@@ -12439,21 +11361,7 @@
         <w:rPr>
           <w:rFonts w:ascii="Arial" w:hAnsi="Arial" w:cs="Arial"/>
         </w:rPr>
-        <w:t xml:space="preserve"> </w:t>
-      </w:r>
-      <w:proofErr w:type="spellStart"/>
-      <w:r>
-        <w:rPr>
-          <w:rFonts w:ascii="Arial" w:hAnsi="Arial" w:cs="Arial"/>
-        </w:rPr>
-        <w:t>Gelap</w:t>
-      </w:r>
-      <w:proofErr w:type="spellEnd"/>
-      <w:r>
-        <w:rPr>
-          <w:rFonts w:ascii="Arial" w:hAnsi="Arial" w:cs="Arial"/>
-        </w:rPr>
-        <w:t>)</w:t>
+        <w:t xml:space="preserve"> Gelap)</w:t>
       </w:r>
     </w:p>
     <w:p>
@@ -12463,20 +11371,11 @@
           <w:rFonts w:ascii="Arial" w:hAnsi="Arial" w:cs="Arial"/>
         </w:rPr>
       </w:pPr>
-      <w:proofErr w:type="spellStart"/>
-      <w:r>
-        <w:rPr>
-          <w:rFonts w:ascii="Arial" w:hAnsi="Arial" w:cs="Arial"/>
-        </w:rPr>
-        <w:lastRenderedPageBreak/>
-        <w:t>Anda</w:t>
-      </w:r>
-      <w:proofErr w:type="spellEnd"/>
-      <w:r>
-        <w:rPr>
-          <w:rFonts w:ascii="Arial" w:hAnsi="Arial" w:cs="Arial"/>
-        </w:rPr>
-        <w:t xml:space="preserve"> </w:t>
+      <w:r>
+        <w:rPr>
+          <w:rFonts w:ascii="Arial" w:hAnsi="Arial" w:cs="Arial"/>
+        </w:rPr>
+        <w:t xml:space="preserve">Anda </w:t>
       </w:r>
       <w:proofErr w:type="spellStart"/>
       <w:r>
@@ -12528,21 +11427,7 @@
         <w:rPr>
           <w:rFonts w:ascii="Arial" w:hAnsi="Arial" w:cs="Arial"/>
         </w:rPr>
-        <w:t xml:space="preserve"> </w:t>
-      </w:r>
-      <w:proofErr w:type="spellStart"/>
-      <w:r>
-        <w:rPr>
-          <w:rFonts w:ascii="Arial" w:hAnsi="Arial" w:cs="Arial"/>
-        </w:rPr>
-        <w:t>dan</w:t>
-      </w:r>
-      <w:proofErr w:type="spellEnd"/>
-      <w:r>
-        <w:rPr>
-          <w:rFonts w:ascii="Arial" w:hAnsi="Arial" w:cs="Arial"/>
-        </w:rPr>
-        <w:t xml:space="preserve"> </w:t>
+        <w:t xml:space="preserve"> dan </w:t>
       </w:r>
       <w:r>
         <w:rPr>
@@ -12591,13 +11476,7 @@
         <w:rPr>
           <w:rFonts w:ascii="Arial" w:hAnsi="Arial" w:cs="Arial"/>
         </w:rPr>
-        <w:t>harmo</w:t>
-      </w:r>
-      <w:r>
-        <w:rPr>
-          <w:rFonts w:ascii="Arial" w:hAnsi="Arial" w:cs="Arial"/>
-        </w:rPr>
-        <w:t>ni</w:t>
+        <w:t>harmoni</w:t>
       </w:r>
       <w:proofErr w:type="spellEnd"/>
       <w:r>
@@ -12747,21 +11626,7 @@
         <w:rPr>
           <w:rFonts w:ascii="Arial" w:hAnsi="Arial" w:cs="Arial"/>
         </w:rPr>
-        <w:t xml:space="preserve"> </w:t>
-      </w:r>
-      <w:proofErr w:type="spellStart"/>
-      <w:r>
-        <w:rPr>
-          <w:rFonts w:ascii="Arial" w:hAnsi="Arial" w:cs="Arial"/>
-        </w:rPr>
-        <w:t>dan</w:t>
-      </w:r>
-      <w:proofErr w:type="spellEnd"/>
-      <w:r>
-        <w:rPr>
-          <w:rFonts w:ascii="Arial" w:hAnsi="Arial" w:cs="Arial"/>
-        </w:rPr>
-        <w:t xml:space="preserve"> </w:t>
+        <w:t xml:space="preserve"> dan </w:t>
       </w:r>
       <w:proofErr w:type="spellStart"/>
       <w:r>
@@ -12775,21 +11640,7 @@
         <w:rPr>
           <w:rFonts w:ascii="Arial" w:hAnsi="Arial" w:cs="Arial"/>
         </w:rPr>
-        <w:t xml:space="preserve"> </w:t>
-      </w:r>
-      <w:proofErr w:type="spellStart"/>
-      <w:r>
-        <w:rPr>
-          <w:rFonts w:ascii="Arial" w:hAnsi="Arial" w:cs="Arial"/>
-        </w:rPr>
-        <w:t>relatif</w:t>
-      </w:r>
-      <w:proofErr w:type="spellEnd"/>
-      <w:r>
-        <w:rPr>
-          <w:rFonts w:ascii="Arial" w:hAnsi="Arial" w:cs="Arial"/>
-        </w:rPr>
-        <w:t>.</w:t>
+        <w:t xml:space="preserve"> relatif.</w:t>
       </w:r>
     </w:p>
     <w:p>
@@ -13328,21 +12179,7 @@
         <w:rPr>
           <w:rFonts w:ascii="Arial" w:hAnsi="Arial" w:cs="Arial"/>
         </w:rPr>
-        <w:t xml:space="preserve"> </w:t>
-      </w:r>
-      <w:proofErr w:type="spellStart"/>
-      <w:r>
-        <w:rPr>
-          <w:rFonts w:ascii="Arial" w:hAnsi="Arial" w:cs="Arial"/>
-        </w:rPr>
-        <w:t>dan</w:t>
-      </w:r>
-      <w:proofErr w:type="spellEnd"/>
-      <w:r>
-        <w:rPr>
-          <w:rFonts w:ascii="Arial" w:hAnsi="Arial" w:cs="Arial"/>
-        </w:rPr>
-        <w:t xml:space="preserve"> </w:t>
+        <w:t xml:space="preserve"> dan </w:t>
       </w:r>
       <w:proofErr w:type="spellStart"/>
       <w:r>
@@ -13356,21 +12193,7 @@
         <w:rPr>
           <w:rFonts w:ascii="Arial" w:hAnsi="Arial" w:cs="Arial"/>
         </w:rPr>
-        <w:t xml:space="preserve"> </w:t>
-      </w:r>
-      <w:proofErr w:type="spellStart"/>
-      <w:r>
-        <w:rPr>
-          <w:rFonts w:ascii="Arial" w:hAnsi="Arial" w:cs="Arial"/>
-        </w:rPr>
-        <w:t>variabel</w:t>
-      </w:r>
-      <w:proofErr w:type="spellEnd"/>
-      <w:r>
-        <w:rPr>
-          <w:rFonts w:ascii="Arial" w:hAnsi="Arial" w:cs="Arial"/>
-        </w:rPr>
-        <w:t>:</w:t>
+        <w:t xml:space="preserve"> variabel:</w:t>
       </w:r>
     </w:p>
     <w:p>
@@ -13453,36 +12276,7 @@
           <w:sz w:val="20"/>
           <w:szCs w:val="20"/>
         </w:rPr>
-        <w:t>-font-primary</w:t>
-      </w:r>
-      <w:r>
-        <w:rPr>
-          <w:rFonts w:ascii="Arial" w:eastAsia="Courier New" w:hAnsi="Arial" w:cs="Arial"/>
-          <w:color w:val="FFFFFF"/>
-          <w:sz w:val="20"/>
-          <w:szCs w:val="20"/>
-        </w:rPr>
-        <w:t>: '</w:t>
-      </w:r>
-      <w:proofErr w:type="spellStart"/>
-      <w:r>
-        <w:rPr>
-          <w:rFonts w:ascii="Arial" w:eastAsia="Courier New" w:hAnsi="Arial" w:cs="Arial"/>
-          <w:color w:val="FFFFFF"/>
-          <w:sz w:val="20"/>
-          <w:szCs w:val="20"/>
-        </w:rPr>
-        <w:t>Nunito</w:t>
-      </w:r>
-      <w:proofErr w:type="spellEnd"/>
-      <w:r>
-        <w:rPr>
-          <w:rFonts w:ascii="Arial" w:eastAsia="Courier New" w:hAnsi="Arial" w:cs="Arial"/>
-          <w:color w:val="FFFFFF"/>
-          <w:sz w:val="20"/>
-          <w:szCs w:val="20"/>
-        </w:rPr>
-        <w:t xml:space="preserve">', 'Arial', sans-serif;    </w:t>
+        <w:t xml:space="preserve">-font-primary: 'Nunito', 'Arial', sans-serif;    </w:t>
       </w:r>
       <w:r>
         <w:rPr>
@@ -13576,21 +12370,7 @@
         <w:rPr>
           <w:rFonts w:ascii="Arial" w:hAnsi="Arial" w:cs="Arial"/>
         </w:rPr>
-        <w:t xml:space="preserve"> </w:t>
-      </w:r>
-      <w:proofErr w:type="spellStart"/>
-      <w:r>
-        <w:rPr>
-          <w:rFonts w:ascii="Arial" w:hAnsi="Arial" w:cs="Arial"/>
-        </w:rPr>
-        <w:t>dan</w:t>
-      </w:r>
-      <w:proofErr w:type="spellEnd"/>
-      <w:r>
-        <w:rPr>
-          <w:rFonts w:ascii="Arial" w:hAnsi="Arial" w:cs="Arial"/>
-        </w:rPr>
-        <w:t xml:space="preserve"> </w:t>
+        <w:t xml:space="preserve"> dan </w:t>
       </w:r>
       <w:r>
         <w:rPr>
@@ -13699,7 +12479,6 @@
           <w:b/>
           <w:bCs/>
         </w:rPr>
-        <w:lastRenderedPageBreak/>
         <w:t>Larangan</w:t>
       </w:r>
       <w:proofErr w:type="spellEnd"/>
@@ -13724,19 +12503,11 @@
           <w:rFonts w:ascii="Arial" w:hAnsi="Arial" w:cs="Arial"/>
         </w:rPr>
       </w:pPr>
-      <w:proofErr w:type="spellStart"/>
-      <w:r>
-        <w:rPr>
-          <w:rFonts w:ascii="Arial" w:hAnsi="Arial" w:cs="Arial"/>
-        </w:rPr>
-        <w:t>Tema</w:t>
-      </w:r>
-      <w:proofErr w:type="spellEnd"/>
-      <w:r>
-        <w:rPr>
-          <w:rFonts w:ascii="Arial" w:hAnsi="Arial" w:cs="Arial"/>
-        </w:rPr>
-        <w:t xml:space="preserve"> </w:t>
+      <w:r>
+        <w:rPr>
+          <w:rFonts w:ascii="Arial" w:hAnsi="Arial" w:cs="Arial"/>
+        </w:rPr>
+        <w:t xml:space="preserve">Tema </w:t>
       </w:r>
       <w:proofErr w:type="spellStart"/>
       <w:r>
@@ -13852,21 +12623,7 @@
         <w:rPr>
           <w:rFonts w:ascii="Arial" w:hAnsi="Arial" w:cs="Arial"/>
         </w:rPr>
-        <w:t xml:space="preserve">Library </w:t>
-      </w:r>
-      <w:proofErr w:type="spellStart"/>
-      <w:r>
-        <w:rPr>
-          <w:rFonts w:ascii="Arial" w:hAnsi="Arial" w:cs="Arial"/>
-        </w:rPr>
-        <w:t>ikon</w:t>
-      </w:r>
-      <w:proofErr w:type="spellEnd"/>
-      <w:r>
-        <w:rPr>
-          <w:rFonts w:ascii="Arial" w:hAnsi="Arial" w:cs="Arial"/>
-        </w:rPr>
-        <w:t xml:space="preserve"> </w:t>
+        <w:t xml:space="preserve">Library ikon </w:t>
       </w:r>
       <w:proofErr w:type="spellStart"/>
       <w:r>
@@ -14149,73 +12906,50 @@
         </w:rPr>
         <w:t xml:space="preserve"> </w:t>
       </w:r>
-      <w:proofErr w:type="spellStart"/>
       <w:r>
         <w:rPr>
           <w:rFonts w:ascii="Arial" w:eastAsia="Courier New" w:hAnsi="Arial" w:cs="Arial"/>
           <w:shd w:val="clear" w:color="auto" w:fill="F1F5F9"/>
         </w:rPr>
-        <w:t>var</w:t>
-      </w:r>
-      <w:proofErr w:type="spellEnd"/>
+        <w:t>var(--</w:t>
+      </w:r>
+      <w:proofErr w:type="spellStart"/>
       <w:r>
         <w:rPr>
           <w:rFonts w:ascii="Arial" w:eastAsia="Courier New" w:hAnsi="Arial" w:cs="Arial"/>
           <w:shd w:val="clear" w:color="auto" w:fill="F1F5F9"/>
         </w:rPr>
-        <w:t>(--</w:t>
-      </w:r>
-      <w:proofErr w:type="spellStart"/>
+        <w:t>srui</w:t>
+      </w:r>
+      <w:proofErr w:type="spellEnd"/>
       <w:r>
         <w:rPr>
           <w:rFonts w:ascii="Arial" w:eastAsia="Courier New" w:hAnsi="Arial" w:cs="Arial"/>
           <w:shd w:val="clear" w:color="auto" w:fill="F1F5F9"/>
         </w:rPr>
-        <w:t>srui</w:t>
-      </w:r>
-      <w:proofErr w:type="spellEnd"/>
+        <w:t>-radius-</w:t>
+      </w:r>
+      <w:proofErr w:type="spellStart"/>
       <w:r>
         <w:rPr>
           <w:rFonts w:ascii="Arial" w:eastAsia="Courier New" w:hAnsi="Arial" w:cs="Arial"/>
           <w:shd w:val="clear" w:color="auto" w:fill="F1F5F9"/>
         </w:rPr>
-        <w:t>-radius-</w:t>
-      </w:r>
-      <w:proofErr w:type="spellStart"/>
+        <w:t>sm</w:t>
+      </w:r>
+      <w:proofErr w:type="spellEnd"/>
       <w:r>
         <w:rPr>
           <w:rFonts w:ascii="Arial" w:eastAsia="Courier New" w:hAnsi="Arial" w:cs="Arial"/>
           <w:shd w:val="clear" w:color="auto" w:fill="F1F5F9"/>
         </w:rPr>
-        <w:t>sm</w:t>
-      </w:r>
-      <w:proofErr w:type="spellEnd"/>
-      <w:r>
-        <w:rPr>
-          <w:rFonts w:ascii="Arial" w:eastAsia="Courier New" w:hAnsi="Arial" w:cs="Arial"/>
-          <w:shd w:val="clear" w:color="auto" w:fill="F1F5F9"/>
-        </w:rPr>
         <w:t>)</w:t>
       </w:r>
       <w:r>
         <w:rPr>
           <w:rFonts w:ascii="Arial" w:hAnsi="Arial" w:cs="Arial"/>
         </w:rPr>
-        <w:t xml:space="preserve"> </w:t>
-      </w:r>
-      <w:proofErr w:type="spellStart"/>
-      <w:r>
-        <w:rPr>
-          <w:rFonts w:ascii="Arial" w:hAnsi="Arial" w:cs="Arial"/>
-        </w:rPr>
-        <w:t>pada</w:t>
-      </w:r>
-      <w:proofErr w:type="spellEnd"/>
-      <w:r>
-        <w:rPr>
-          <w:rFonts w:ascii="Arial" w:hAnsi="Arial" w:cs="Arial"/>
-        </w:rPr>
-        <w:t xml:space="preserve"> </w:t>
+        <w:t xml:space="preserve"> pada </w:t>
       </w:r>
       <w:proofErr w:type="spellStart"/>
       <w:r>
@@ -14951,21 +13685,7 @@
         <w:rPr>
           <w:rFonts w:ascii="Arial" w:hAnsi="Arial" w:cs="Arial"/>
         </w:rPr>
-        <w:t xml:space="preserve"> </w:t>
-      </w:r>
-      <w:proofErr w:type="spellStart"/>
-      <w:r>
-        <w:rPr>
-          <w:rFonts w:ascii="Arial" w:hAnsi="Arial" w:cs="Arial"/>
-        </w:rPr>
-        <w:t>sangat</w:t>
-      </w:r>
-      <w:proofErr w:type="spellEnd"/>
-      <w:r>
-        <w:rPr>
-          <w:rFonts w:ascii="Arial" w:hAnsi="Arial" w:cs="Arial"/>
-        </w:rPr>
-        <w:t xml:space="preserve"> </w:t>
+        <w:t xml:space="preserve"> sangat </w:t>
       </w:r>
       <w:proofErr w:type="spellStart"/>
       <w:r>
@@ -15022,21 +13742,7 @@
         <w:rPr>
           <w:rFonts w:ascii="Arial" w:hAnsi="Arial" w:cs="Arial"/>
         </w:rPr>
-        <w:t xml:space="preserve"> </w:t>
-      </w:r>
-      <w:proofErr w:type="spellStart"/>
-      <w:r>
-        <w:rPr>
-          <w:rFonts w:ascii="Arial" w:hAnsi="Arial" w:cs="Arial"/>
-        </w:rPr>
-        <w:t>Halaman</w:t>
-      </w:r>
-      <w:proofErr w:type="spellEnd"/>
-      <w:r>
-        <w:rPr>
-          <w:rFonts w:ascii="Arial" w:hAnsi="Arial" w:cs="Arial"/>
-        </w:rPr>
-        <w:t xml:space="preserve"> </w:t>
+        <w:t xml:space="preserve"> Halaman </w:t>
       </w:r>
       <w:proofErr w:type="spellStart"/>
       <w:r>
@@ -15183,27 +13889,7 @@
           <w:sz w:val="20"/>
           <w:szCs w:val="20"/>
         </w:rPr>
-        <w:t>="</w:t>
-      </w:r>
-      <w:proofErr w:type="spellStart"/>
-      <w:r>
-        <w:rPr>
-          <w:rFonts w:ascii="Arial" w:eastAsia="Courier New" w:hAnsi="Arial" w:cs="Arial"/>
-          <w:color w:val="FFFFFF"/>
-          <w:sz w:val="20"/>
-          <w:szCs w:val="20"/>
-        </w:rPr>
-        <w:t>srui-base.css</w:t>
-      </w:r>
-      <w:proofErr w:type="spellEnd"/>
-      <w:r>
-        <w:rPr>
-          <w:rFonts w:ascii="Arial" w:eastAsia="Courier New" w:hAnsi="Arial" w:cs="Arial"/>
-          <w:color w:val="FFFFFF"/>
-          <w:sz w:val="20"/>
-          <w:szCs w:val="20"/>
-        </w:rPr>
-        <w:t xml:space="preserve">"&gt;    </w:t>
+        <w:t xml:space="preserve">="srui-base.css"&gt;    </w:t>
       </w:r>
       <w:r>
         <w:rPr>
@@ -15258,27 +13944,7 @@
           <w:sz w:val="20"/>
           <w:szCs w:val="20"/>
         </w:rPr>
-        <w:t>="</w:t>
-      </w:r>
-      <w:proofErr w:type="spellStart"/>
-      <w:r>
-        <w:rPr>
-          <w:rFonts w:ascii="Arial" w:eastAsia="Courier New" w:hAnsi="Arial" w:cs="Arial"/>
-          <w:color w:val="FFFFFF"/>
-          <w:sz w:val="20"/>
-          <w:szCs w:val="20"/>
-        </w:rPr>
-        <w:t>srui-variables.css</w:t>
-      </w:r>
-      <w:proofErr w:type="spellEnd"/>
-      <w:r>
-        <w:rPr>
-          <w:rFonts w:ascii="Arial" w:eastAsia="Courier New" w:hAnsi="Arial" w:cs="Arial"/>
-          <w:color w:val="FFFFFF"/>
-          <w:sz w:val="20"/>
-          <w:szCs w:val="20"/>
-        </w:rPr>
-        <w:t xml:space="preserve">"&gt;    </w:t>
+        <w:t xml:space="preserve">="srui-variables.css"&gt;    </w:t>
       </w:r>
       <w:r>
         <w:rPr>
@@ -15333,27 +13999,7 @@
           <w:sz w:val="20"/>
           <w:szCs w:val="20"/>
         </w:rPr>
-        <w:t>="</w:t>
-      </w:r>
-      <w:proofErr w:type="spellStart"/>
-      <w:r>
-        <w:rPr>
-          <w:rFonts w:ascii="Arial" w:eastAsia="Courier New" w:hAnsi="Arial" w:cs="Arial"/>
-          <w:color w:val="FFFFFF"/>
-          <w:sz w:val="20"/>
-          <w:szCs w:val="20"/>
-        </w:rPr>
-        <w:t>srui-utilities.css</w:t>
-      </w:r>
-      <w:proofErr w:type="spellEnd"/>
-      <w:r>
-        <w:rPr>
-          <w:rFonts w:ascii="Arial" w:eastAsia="Courier New" w:hAnsi="Arial" w:cs="Arial"/>
-          <w:color w:val="FFFFFF"/>
-          <w:sz w:val="20"/>
-          <w:szCs w:val="20"/>
-        </w:rPr>
-        <w:t xml:space="preserve">"&gt;    </w:t>
+        <w:t xml:space="preserve">="srui-utilities.css"&gt;    </w:t>
       </w:r>
       <w:r>
         <w:rPr>
@@ -15473,7 +14119,6 @@
           <w:sz w:val="20"/>
           <w:szCs w:val="20"/>
         </w:rPr>
-        <w:lastRenderedPageBreak/>
         <w:t xml:space="preserve">         </w:t>
       </w:r>
       <w:r>
@@ -15489,16 +14134,7 @@
           <w:sz w:val="20"/>
           <w:szCs w:val="20"/>
         </w:rPr>
-        <w:t xml:space="preserve">  </w:t>
-      </w:r>
-      <w:r>
-        <w:rPr>
-          <w:rFonts w:ascii="Arial" w:eastAsia="Courier New" w:hAnsi="Arial" w:cs="Arial"/>
-          <w:color w:val="FFFFFF"/>
-          <w:sz w:val="20"/>
-          <w:szCs w:val="20"/>
-        </w:rPr>
-        <w:t xml:space="preserve">    &lt;div class="</w:t>
+        <w:t xml:space="preserve">      &lt;div class="</w:t>
       </w:r>
       <w:proofErr w:type="spellStart"/>
       <w:r>
@@ -15533,27 +14169,7 @@
           <w:sz w:val="20"/>
           <w:szCs w:val="20"/>
         </w:rPr>
-        <w:t xml:space="preserve">        &lt;h2 style="font-weight: </w:t>
-      </w:r>
-      <w:proofErr w:type="spellStart"/>
-      <w:r>
-        <w:rPr>
-          <w:rFonts w:ascii="Arial" w:eastAsia="Courier New" w:hAnsi="Arial" w:cs="Arial"/>
-          <w:color w:val="FFFFFF"/>
-          <w:sz w:val="20"/>
-          <w:szCs w:val="20"/>
-        </w:rPr>
-        <w:t>var</w:t>
-      </w:r>
-      <w:proofErr w:type="spellEnd"/>
-      <w:r>
-        <w:rPr>
-          <w:rFonts w:ascii="Arial" w:eastAsia="Courier New" w:hAnsi="Arial" w:cs="Arial"/>
-          <w:color w:val="FFFFFF"/>
-          <w:sz w:val="20"/>
-          <w:szCs w:val="20"/>
-        </w:rPr>
-        <w:t>(--</w:t>
+        <w:t xml:space="preserve">        &lt;h2 style="font-weight: var(--</w:t>
       </w:r>
       <w:proofErr w:type="spellStart"/>
       <w:r>
@@ -15573,27 +14189,7 @@
           <w:sz w:val="20"/>
           <w:szCs w:val="20"/>
         </w:rPr>
-        <w:t xml:space="preserve">-font-weight-bold); margin-bottom: </w:t>
-      </w:r>
-      <w:proofErr w:type="spellStart"/>
-      <w:r>
-        <w:rPr>
-          <w:rFonts w:ascii="Arial" w:eastAsia="Courier New" w:hAnsi="Arial" w:cs="Arial"/>
-          <w:color w:val="FFFFFF"/>
-          <w:sz w:val="20"/>
-          <w:szCs w:val="20"/>
-        </w:rPr>
-        <w:t>var</w:t>
-      </w:r>
-      <w:proofErr w:type="spellEnd"/>
-      <w:r>
-        <w:rPr>
-          <w:rFonts w:ascii="Arial" w:eastAsia="Courier New" w:hAnsi="Arial" w:cs="Arial"/>
-          <w:color w:val="FFFFFF"/>
-          <w:sz w:val="20"/>
-          <w:szCs w:val="20"/>
-        </w:rPr>
-        <w:t xml:space="preserve">(--srui-space-2);"&gt;    </w:t>
+        <w:t xml:space="preserve">-font-weight-bold); margin-bottom: var(--srui-space-2);"&gt;    </w:t>
       </w:r>
       <w:r>
         <w:rPr>
@@ -15623,16 +14219,7 @@
           <w:sz w:val="20"/>
           <w:szCs w:val="20"/>
         </w:rPr>
-        <w:t xml:space="preserve">        &lt;/h2&gt;  </w:t>
-      </w:r>
-      <w:r>
-        <w:rPr>
-          <w:rFonts w:ascii="Arial" w:eastAsia="Courier New" w:hAnsi="Arial" w:cs="Arial"/>
-          <w:color w:val="FFFFFF"/>
-          <w:sz w:val="20"/>
-          <w:szCs w:val="20"/>
-        </w:rPr>
-        <w:t xml:space="preserve">  </w:t>
+        <w:t xml:space="preserve">        &lt;/h2&gt;    </w:t>
       </w:r>
       <w:r>
         <w:rPr>
@@ -15667,27 +14254,7 @@
           <w:sz w:val="20"/>
           <w:szCs w:val="20"/>
         </w:rPr>
-        <w:t>-text-secondary"&gt;</w:t>
-      </w:r>
-      <w:proofErr w:type="spellStart"/>
-      <w:r>
-        <w:rPr>
-          <w:rFonts w:ascii="Arial" w:eastAsia="Courier New" w:hAnsi="Arial" w:cs="Arial"/>
-          <w:color w:val="FFFFFF"/>
-          <w:sz w:val="20"/>
-          <w:szCs w:val="20"/>
-        </w:rPr>
-        <w:t>Ini</w:t>
-      </w:r>
-      <w:proofErr w:type="spellEnd"/>
-      <w:r>
-        <w:rPr>
-          <w:rFonts w:ascii="Arial" w:eastAsia="Courier New" w:hAnsi="Arial" w:cs="Arial"/>
-          <w:color w:val="FFFFFF"/>
-          <w:sz w:val="20"/>
-          <w:szCs w:val="20"/>
-        </w:rPr>
-        <w:t xml:space="preserve"> </w:t>
+        <w:t xml:space="preserve">-text-secondary"&gt;Ini </w:t>
       </w:r>
       <w:proofErr w:type="spellStart"/>
       <w:r>
@@ -15897,36 +14464,7 @@
           <w:sz w:val="20"/>
           <w:szCs w:val="20"/>
         </w:rPr>
-        <w:t xml:space="preserve"> &lt;</w:t>
-      </w:r>
-      <w:proofErr w:type="spellStart"/>
-      <w:r>
-        <w:rPr>
-          <w:rFonts w:ascii="Arial" w:eastAsia="Courier New" w:hAnsi="Arial" w:cs="Arial"/>
-          <w:color w:val="FFFFFF"/>
-          <w:sz w:val="20"/>
-          <w:szCs w:val="20"/>
-        </w:rPr>
-        <w:t>i</w:t>
-      </w:r>
-      <w:proofErr w:type="spellEnd"/>
-      <w:r>
-        <w:rPr>
-          <w:rFonts w:ascii="Arial" w:eastAsia="Courier New" w:hAnsi="Arial" w:cs="Arial"/>
-          <w:color w:val="FFFFFF"/>
-          <w:sz w:val="20"/>
-          <w:szCs w:val="20"/>
-        </w:rPr>
-        <w:t xml:space="preserve"> class="fa-solid fa-arrow-right" style="margin-le</w:t>
-      </w:r>
-      <w:r>
-        <w:rPr>
-          <w:rFonts w:ascii="Arial" w:eastAsia="Courier New" w:hAnsi="Arial" w:cs="Arial"/>
-          <w:color w:val="FFFFFF"/>
-          <w:sz w:val="20"/>
-          <w:szCs w:val="20"/>
-        </w:rPr>
-        <w:t>ft: 0.5rem;"&gt;&lt;/</w:t>
+        <w:t xml:space="preserve"> &lt;i class="fa-solid fa-arrow-right" style="margin-left: 0.5rem;"&gt;&lt;/</w:t>
       </w:r>
       <w:proofErr w:type="spellStart"/>
       <w:r>
@@ -16410,21 +14948,7 @@
         <w:rPr>
           <w:rFonts w:ascii="Arial" w:hAnsi="Arial" w:cs="Arial"/>
         </w:rPr>
-        <w:t xml:space="preserve"> – </w:t>
-      </w:r>
-      <w:proofErr w:type="spellStart"/>
-      <w:r>
-        <w:rPr>
-          <w:rFonts w:ascii="Arial" w:hAnsi="Arial" w:cs="Arial"/>
-        </w:rPr>
-        <w:t>tata</w:t>
-      </w:r>
-      <w:proofErr w:type="spellEnd"/>
-      <w:r>
-        <w:rPr>
-          <w:rFonts w:ascii="Arial" w:hAnsi="Arial" w:cs="Arial"/>
-        </w:rPr>
-        <w:t xml:space="preserve"> </w:t>
+        <w:t xml:space="preserve"> – tata </w:t>
       </w:r>
       <w:proofErr w:type="spellStart"/>
       <w:r>
@@ -16686,7 +15210,7 @@
 </file>
 
 <file path=word/numbering.xml><?xml version="1.0" encoding="utf-8"?>
-<w:numbering xmlns:wpc="http://schemas.microsoft.com/office/word/2010/wordprocessingCanvas" xmlns:cx="http://schemas.microsoft.com/office/drawing/2014/chartex" xmlns:cx1="http://schemas.microsoft.com/office/drawing/2015/9/8/chartex" xmlns:cx2="http://schemas.microsoft.com/office/drawing/2015/10/21/chartex" xmlns:cx3="http://schemas.microsoft.com/office/drawing/2016/5/9/chartex" xmlns:cx4="http://schemas.microsoft.com/office/drawing/2016/5/10/chartex" xmlns:cx5="http://schemas.microsoft.com/office/drawing/2016/5/11/chartex" xmlns:cx6="http://schemas.microsoft.com/office/drawing/2016/5/12/chartex" xmlns:cx7="http://schemas.microsoft.com/office/drawing/2016/5/13/chartex" xmlns:cx8="http://schemas.microsoft.com/office/drawing/2016/5/14/chartex" xmlns:mc="http://schemas.openxmlformats.org/markup-compatibility/2006" xmlns:aink="http://schemas.microsoft.com/office/drawing/2016/ink" xmlns:am3d="http://schemas.microsoft.com/office/drawing/2017/model3d" xmlns:o="urn:schemas-microsoft-com:office:office" xmlns:r="http://schemas.openxmlformats.org/officeDocument/2006/relationships" xmlns:m="http://schemas.openxmlformats.org/officeDocument/2006/math" xmlns:v="urn:schemas-microsoft-com:vml" xmlns:wp14="http://schemas.microsoft.com/office/word/2010/wordprocessingDrawing" xmlns:wp="http://schemas.openxmlformats.org/drawingml/2006/wordprocessingDrawing" xmlns:w10="urn:schemas-microsoft-com:office:word" xmlns:w="http://schemas.openxmlformats.org/wordprocessingml/2006/main" xmlns:w14="http://schemas.microsoft.com/office/word/2010/wordml" xmlns:w15="http://schemas.microsoft.com/office/word/2012/wordml" xmlns:w16cex="http://schemas.microsoft.com/office/word/2018/wordml/cex" xmlns:w16cid="http://schemas.microsoft.com/office/word/2016/wordml/cid" xmlns:w16="http://schemas.microsoft.com/office/word/2018/wordml" xmlns:w16se="http://schemas.microsoft.com/office/word/2015/wordml/symex" xmlns:wpg="http://schemas.microsoft.com/office/word/2010/wordprocessingGroup" xmlns:wpi="http://schemas.microsoft.com/office/word/2010/wordprocessingInk" xmlns:wne="http://schemas.microsoft.com/office/word/2006/wordml" xmlns:wps="http://schemas.microsoft.com/office/word/2010/wordprocessingShape" mc:Ignorable="w14 w15 w16se w16cid w16 w16cex wp14">
+<w:numbering xmlns:wpc="http://schemas.microsoft.com/office/word/2010/wordprocessingCanvas" xmlns:cx="http://schemas.microsoft.com/office/drawing/2014/chartex" xmlns:cx1="http://schemas.microsoft.com/office/drawing/2015/9/8/chartex" xmlns:cx2="http://schemas.microsoft.com/office/drawing/2015/10/21/chartex" xmlns:cx3="http://schemas.microsoft.com/office/drawing/2016/5/9/chartex" xmlns:cx4="http://schemas.microsoft.com/office/drawing/2016/5/10/chartex" xmlns:cx5="http://schemas.microsoft.com/office/drawing/2016/5/11/chartex" xmlns:cx6="http://schemas.microsoft.com/office/drawing/2016/5/12/chartex" xmlns:cx7="http://schemas.microsoft.com/office/drawing/2016/5/13/chartex" xmlns:cx8="http://schemas.microsoft.com/office/drawing/2016/5/14/chartex" xmlns:mc="http://schemas.openxmlformats.org/markup-compatibility/2006" xmlns:aink="http://schemas.microsoft.com/office/drawing/2016/ink" xmlns:am3d="http://schemas.microsoft.com/office/drawing/2017/model3d" xmlns:o="urn:schemas-microsoft-com:office:office" xmlns:oel="http://schemas.microsoft.com/office/2019/extlst" xmlns:r="http://schemas.openxmlformats.org/officeDocument/2006/relationships" xmlns:m="http://schemas.openxmlformats.org/officeDocument/2006/math" xmlns:v="urn:schemas-microsoft-com:vml" xmlns:wp14="http://schemas.microsoft.com/office/word/2010/wordprocessingDrawing" xmlns:wp="http://schemas.openxmlformats.org/drawingml/2006/wordprocessingDrawing" xmlns:w10="urn:schemas-microsoft-com:office:word" xmlns:w="http://schemas.openxmlformats.org/wordprocessingml/2006/main" xmlns:w14="http://schemas.microsoft.com/office/word/2010/wordml" xmlns:w15="http://schemas.microsoft.com/office/word/2012/wordml" xmlns:w16cex="http://schemas.microsoft.com/office/word/2018/wordml/cex" xmlns:w16cid="http://schemas.microsoft.com/office/word/2016/wordml/cid" xmlns:w16="http://schemas.microsoft.com/office/word/2018/wordml" xmlns:w16du="http://schemas.microsoft.com/office/word/2023/wordml/word16du" xmlns:w16sdtdh="http://schemas.microsoft.com/office/word/2020/wordml/sdtdatahash" xmlns:w16sdtfl="http://schemas.microsoft.com/office/word/2024/wordml/sdtformatlock" xmlns:w16se="http://schemas.microsoft.com/office/word/2015/wordml/symex" xmlns:wpg="http://schemas.microsoft.com/office/word/2010/wordprocessingGroup" xmlns:wpi="http://schemas.microsoft.com/office/word/2010/wordprocessingInk" xmlns:wne="http://schemas.microsoft.com/office/word/2006/wordml" xmlns:wps="http://schemas.microsoft.com/office/word/2010/wordprocessingShape" mc:Ignorable="w14 w15 w16se w16cid w16 w16cex w16sdtdh w16sdtfl w16du wp14">
   <w:abstractNum w:abstractNumId="0" w15:restartNumberingAfterBreak="0">
     <w:nsid w:val="10C04B06"/>
     <w:multiLevelType w:val="hybridMultilevel"/>
@@ -16868,13 +15392,13 @@
       </w:pPr>
     </w:lvl>
   </w:abstractNum>
-  <w:num w:numId="1">
+  <w:num w:numId="1" w16cid:durableId="629943467">
     <w:abstractNumId w:val="0"/>
     <w:lvlOverride w:ilvl="0">
       <w:startOverride w:val="1"/>
     </w:lvlOverride>
   </w:num>
-  <w:num w:numId="2">
+  <w:num w:numId="2" w16cid:durableId="807665812">
     <w:abstractNumId w:val="1"/>
     <w:lvlOverride w:ilvl="0">
       <w:startOverride w:val="1"/>
@@ -16884,7 +15408,7 @@
 </file>
 
 <file path=word/styles.xml><?xml version="1.0" encoding="utf-8"?>
-<w:styles xmlns:mc="http://schemas.openxmlformats.org/markup-compatibility/2006" xmlns:r="http://schemas.openxmlformats.org/officeDocument/2006/relationships" xmlns:w="http://schemas.openxmlformats.org/wordprocessingml/2006/main" xmlns:w14="http://schemas.microsoft.com/office/word/2010/wordml" xmlns:w15="http://schemas.microsoft.com/office/word/2012/wordml" xmlns:w16cex="http://schemas.microsoft.com/office/word/2018/wordml/cex" xmlns:w16cid="http://schemas.microsoft.com/office/word/2016/wordml/cid" xmlns:w16="http://schemas.microsoft.com/office/word/2018/wordml" xmlns:w16se="http://schemas.microsoft.com/office/word/2015/wordml/symex" mc:Ignorable="w14 w15 w16se w16cid w16 w16cex">
+<w:styles xmlns:mc="http://schemas.openxmlformats.org/markup-compatibility/2006" xmlns:r="http://schemas.openxmlformats.org/officeDocument/2006/relationships" xmlns:w="http://schemas.openxmlformats.org/wordprocessingml/2006/main" xmlns:w14="http://schemas.microsoft.com/office/word/2010/wordml" xmlns:w15="http://schemas.microsoft.com/office/word/2012/wordml" xmlns:w16cex="http://schemas.microsoft.com/office/word/2018/wordml/cex" xmlns:w16cid="http://schemas.microsoft.com/office/word/2016/wordml/cid" xmlns:w16="http://schemas.microsoft.com/office/word/2018/wordml" xmlns:w16du="http://schemas.microsoft.com/office/word/2023/wordml/word16du" xmlns:w16sdtdh="http://schemas.microsoft.com/office/word/2020/wordml/sdtdatahash" xmlns:w16sdtfl="http://schemas.microsoft.com/office/word/2024/wordml/sdtformatlock" xmlns:w16se="http://schemas.microsoft.com/office/word/2015/wordml/symex" mc:Ignorable="w14 w15 w16se w16cid w16 w16cex w16sdtdh w16sdtfl w16du">
   <w:docDefaults>
     <w:rPrDefault>
       <w:rPr>

</xml_diff>